<commit_message>
Fuentes de documentos actualizadas
</commit_message>
<xml_diff>
--- a/Modelos_documentos/conformidad_contrato.docx
+++ b/Modelos_documentos/conformidad_contrato.docx
@@ -190,7 +190,7 @@
           <w:sz w:val="24"/>
           <w:szCs w:val="24"/>
         </w:rPr>
-        <w:t>18 de julio de 2025</w:t>
+        <w:t>19 de agosto de 2025</w:t>
       </w:r>
       <w:r>
         <w:rPr>
@@ -217,207 +217,195 @@
     <w:p>
       <w:pPr>
         <w:pStyle w:val="Textoindependiente"/>
-        <w:spacing w:line="360" w:lineRule="auto"/>
-        <w:ind w:firstLine="708"/>
-        <w:jc w:val="both"/>
-        <w:rPr>
-          <w:rFonts w:ascii="Garamond" w:hAnsi="Garamond" w:cs="Arial"/>
-          <w:spacing w:val="1"/>
-          <w:sz w:val="24"/>
-          <w:szCs w:val="24"/>
-        </w:rPr>
-      </w:pPr>
-      <w:r>
-        <w:rPr>
-          <w:rFonts w:ascii="Garamond" w:hAnsi="Garamond" w:cs="Arial"/>
-          <w:spacing w:val="1"/>
-          <w:sz w:val="24"/>
-          <w:szCs w:val="24"/>
-        </w:rPr>
-        <w:t xml:space="preserve">Por medio de la presente se deja constancia </w:t>
-      </w:r>
-      <w:r>
-        <w:rPr>
-          <w:rFonts w:ascii="Garamond" w:hAnsi="Garamond" w:cs="Arial"/>
-          <w:spacing w:val="1"/>
-          <w:sz w:val="24"/>
-          <w:szCs w:val="24"/>
-        </w:rPr>
-        <w:t xml:space="preserve">de </w:t>
-      </w:r>
-      <w:r>
-        <w:rPr>
-          <w:rFonts w:ascii="Garamond" w:hAnsi="Garamond" w:cs="Arial"/>
-          <w:spacing w:val="1"/>
-          <w:sz w:val="24"/>
-          <w:szCs w:val="24"/>
-        </w:rPr>
-        <w:t xml:space="preserve">que </w:t>
-      </w:r>
-      <w:r>
-        <w:rPr>
-          <w:rFonts w:ascii="Garamond" w:hAnsi="Garamond" w:cs="Arial"/>
-          <w:spacing w:val="1"/>
-          <w:sz w:val="24"/>
-          <w:szCs w:val="24"/>
-        </w:rPr>
-        <w:t>nombre</w:t>
-      </w:r>
-      <w:r>
-        <w:rPr>
-          <w:rFonts w:ascii="Garamond" w:hAnsi="Garamond" w:cs="Arial"/>
-          <w:spacing w:val="1"/>
-          <w:sz w:val="24"/>
-          <w:szCs w:val="24"/>
-        </w:rPr>
-        <w:t xml:space="preserve">, con RUC N.º </w:t>
-      </w:r>
-      <w:r>
-        <w:rPr>
-          <w:rFonts w:ascii="Garamond" w:hAnsi="Garamond" w:cs="Arial"/>
-          <w:spacing w:val="1"/>
-          <w:sz w:val="24"/>
-          <w:szCs w:val="24"/>
-        </w:rPr>
-        <w:t>ruc</w:t>
-      </w:r>
-      <w:r>
-        <w:rPr>
-          <w:rFonts w:ascii="Garamond" w:hAnsi="Garamond" w:cs="Arial"/>
-          <w:spacing w:val="1"/>
-          <w:sz w:val="24"/>
-          <w:szCs w:val="24"/>
-        </w:rPr>
-        <w:t xml:space="preserve">, ha realizado satisfactoriamente el </w:t>
-      </w:r>
-      <w:proofErr w:type="spellStart"/>
-      <w:r>
-        <w:rPr>
-          <w:rFonts w:ascii="Garamond" w:hAnsi="Garamond" w:cs="Arial"/>
-          <w:spacing w:val="1"/>
-          <w:sz w:val="24"/>
-          <w:szCs w:val="24"/>
-        </w:rPr>
-        <w:t>descripcion_cursos</w:t>
-      </w:r>
-      <w:proofErr w:type="spellEnd"/>
-      <w:r>
-        <w:rPr>
-          <w:rFonts w:ascii="Garamond" w:hAnsi="Garamond" w:cs="Arial"/>
-          <w:spacing w:val="1"/>
-          <w:sz w:val="24"/>
-          <w:szCs w:val="24"/>
-        </w:rPr>
-        <w:t xml:space="preserve"> en el Centro de Idiomas de la FLCH, bajo la modalidad híbrida, según orden de servicio N.º ________, y en cumplimiento de la </w:t>
-      </w:r>
-      <w:r>
-        <w:rPr>
-          <w:rFonts w:ascii="Garamond" w:hAnsi="Garamond" w:cs="Arial"/>
-          <w:spacing w:val="1"/>
-          <w:sz w:val="24"/>
-          <w:szCs w:val="24"/>
-        </w:rPr>
-        <w:t>numero_armada</w:t>
-      </w:r>
-      <w:r>
-        <w:rPr>
-          <w:rFonts w:ascii="Garamond" w:hAnsi="Garamond" w:cs="Arial"/>
-          <w:spacing w:val="1"/>
-          <w:sz w:val="24"/>
-          <w:szCs w:val="24"/>
-        </w:rPr>
-        <w:t xml:space="preserve"> armada del contrato de locación de servicios </w:t>
-      </w:r>
-      <w:r>
-        <w:rPr>
-          <w:rFonts w:ascii="Garamond" w:hAnsi="Garamond" w:cs="Arial"/>
-          <w:spacing w:val="1"/>
-          <w:sz w:val="24"/>
-          <w:szCs w:val="24"/>
-        </w:rPr>
-        <w:t>N.º</w:t>
-      </w:r>
-      <w:r>
-        <w:rPr>
-          <w:rFonts w:ascii="Garamond" w:hAnsi="Garamond" w:cs="Arial"/>
-          <w:spacing w:val="1"/>
-          <w:sz w:val="24"/>
-          <w:szCs w:val="24"/>
-        </w:rPr>
-        <w:t xml:space="preserve"> </w:t>
-      </w:r>
-      <w:proofErr w:type="spellStart"/>
-      <w:r>
-        <w:rPr>
-          <w:rFonts w:ascii="Garamond" w:hAnsi="Garamond" w:cs="Arial"/>
-          <w:spacing w:val="1"/>
-          <w:sz w:val="24"/>
-          <w:szCs w:val="24"/>
-        </w:rPr>
-        <w:t>Nro_Contrato</w:t>
-      </w:r>
-      <w:proofErr w:type="spellEnd"/>
-      <w:r>
-        <w:rPr>
-          <w:rFonts w:ascii="Garamond" w:hAnsi="Garamond" w:cs="Arial"/>
-          <w:spacing w:val="1"/>
-          <w:sz w:val="24"/>
-          <w:szCs w:val="24"/>
-        </w:rPr>
-        <w:t xml:space="preserve">/UNMSM -FLCH/2025 por el importe de </w:t>
-      </w:r>
-      <w:proofErr w:type="spellStart"/>
-      <w:r>
-        <w:rPr>
-          <w:rFonts w:ascii="Garamond" w:hAnsi="Garamond" w:cs="Arial"/>
-          <w:spacing w:val="1"/>
-          <w:sz w:val="24"/>
-          <w:szCs w:val="24"/>
-        </w:rPr>
-        <w:t>monto_subtotal</w:t>
-      </w:r>
-      <w:proofErr w:type="spellEnd"/>
-      <w:r>
-        <w:rPr>
-          <w:rFonts w:ascii="Garamond" w:hAnsi="Garamond" w:cs="Arial"/>
-          <w:spacing w:val="1"/>
-          <w:sz w:val="24"/>
-          <w:szCs w:val="24"/>
-        </w:rPr>
-        <w:t xml:space="preserve">, monto por hora: </w:t>
-      </w:r>
-      <w:proofErr w:type="spellStart"/>
-      <w:r>
-        <w:rPr>
-          <w:rFonts w:ascii="Garamond" w:hAnsi="Garamond" w:cs="Arial"/>
-          <w:spacing w:val="1"/>
-          <w:sz w:val="24"/>
-          <w:szCs w:val="24"/>
-        </w:rPr>
-        <w:t>monto_hora</w:t>
-      </w:r>
-      <w:proofErr w:type="spellEnd"/>
-      <w:r>
-        <w:rPr>
-          <w:rFonts w:ascii="Garamond" w:hAnsi="Garamond" w:cs="Arial"/>
-          <w:spacing w:val="1"/>
-          <w:sz w:val="24"/>
-          <w:szCs w:val="24"/>
-        </w:rPr>
-        <w:t>.</w:t>
-      </w:r>
-    </w:p>
-    <w:p>
-      <w:pPr>
         <w:spacing w:after="240" w:line="276" w:lineRule="auto"/>
         <w:ind w:firstLine="708"/>
         <w:jc w:val="both"/>
         <w:rPr>
           <w:rFonts w:ascii="Garamond" w:hAnsi="Garamond" w:cs="Arial"/>
-          <w:sz w:val="24"/>
-          <w:szCs w:val="24"/>
-        </w:rPr>
-      </w:pPr>
+          <w:spacing w:val="1"/>
+          <w:sz w:val="24"/>
+          <w:szCs w:val="24"/>
+        </w:rPr>
+      </w:pPr>
+      <w:r>
+        <w:rPr>
+          <w:rFonts w:ascii="Garamond" w:hAnsi="Garamond" w:cs="Arial"/>
+          <w:spacing w:val="1"/>
+          <w:sz w:val="24"/>
+          <w:szCs w:val="24"/>
+        </w:rPr>
+        <w:t xml:space="preserve">Por medio de la presente se deja constancia </w:t>
+      </w:r>
+      <w:r>
+        <w:rPr>
+          <w:rFonts w:ascii="Garamond" w:hAnsi="Garamond" w:cs="Arial"/>
+          <w:spacing w:val="1"/>
+          <w:sz w:val="24"/>
+          <w:szCs w:val="24"/>
+        </w:rPr>
+        <w:t xml:space="preserve">de </w:t>
+      </w:r>
+      <w:r>
+        <w:rPr>
+          <w:rFonts w:ascii="Garamond" w:hAnsi="Garamond" w:cs="Arial"/>
+          <w:spacing w:val="1"/>
+          <w:sz w:val="24"/>
+          <w:szCs w:val="24"/>
+        </w:rPr>
+        <w:t xml:space="preserve">que </w:t>
+      </w:r>
+      <w:r>
+        <w:rPr>
+          <w:rFonts w:ascii="Garamond" w:hAnsi="Garamond" w:cs="Arial"/>
+          <w:spacing w:val="1"/>
+          <w:sz w:val="24"/>
+          <w:szCs w:val="24"/>
+        </w:rPr>
+        <w:t>nombre</w:t>
+      </w:r>
+      <w:r>
+        <w:rPr>
+          <w:rFonts w:ascii="Garamond" w:hAnsi="Garamond" w:cs="Arial"/>
+          <w:spacing w:val="1"/>
+          <w:sz w:val="24"/>
+          <w:szCs w:val="24"/>
+        </w:rPr>
+        <w:t xml:space="preserve">, con RUC N.º </w:t>
+      </w:r>
+      <w:r>
+        <w:rPr>
+          <w:rFonts w:ascii="Garamond" w:hAnsi="Garamond" w:cs="Arial"/>
+          <w:spacing w:val="1"/>
+          <w:sz w:val="24"/>
+          <w:szCs w:val="24"/>
+        </w:rPr>
+        <w:t>ruc</w:t>
+      </w:r>
+      <w:r>
+        <w:rPr>
+          <w:rFonts w:ascii="Garamond" w:hAnsi="Garamond" w:cs="Arial"/>
+          <w:spacing w:val="1"/>
+          <w:sz w:val="24"/>
+          <w:szCs w:val="24"/>
+        </w:rPr>
+        <w:t xml:space="preserve">, ha realizado satisfactoriamente el </w:t>
+      </w:r>
+      <w:proofErr w:type="spellStart"/>
+      <w:r>
+        <w:rPr>
+          <w:rFonts w:ascii="Garamond" w:hAnsi="Garamond" w:cs="Arial"/>
+          <w:spacing w:val="1"/>
+          <w:sz w:val="24"/>
+          <w:szCs w:val="24"/>
+        </w:rPr>
+        <w:t>descripcion_cursos</w:t>
+      </w:r>
+      <w:proofErr w:type="spellEnd"/>
+      <w:r>
+        <w:rPr>
+          <w:rFonts w:ascii="Garamond" w:hAnsi="Garamond" w:cs="Arial"/>
+          <w:spacing w:val="1"/>
+          <w:sz w:val="24"/>
+          <w:szCs w:val="24"/>
+        </w:rPr>
+        <w:t xml:space="preserve"> en el Centro de Idiomas de la FLCH, bajo la modalidad híbrida, según orden de servicio N.º ________, y en cumplimiento de la </w:t>
+      </w:r>
+      <w:r>
+        <w:rPr>
+          <w:rFonts w:ascii="Garamond" w:hAnsi="Garamond" w:cs="Arial"/>
+          <w:spacing w:val="1"/>
+          <w:sz w:val="24"/>
+          <w:szCs w:val="24"/>
+        </w:rPr>
+        <w:t>numero_armada</w:t>
+      </w:r>
+      <w:r>
+        <w:rPr>
+          <w:rFonts w:ascii="Garamond" w:hAnsi="Garamond" w:cs="Arial"/>
+          <w:spacing w:val="1"/>
+          <w:sz w:val="24"/>
+          <w:szCs w:val="24"/>
+        </w:rPr>
+        <w:t xml:space="preserve"> armada del contrato de locación de servicios </w:t>
+      </w:r>
+      <w:r>
+        <w:rPr>
+          <w:rFonts w:ascii="Garamond" w:hAnsi="Garamond" w:cs="Arial"/>
+          <w:spacing w:val="1"/>
+          <w:sz w:val="24"/>
+          <w:szCs w:val="24"/>
+        </w:rPr>
+        <w:t>N.º</w:t>
+      </w:r>
+      <w:r>
+        <w:rPr>
+          <w:rFonts w:ascii="Garamond" w:hAnsi="Garamond" w:cs="Arial"/>
+          <w:spacing w:val="1"/>
+          <w:sz w:val="24"/>
+          <w:szCs w:val="24"/>
+        </w:rPr>
+        <w:t xml:space="preserve"> </w:t>
+      </w:r>
+      <w:proofErr w:type="spellStart"/>
+      <w:r>
+        <w:rPr>
+          <w:rFonts w:ascii="Garamond" w:hAnsi="Garamond" w:cs="Arial"/>
+          <w:spacing w:val="1"/>
+          <w:sz w:val="24"/>
+          <w:szCs w:val="24"/>
+        </w:rPr>
+        <w:t>Nro_Contrato</w:t>
+      </w:r>
+      <w:proofErr w:type="spellEnd"/>
+      <w:r>
+        <w:rPr>
+          <w:rFonts w:ascii="Garamond" w:hAnsi="Garamond" w:cs="Arial"/>
+          <w:spacing w:val="1"/>
+          <w:sz w:val="24"/>
+          <w:szCs w:val="24"/>
+        </w:rPr>
+        <w:t xml:space="preserve">/UNMSM -FLCH/2025 por el importe de </w:t>
+      </w:r>
+      <w:proofErr w:type="spellStart"/>
+      <w:r>
+        <w:rPr>
+          <w:rFonts w:ascii="Garamond" w:hAnsi="Garamond" w:cs="Arial"/>
+          <w:spacing w:val="1"/>
+          <w:sz w:val="24"/>
+          <w:szCs w:val="24"/>
+        </w:rPr>
+        <w:t>monto_subtotal</w:t>
+      </w:r>
+      <w:proofErr w:type="spellEnd"/>
+      <w:r>
+        <w:rPr>
+          <w:rFonts w:ascii="Garamond" w:hAnsi="Garamond" w:cs="Arial"/>
+          <w:spacing w:val="1"/>
+          <w:sz w:val="24"/>
+          <w:szCs w:val="24"/>
+        </w:rPr>
+        <w:t xml:space="preserve">, monto por hora: </w:t>
+      </w:r>
+      <w:proofErr w:type="spellStart"/>
+      <w:r>
+        <w:rPr>
+          <w:rFonts w:ascii="Garamond" w:hAnsi="Garamond" w:cs="Arial"/>
+          <w:spacing w:val="1"/>
+          <w:sz w:val="24"/>
+          <w:szCs w:val="24"/>
+        </w:rPr>
+        <w:t>monto_hora</w:t>
+      </w:r>
+      <w:proofErr w:type="spellEnd"/>
+      <w:r>
+        <w:rPr>
+          <w:rFonts w:ascii="Garamond" w:hAnsi="Garamond" w:cs="Arial"/>
+          <w:spacing w:val="1"/>
+          <w:sz w:val="24"/>
+          <w:szCs w:val="24"/>
+        </w:rPr>
+        <w:t>.</w:t>
+      </w:r>
     </w:p>
     <w:p>
       <w:pPr>
@@ -545,13 +533,17 @@
         <w:jc w:val="center"/>
         <w:rPr>
           <w:rFonts w:ascii="Garamond" w:hAnsi="Garamond" w:cs="Arial"/>
-          <w:sz w:val="24"/>
-          <w:szCs w:val="24"/>
-        </w:rPr>
-      </w:pPr>
-      <w:r>
-        <w:rPr>
-          <w:rFonts w:ascii="Garamond" w:hAnsi="Garamond" w:cs="Arial"/>
+          <w:b/>
+          <w:bCs/>
+          <w:sz w:val="24"/>
+          <w:szCs w:val="24"/>
+        </w:rPr>
+      </w:pPr>
+      <w:r>
+        <w:rPr>
+          <w:rFonts w:ascii="Garamond" w:hAnsi="Garamond" w:cs="Arial"/>
+          <w:b/>
+          <w:bCs/>
           <w:sz w:val="24"/>
           <w:szCs w:val="24"/>
         </w:rPr>
@@ -564,15 +556,15 @@
         <w:jc w:val="center"/>
         <w:rPr>
           <w:rFonts w:ascii="Garamond" w:hAnsi="Garamond" w:cs="Arial"/>
-          <w:b/>
-          <w:sz w:val="24"/>
-          <w:szCs w:val="24"/>
-        </w:rPr>
-      </w:pPr>
-      <w:r>
-        <w:rPr>
-          <w:rFonts w:ascii="Garamond" w:hAnsi="Garamond" w:cs="Arial"/>
-          <w:b/>
+          <w:bCs/>
+          <w:sz w:val="24"/>
+          <w:szCs w:val="24"/>
+        </w:rPr>
+      </w:pPr>
+      <w:r>
+        <w:rPr>
+          <w:rFonts w:ascii="Garamond" w:hAnsi="Garamond" w:cs="Arial"/>
+          <w:bCs/>
           <w:sz w:val="24"/>
           <w:szCs w:val="24"/>
         </w:rPr>
@@ -581,7 +573,7 @@
       <w:r>
         <w:rPr>
           <w:rFonts w:ascii="Garamond" w:hAnsi="Garamond" w:cs="Arial"/>
-          <w:b/>
+          <w:bCs/>
           <w:sz w:val="24"/>
           <w:szCs w:val="24"/>
         </w:rPr>
@@ -590,7 +582,7 @@
       <w:r>
         <w:rPr>
           <w:rFonts w:ascii="Garamond" w:hAnsi="Garamond" w:cs="Arial"/>
-          <w:b/>
+          <w:bCs/>
           <w:sz w:val="24"/>
           <w:szCs w:val="24"/>
         </w:rPr>
@@ -603,14 +595,15 @@
         <w:jc w:val="center"/>
         <w:rPr>
           <w:rFonts w:ascii="Garamond" w:hAnsi="Garamond" w:cs="Arial"/>
-          <w:sz w:val="24"/>
-          <w:szCs w:val="24"/>
-        </w:rPr>
-      </w:pPr>
-      <w:r>
-        <w:rPr>
-          <w:rFonts w:ascii="Garamond" w:hAnsi="Garamond" w:cs="Arial"/>
-          <w:b/>
+          <w:bCs/>
+          <w:sz w:val="24"/>
+          <w:szCs w:val="24"/>
+        </w:rPr>
+      </w:pPr>
+      <w:r>
+        <w:rPr>
+          <w:rFonts w:ascii="Garamond" w:hAnsi="Garamond" w:cs="Arial"/>
+          <w:bCs/>
           <w:sz w:val="24"/>
           <w:szCs w:val="24"/>
         </w:rPr>

</xml_diff>

<commit_message>
Creación de fase final para administrativos
</commit_message>
<xml_diff>
--- a/Modelos_documentos/conformidad_contrato.docx
+++ b/Modelos_documentos/conformidad_contrato.docx
@@ -1,6 +1,6 @@
 
 <file path=word/document.xml><?xml version="1.0" encoding="utf-8"?>
-<w:document xmlns:wpc="http://schemas.microsoft.com/office/word/2010/wordprocessingCanvas" xmlns:cx="http://schemas.microsoft.com/office/drawing/2014/chartex" xmlns:cx1="http://schemas.microsoft.com/office/drawing/2015/9/8/chartex" xmlns:cx2="http://schemas.microsoft.com/office/drawing/2015/10/21/chartex" xmlns:cx3="http://schemas.microsoft.com/office/drawing/2016/5/9/chartex" xmlns:cx4="http://schemas.microsoft.com/office/drawing/2016/5/10/chartex" xmlns:cx5="http://schemas.microsoft.com/office/drawing/2016/5/11/chartex" xmlns:cx6="http://schemas.microsoft.com/office/drawing/2016/5/12/chartex" xmlns:cx7="http://schemas.microsoft.com/office/drawing/2016/5/13/chartex" xmlns:cx8="http://schemas.microsoft.com/office/drawing/2016/5/14/chartex" xmlns:mc="http://schemas.openxmlformats.org/markup-compatibility/2006" xmlns:aink="http://schemas.microsoft.com/office/drawing/2016/ink" xmlns:am3d="http://schemas.microsoft.com/office/drawing/2017/model3d" xmlns:o="urn:schemas-microsoft-com:office:office" xmlns:oel="http://schemas.microsoft.com/office/2019/extlst" xmlns:r="http://schemas.openxmlformats.org/officeDocument/2006/relationships" xmlns:m="http://schemas.openxmlformats.org/officeDocument/2006/math" xmlns:v="urn:schemas-microsoft-com:vml" xmlns:wp14="http://schemas.microsoft.com/office/word/2010/wordprocessingDrawing" xmlns:wp="http://schemas.openxmlformats.org/drawingml/2006/wordprocessingDrawing" xmlns:w10="urn:schemas-microsoft-com:office:word" xmlns:w="http://schemas.openxmlformats.org/wordprocessingml/2006/main" xmlns:w14="http://schemas.microsoft.com/office/word/2010/wordml" xmlns:w15="http://schemas.microsoft.com/office/word/2012/wordml" xmlns:w16cex="http://schemas.microsoft.com/office/word/2018/wordml/cex" xmlns:w16cid="http://schemas.microsoft.com/office/word/2016/wordml/cid" xmlns:w16="http://schemas.microsoft.com/office/word/2018/wordml" xmlns:w16du="http://schemas.microsoft.com/office/word/2023/wordml/word16du" xmlns:w16sdtdh="http://schemas.microsoft.com/office/word/2020/wordml/sdtdatahash" xmlns:w16sdtfl="http://schemas.microsoft.com/office/word/2024/wordml/sdtformatlock" xmlns:w16se="http://schemas.microsoft.com/office/word/2015/wordml/symex" xmlns:wpg="http://schemas.microsoft.com/office/word/2010/wordprocessingGroup" xmlns:wpi="http://schemas.microsoft.com/office/word/2010/wordprocessingInk" xmlns:wne="http://schemas.microsoft.com/office/word/2006/wordml" xmlns:wps="http://schemas.microsoft.com/office/word/2010/wordprocessingShape" mc:Ignorable="w14 w15 w16se w16cid w16 w16cex w16sdtdh w16sdtfl w16du wp14">
+<w:document xmlns:wpc="http://schemas.microsoft.com/office/word/2010/wordprocessingCanvas" xmlns:cx="http://schemas.microsoft.com/office/drawing/2014/chartex" xmlns:mc="http://schemas.openxmlformats.org/markup-compatibility/2006" xmlns:o="urn:schemas-microsoft-com:office:office" xmlns:r="http://schemas.openxmlformats.org/officeDocument/2006/relationships" xmlns:m="http://schemas.openxmlformats.org/officeDocument/2006/math" xmlns:v="urn:schemas-microsoft-com:vml" xmlns:wp14="http://schemas.microsoft.com/office/word/2010/wordprocessingDrawing" xmlns:wp="http://schemas.openxmlformats.org/drawingml/2006/wordprocessingDrawing" xmlns:w10="urn:schemas-microsoft-com:office:word" xmlns:w="http://schemas.openxmlformats.org/wordprocessingml/2006/main" xmlns:w14="http://schemas.microsoft.com/office/word/2010/wordml" xmlns:w15="http://schemas.microsoft.com/office/word/2012/wordml" xmlns:w16se="http://schemas.microsoft.com/office/word/2015/wordml/symex" xmlns:wpg="http://schemas.microsoft.com/office/word/2010/wordprocessingGroup" xmlns:wpi="http://schemas.microsoft.com/office/word/2010/wordprocessingInk" xmlns:wne="http://schemas.microsoft.com/office/word/2006/wordml" xmlns:wps="http://schemas.microsoft.com/office/word/2010/wordprocessingShape" mc:Ignorable="w14 w15 w16se wp14">
   <w:body>
     <w:p>
       <w:pPr>
@@ -190,7 +190,7 @@
           <w:sz w:val="24"/>
           <w:szCs w:val="24"/>
         </w:rPr>
-        <w:t>19 de agosto de 2025</w:t>
+        <w:t>25 de agosto de 2025</w:t>
       </w:r>
       <w:r>
         <w:rPr>
@@ -229,178 +229,61 @@
       </w:pPr>
       <w:r>
         <w:rPr>
-          <w:rFonts w:ascii="Garamond" w:hAnsi="Garamond" w:cs="Arial"/>
-          <w:spacing w:val="1"/>
-          <w:sz w:val="24"/>
-          <w:szCs w:val="24"/>
-        </w:rPr>
-        <w:t xml:space="preserve">Por medio de la presente se deja constancia </w:t>
-      </w:r>
-      <w:r>
-        <w:rPr>
-          <w:rFonts w:ascii="Garamond" w:hAnsi="Garamond" w:cs="Arial"/>
-          <w:spacing w:val="1"/>
-          <w:sz w:val="24"/>
-          <w:szCs w:val="24"/>
-        </w:rPr>
-        <w:t xml:space="preserve">de </w:t>
-      </w:r>
-      <w:r>
-        <w:rPr>
-          <w:rFonts w:ascii="Garamond" w:hAnsi="Garamond" w:cs="Arial"/>
-          <w:spacing w:val="1"/>
-          <w:sz w:val="24"/>
-          <w:szCs w:val="24"/>
-        </w:rPr>
-        <w:t xml:space="preserve">que </w:t>
-      </w:r>
-      <w:r>
-        <w:rPr>
-          <w:rFonts w:ascii="Garamond" w:hAnsi="Garamond" w:cs="Arial"/>
-          <w:spacing w:val="1"/>
-          <w:sz w:val="24"/>
-          <w:szCs w:val="24"/>
-        </w:rPr>
-        <w:t>nombre</w:t>
-      </w:r>
-      <w:r>
-        <w:rPr>
-          <w:rFonts w:ascii="Garamond" w:hAnsi="Garamond" w:cs="Arial"/>
-          <w:spacing w:val="1"/>
-          <w:sz w:val="24"/>
-          <w:szCs w:val="24"/>
-        </w:rPr>
-        <w:t xml:space="preserve">, con RUC N.º </w:t>
-      </w:r>
-      <w:r>
-        <w:rPr>
-          <w:rFonts w:ascii="Garamond" w:hAnsi="Garamond" w:cs="Arial"/>
-          <w:spacing w:val="1"/>
-          <w:sz w:val="24"/>
-          <w:szCs w:val="24"/>
-        </w:rPr>
-        <w:t>ruc</w:t>
-      </w:r>
-      <w:r>
-        <w:rPr>
-          <w:rFonts w:ascii="Garamond" w:hAnsi="Garamond" w:cs="Arial"/>
-          <w:spacing w:val="1"/>
-          <w:sz w:val="24"/>
-          <w:szCs w:val="24"/>
-        </w:rPr>
-        <w:t xml:space="preserve">, ha realizado satisfactoriamente el </w:t>
+          <w:rFonts w:ascii="Garamond" w:hAnsi="Garamond"/>
+          <w:sz w:val="24"/>
+          <w:szCs w:val="24"/>
+        </w:rPr>
+        <w:t>Por medio de la presente se deja constancia de que nombre, con RUC N.º ruc, ha realizado satisfactoriamente el descripcion_cursos en el Centro de Idiomas de la FLCH, bajo la modalidad híbrida, según orden de servicio N.º ________, y en cumplimiento de la numero_armada armada del contrato de locación de servicios N.º Nro</w:t>
+      </w:r>
+      <w:r>
+        <w:rPr>
+          <w:rFonts w:ascii="Garamond" w:hAnsi="Garamond"/>
+          <w:sz w:val="24"/>
+          <w:szCs w:val="24"/>
+        </w:rPr>
+        <w:t>_Contrato/UNMSM</w:t>
+      </w:r>
+      <w:bookmarkStart w:id="0" w:name="_GoBack"/>
+      <w:bookmarkEnd w:id="0"/>
+      <w:r>
+        <w:rPr>
+          <w:rFonts w:ascii="Garamond" w:hAnsi="Garamond"/>
+          <w:sz w:val="24"/>
+          <w:szCs w:val="24"/>
+        </w:rPr>
+        <w:t xml:space="preserve">-FLCH/2025 por el importe de </w:t>
       </w:r>
       <w:proofErr w:type="spellStart"/>
       <w:r>
         <w:rPr>
-          <w:rFonts w:ascii="Garamond" w:hAnsi="Garamond" w:cs="Arial"/>
-          <w:spacing w:val="1"/>
-          <w:sz w:val="24"/>
-          <w:szCs w:val="24"/>
-        </w:rPr>
-        <w:t>descripcion_cursos</w:t>
+          <w:rFonts w:ascii="Garamond" w:hAnsi="Garamond"/>
+          <w:sz w:val="24"/>
+          <w:szCs w:val="24"/>
+        </w:rPr>
+        <w:t>monto_subtotal</w:t>
       </w:r>
       <w:proofErr w:type="spellEnd"/>
       <w:r>
         <w:rPr>
-          <w:rFonts w:ascii="Garamond" w:hAnsi="Garamond" w:cs="Arial"/>
-          <w:spacing w:val="1"/>
-          <w:sz w:val="24"/>
-          <w:szCs w:val="24"/>
-        </w:rPr>
-        <w:t xml:space="preserve"> en el Centro de Idiomas de la FLCH, bajo la modalidad híbrida, según orden de servicio N.º ________, y en cumplimiento de la </w:t>
-      </w:r>
-      <w:r>
-        <w:rPr>
-          <w:rFonts w:ascii="Garamond" w:hAnsi="Garamond" w:cs="Arial"/>
-          <w:spacing w:val="1"/>
-          <w:sz w:val="24"/>
-          <w:szCs w:val="24"/>
-        </w:rPr>
-        <w:t>numero_armada</w:t>
-      </w:r>
-      <w:r>
-        <w:rPr>
-          <w:rFonts w:ascii="Garamond" w:hAnsi="Garamond" w:cs="Arial"/>
-          <w:spacing w:val="1"/>
-          <w:sz w:val="24"/>
-          <w:szCs w:val="24"/>
-        </w:rPr>
-        <w:t xml:space="preserve"> armada del contrato de locación de servicios </w:t>
-      </w:r>
-      <w:r>
-        <w:rPr>
-          <w:rFonts w:ascii="Garamond" w:hAnsi="Garamond" w:cs="Arial"/>
-          <w:spacing w:val="1"/>
-          <w:sz w:val="24"/>
-          <w:szCs w:val="24"/>
-        </w:rPr>
-        <w:t>N.º</w:t>
-      </w:r>
-      <w:r>
-        <w:rPr>
-          <w:rFonts w:ascii="Garamond" w:hAnsi="Garamond" w:cs="Arial"/>
-          <w:spacing w:val="1"/>
-          <w:sz w:val="24"/>
-          <w:szCs w:val="24"/>
-        </w:rPr>
-        <w:t xml:space="preserve"> </w:t>
+          <w:rFonts w:ascii="Garamond" w:hAnsi="Garamond"/>
+          <w:sz w:val="24"/>
+          <w:szCs w:val="24"/>
+        </w:rPr>
+        <w:t xml:space="preserve">, monto por hora: </w:t>
       </w:r>
       <w:proofErr w:type="spellStart"/>
       <w:r>
         <w:rPr>
-          <w:rFonts w:ascii="Garamond" w:hAnsi="Garamond" w:cs="Arial"/>
-          <w:spacing w:val="1"/>
-          <w:sz w:val="24"/>
-          <w:szCs w:val="24"/>
-        </w:rPr>
-        <w:t>Nro_Contrato</w:t>
+          <w:rFonts w:ascii="Garamond" w:hAnsi="Garamond"/>
+          <w:sz w:val="24"/>
+          <w:szCs w:val="24"/>
+        </w:rPr>
+        <w:t>monto_hora</w:t>
       </w:r>
       <w:proofErr w:type="spellEnd"/>
       <w:r>
         <w:rPr>
-          <w:rFonts w:ascii="Garamond" w:hAnsi="Garamond" w:cs="Arial"/>
-          <w:spacing w:val="1"/>
-          <w:sz w:val="24"/>
-          <w:szCs w:val="24"/>
-        </w:rPr>
-        <w:t xml:space="preserve">/UNMSM -FLCH/2025 por el importe de </w:t>
-      </w:r>
-      <w:proofErr w:type="spellStart"/>
-      <w:r>
-        <w:rPr>
-          <w:rFonts w:ascii="Garamond" w:hAnsi="Garamond" w:cs="Arial"/>
-          <w:spacing w:val="1"/>
-          <w:sz w:val="24"/>
-          <w:szCs w:val="24"/>
-        </w:rPr>
-        <w:t>monto_subtotal</w:t>
-      </w:r>
-      <w:proofErr w:type="spellEnd"/>
-      <w:r>
-        <w:rPr>
-          <w:rFonts w:ascii="Garamond" w:hAnsi="Garamond" w:cs="Arial"/>
-          <w:spacing w:val="1"/>
-          <w:sz w:val="24"/>
-          <w:szCs w:val="24"/>
-        </w:rPr>
-        <w:t xml:space="preserve">, monto por hora: </w:t>
-      </w:r>
-      <w:proofErr w:type="spellStart"/>
-      <w:r>
-        <w:rPr>
-          <w:rFonts w:ascii="Garamond" w:hAnsi="Garamond" w:cs="Arial"/>
-          <w:spacing w:val="1"/>
-          <w:sz w:val="24"/>
-          <w:szCs w:val="24"/>
-        </w:rPr>
-        <w:t>monto_hora</w:t>
-      </w:r>
-      <w:proofErr w:type="spellEnd"/>
-      <w:r>
-        <w:rPr>
-          <w:rFonts w:ascii="Garamond" w:hAnsi="Garamond" w:cs="Arial"/>
-          <w:spacing w:val="1"/>
+          <w:rFonts w:ascii="Garamond" w:hAnsi="Garamond"/>
           <w:sz w:val="24"/>
           <w:szCs w:val="24"/>
         </w:rPr>
@@ -667,7 +550,7 @@
 </file>
 
 <file path=word/endnotes.xml><?xml version="1.0" encoding="utf-8"?>
-<w:endnotes xmlns:wpc="http://schemas.microsoft.com/office/word/2010/wordprocessingCanvas" xmlns:cx="http://schemas.microsoft.com/office/drawing/2014/chartex" xmlns:cx1="http://schemas.microsoft.com/office/drawing/2015/9/8/chartex" xmlns:cx2="http://schemas.microsoft.com/office/drawing/2015/10/21/chartex" xmlns:cx3="http://schemas.microsoft.com/office/drawing/2016/5/9/chartex" xmlns:cx4="http://schemas.microsoft.com/office/drawing/2016/5/10/chartex" xmlns:cx5="http://schemas.microsoft.com/office/drawing/2016/5/11/chartex" xmlns:cx6="http://schemas.microsoft.com/office/drawing/2016/5/12/chartex" xmlns:cx7="http://schemas.microsoft.com/office/drawing/2016/5/13/chartex" xmlns:cx8="http://schemas.microsoft.com/office/drawing/2016/5/14/chartex" xmlns:mc="http://schemas.openxmlformats.org/markup-compatibility/2006" xmlns:aink="http://schemas.microsoft.com/office/drawing/2016/ink" xmlns:am3d="http://schemas.microsoft.com/office/drawing/2017/model3d" xmlns:o="urn:schemas-microsoft-com:office:office" xmlns:oel="http://schemas.microsoft.com/office/2019/extlst" xmlns:r="http://schemas.openxmlformats.org/officeDocument/2006/relationships" xmlns:m="http://schemas.openxmlformats.org/officeDocument/2006/math" xmlns:v="urn:schemas-microsoft-com:vml" xmlns:wp14="http://schemas.microsoft.com/office/word/2010/wordprocessingDrawing" xmlns:wp="http://schemas.openxmlformats.org/drawingml/2006/wordprocessingDrawing" xmlns:w10="urn:schemas-microsoft-com:office:word" xmlns:w="http://schemas.openxmlformats.org/wordprocessingml/2006/main" xmlns:w14="http://schemas.microsoft.com/office/word/2010/wordml" xmlns:w15="http://schemas.microsoft.com/office/word/2012/wordml" xmlns:w16cex="http://schemas.microsoft.com/office/word/2018/wordml/cex" xmlns:w16cid="http://schemas.microsoft.com/office/word/2016/wordml/cid" xmlns:w16="http://schemas.microsoft.com/office/word/2018/wordml" xmlns:w16du="http://schemas.microsoft.com/office/word/2023/wordml/word16du" xmlns:w16sdtdh="http://schemas.microsoft.com/office/word/2020/wordml/sdtdatahash" xmlns:w16sdtfl="http://schemas.microsoft.com/office/word/2024/wordml/sdtformatlock" xmlns:w16se="http://schemas.microsoft.com/office/word/2015/wordml/symex" xmlns:wpg="http://schemas.microsoft.com/office/word/2010/wordprocessingGroup" xmlns:wpi="http://schemas.microsoft.com/office/word/2010/wordprocessingInk" xmlns:wne="http://schemas.microsoft.com/office/word/2006/wordml" xmlns:wps="http://schemas.microsoft.com/office/word/2010/wordprocessingShape" mc:Ignorable="w14 w15 w16se w16cid w16 w16cex w16sdtdh w16sdtfl w16du wp14">
+<w:endnotes xmlns:wpc="http://schemas.microsoft.com/office/word/2010/wordprocessingCanvas" xmlns:cx="http://schemas.microsoft.com/office/drawing/2014/chartex" xmlns:mc="http://schemas.openxmlformats.org/markup-compatibility/2006" xmlns:o="urn:schemas-microsoft-com:office:office" xmlns:r="http://schemas.openxmlformats.org/officeDocument/2006/relationships" xmlns:m="http://schemas.openxmlformats.org/officeDocument/2006/math" xmlns:v="urn:schemas-microsoft-com:vml" xmlns:wp14="http://schemas.microsoft.com/office/word/2010/wordprocessingDrawing" xmlns:wp="http://schemas.openxmlformats.org/drawingml/2006/wordprocessingDrawing" xmlns:w10="urn:schemas-microsoft-com:office:word" xmlns:w="http://schemas.openxmlformats.org/wordprocessingml/2006/main" xmlns:w14="http://schemas.microsoft.com/office/word/2010/wordml" xmlns:w15="http://schemas.microsoft.com/office/word/2012/wordml" xmlns:w16se="http://schemas.microsoft.com/office/word/2015/wordml/symex" xmlns:wpg="http://schemas.microsoft.com/office/word/2010/wordprocessingGroup" xmlns:wpi="http://schemas.microsoft.com/office/word/2010/wordprocessingInk" xmlns:wne="http://schemas.microsoft.com/office/word/2006/wordml" xmlns:wps="http://schemas.microsoft.com/office/word/2010/wordprocessingShape" mc:Ignorable="w14 w15 w16se wp14">
   <w:endnote w:type="separator" w:id="-1">
     <w:p>
       <w:r>
@@ -686,7 +569,7 @@
 </file>
 
 <file path=word/footnotes.xml><?xml version="1.0" encoding="utf-8"?>
-<w:footnotes xmlns:wpc="http://schemas.microsoft.com/office/word/2010/wordprocessingCanvas" xmlns:cx="http://schemas.microsoft.com/office/drawing/2014/chartex" xmlns:cx1="http://schemas.microsoft.com/office/drawing/2015/9/8/chartex" xmlns:cx2="http://schemas.microsoft.com/office/drawing/2015/10/21/chartex" xmlns:cx3="http://schemas.microsoft.com/office/drawing/2016/5/9/chartex" xmlns:cx4="http://schemas.microsoft.com/office/drawing/2016/5/10/chartex" xmlns:cx5="http://schemas.microsoft.com/office/drawing/2016/5/11/chartex" xmlns:cx6="http://schemas.microsoft.com/office/drawing/2016/5/12/chartex" xmlns:cx7="http://schemas.microsoft.com/office/drawing/2016/5/13/chartex" xmlns:cx8="http://schemas.microsoft.com/office/drawing/2016/5/14/chartex" xmlns:mc="http://schemas.openxmlformats.org/markup-compatibility/2006" xmlns:aink="http://schemas.microsoft.com/office/drawing/2016/ink" xmlns:am3d="http://schemas.microsoft.com/office/drawing/2017/model3d" xmlns:o="urn:schemas-microsoft-com:office:office" xmlns:oel="http://schemas.microsoft.com/office/2019/extlst" xmlns:r="http://schemas.openxmlformats.org/officeDocument/2006/relationships" xmlns:m="http://schemas.openxmlformats.org/officeDocument/2006/math" xmlns:v="urn:schemas-microsoft-com:vml" xmlns:wp14="http://schemas.microsoft.com/office/word/2010/wordprocessingDrawing" xmlns:wp="http://schemas.openxmlformats.org/drawingml/2006/wordprocessingDrawing" xmlns:w10="urn:schemas-microsoft-com:office:word" xmlns:w="http://schemas.openxmlformats.org/wordprocessingml/2006/main" xmlns:w14="http://schemas.microsoft.com/office/word/2010/wordml" xmlns:w15="http://schemas.microsoft.com/office/word/2012/wordml" xmlns:w16cex="http://schemas.microsoft.com/office/word/2018/wordml/cex" xmlns:w16cid="http://schemas.microsoft.com/office/word/2016/wordml/cid" xmlns:w16="http://schemas.microsoft.com/office/word/2018/wordml" xmlns:w16du="http://schemas.microsoft.com/office/word/2023/wordml/word16du" xmlns:w16sdtdh="http://schemas.microsoft.com/office/word/2020/wordml/sdtdatahash" xmlns:w16sdtfl="http://schemas.microsoft.com/office/word/2024/wordml/sdtformatlock" xmlns:w16se="http://schemas.microsoft.com/office/word/2015/wordml/symex" xmlns:wpg="http://schemas.microsoft.com/office/word/2010/wordprocessingGroup" xmlns:wpi="http://schemas.microsoft.com/office/word/2010/wordprocessingInk" xmlns:wne="http://schemas.microsoft.com/office/word/2006/wordml" xmlns:wps="http://schemas.microsoft.com/office/word/2010/wordprocessingShape" mc:Ignorable="w14 w15 w16se w16cid w16 w16cex w16sdtdh w16sdtfl w16du wp14">
+<w:footnotes xmlns:wpc="http://schemas.microsoft.com/office/word/2010/wordprocessingCanvas" xmlns:cx="http://schemas.microsoft.com/office/drawing/2014/chartex" xmlns:mc="http://schemas.openxmlformats.org/markup-compatibility/2006" xmlns:o="urn:schemas-microsoft-com:office:office" xmlns:r="http://schemas.openxmlformats.org/officeDocument/2006/relationships" xmlns:m="http://schemas.openxmlformats.org/officeDocument/2006/math" xmlns:v="urn:schemas-microsoft-com:vml" xmlns:wp14="http://schemas.microsoft.com/office/word/2010/wordprocessingDrawing" xmlns:wp="http://schemas.openxmlformats.org/drawingml/2006/wordprocessingDrawing" xmlns:w10="urn:schemas-microsoft-com:office:word" xmlns:w="http://schemas.openxmlformats.org/wordprocessingml/2006/main" xmlns:w14="http://schemas.microsoft.com/office/word/2010/wordml" xmlns:w15="http://schemas.microsoft.com/office/word/2012/wordml" xmlns:w16se="http://schemas.microsoft.com/office/word/2015/wordml/symex" xmlns:wpg="http://schemas.microsoft.com/office/word/2010/wordprocessingGroup" xmlns:wpi="http://schemas.microsoft.com/office/word/2010/wordprocessingInk" xmlns:wne="http://schemas.microsoft.com/office/word/2006/wordml" xmlns:wps="http://schemas.microsoft.com/office/word/2010/wordprocessingShape" mc:Ignorable="w14 w15 w16se wp14">
   <w:footnote w:type="separator" w:id="-1">
     <w:p>
       <w:r>
@@ -705,7 +588,7 @@
 </file>
 
 <file path=word/header1.xml><?xml version="1.0" encoding="utf-8"?>
-<w:hdr xmlns:wpc="http://schemas.microsoft.com/office/word/2010/wordprocessingCanvas" xmlns:cx="http://schemas.microsoft.com/office/drawing/2014/chartex" xmlns:cx1="http://schemas.microsoft.com/office/drawing/2015/9/8/chartex" xmlns:cx2="http://schemas.microsoft.com/office/drawing/2015/10/21/chartex" xmlns:cx3="http://schemas.microsoft.com/office/drawing/2016/5/9/chartex" xmlns:cx4="http://schemas.microsoft.com/office/drawing/2016/5/10/chartex" xmlns:cx5="http://schemas.microsoft.com/office/drawing/2016/5/11/chartex" xmlns:cx6="http://schemas.microsoft.com/office/drawing/2016/5/12/chartex" xmlns:cx7="http://schemas.microsoft.com/office/drawing/2016/5/13/chartex" xmlns:cx8="http://schemas.microsoft.com/office/drawing/2016/5/14/chartex" xmlns:mc="http://schemas.openxmlformats.org/markup-compatibility/2006" xmlns:aink="http://schemas.microsoft.com/office/drawing/2016/ink" xmlns:am3d="http://schemas.microsoft.com/office/drawing/2017/model3d" xmlns:o="urn:schemas-microsoft-com:office:office" xmlns:oel="http://schemas.microsoft.com/office/2019/extlst" xmlns:r="http://schemas.openxmlformats.org/officeDocument/2006/relationships" xmlns:m="http://schemas.openxmlformats.org/officeDocument/2006/math" xmlns:v="urn:schemas-microsoft-com:vml" xmlns:wp14="http://schemas.microsoft.com/office/word/2010/wordprocessingDrawing" xmlns:wp="http://schemas.openxmlformats.org/drawingml/2006/wordprocessingDrawing" xmlns:w10="urn:schemas-microsoft-com:office:word" xmlns:w="http://schemas.openxmlformats.org/wordprocessingml/2006/main" xmlns:w14="http://schemas.microsoft.com/office/word/2010/wordml" xmlns:w15="http://schemas.microsoft.com/office/word/2012/wordml" xmlns:w16cex="http://schemas.microsoft.com/office/word/2018/wordml/cex" xmlns:w16cid="http://schemas.microsoft.com/office/word/2016/wordml/cid" xmlns:w16="http://schemas.microsoft.com/office/word/2018/wordml" xmlns:w16du="http://schemas.microsoft.com/office/word/2023/wordml/word16du" xmlns:w16sdtdh="http://schemas.microsoft.com/office/word/2020/wordml/sdtdatahash" xmlns:w16sdtfl="http://schemas.microsoft.com/office/word/2024/wordml/sdtformatlock" xmlns:w16se="http://schemas.microsoft.com/office/word/2015/wordml/symex" xmlns:wpg="http://schemas.microsoft.com/office/word/2010/wordprocessingGroup" xmlns:wpi="http://schemas.microsoft.com/office/word/2010/wordprocessingInk" xmlns:wne="http://schemas.microsoft.com/office/word/2006/wordml" xmlns:wps="http://schemas.microsoft.com/office/word/2010/wordprocessingShape" mc:Ignorable="w14 w15 w16se w16cid w16 w16cex w16sdtdh w16sdtfl w16du wp14">
+<w:hdr xmlns:wpc="http://schemas.microsoft.com/office/word/2010/wordprocessingCanvas" xmlns:cx="http://schemas.microsoft.com/office/drawing/2014/chartex" xmlns:mc="http://schemas.openxmlformats.org/markup-compatibility/2006" xmlns:o="urn:schemas-microsoft-com:office:office" xmlns:r="http://schemas.openxmlformats.org/officeDocument/2006/relationships" xmlns:m="http://schemas.openxmlformats.org/officeDocument/2006/math" xmlns:v="urn:schemas-microsoft-com:vml" xmlns:wp14="http://schemas.microsoft.com/office/word/2010/wordprocessingDrawing" xmlns:wp="http://schemas.openxmlformats.org/drawingml/2006/wordprocessingDrawing" xmlns:w10="urn:schemas-microsoft-com:office:word" xmlns:w="http://schemas.openxmlformats.org/wordprocessingml/2006/main" xmlns:w14="http://schemas.microsoft.com/office/word/2010/wordml" xmlns:w15="http://schemas.microsoft.com/office/word/2012/wordml" xmlns:w16se="http://schemas.microsoft.com/office/word/2015/wordml/symex" xmlns:wpg="http://schemas.microsoft.com/office/word/2010/wordprocessingGroup" xmlns:wpi="http://schemas.microsoft.com/office/word/2010/wordprocessingInk" xmlns:wne="http://schemas.microsoft.com/office/word/2006/wordml" xmlns:wps="http://schemas.microsoft.com/office/word/2010/wordprocessingShape" mc:Ignorable="w14 w15 w16se wp14">
   <w:p>
     <w:pPr>
       <w:pStyle w:val="Encabezado"/>
@@ -782,7 +665,7 @@
 </file>
 
 <file path=word/styles.xml><?xml version="1.0" encoding="utf-8"?>
-<w:styles xmlns:mc="http://schemas.openxmlformats.org/markup-compatibility/2006" xmlns:r="http://schemas.openxmlformats.org/officeDocument/2006/relationships" xmlns:w="http://schemas.openxmlformats.org/wordprocessingml/2006/main" xmlns:w14="http://schemas.microsoft.com/office/word/2010/wordml" xmlns:w15="http://schemas.microsoft.com/office/word/2012/wordml" xmlns:w16cex="http://schemas.microsoft.com/office/word/2018/wordml/cex" xmlns:w16cid="http://schemas.microsoft.com/office/word/2016/wordml/cid" xmlns:w16="http://schemas.microsoft.com/office/word/2018/wordml" xmlns:w16du="http://schemas.microsoft.com/office/word/2023/wordml/word16du" xmlns:w16sdtdh="http://schemas.microsoft.com/office/word/2020/wordml/sdtdatahash" xmlns:w16sdtfl="http://schemas.microsoft.com/office/word/2024/wordml/sdtformatlock" xmlns:w16se="http://schemas.microsoft.com/office/word/2015/wordml/symex" mc:Ignorable="w14 w15 w16se w16cid w16 w16cex w16sdtdh w16sdtfl w16du">
+<w:styles xmlns:mc="http://schemas.openxmlformats.org/markup-compatibility/2006" xmlns:r="http://schemas.openxmlformats.org/officeDocument/2006/relationships" xmlns:w="http://schemas.openxmlformats.org/wordprocessingml/2006/main" xmlns:w14="http://schemas.microsoft.com/office/word/2010/wordml" xmlns:w15="http://schemas.microsoft.com/office/word/2012/wordml" xmlns:w16se="http://schemas.microsoft.com/office/word/2015/wordml/symex" mc:Ignorable="w14 w15 w16se">
   <w:docDefaults>
     <w:rPrDefault>
       <w:rPr>
@@ -800,7 +683,7 @@
       </w:pPr>
     </w:pPrDefault>
   </w:docDefaults>
-  <w:latentStyles w:defLockedState="0" w:defUIPriority="99" w:defSemiHidden="0" w:defUnhideWhenUsed="0" w:defQFormat="0" w:count="376">
+  <w:latentStyles w:defLockedState="0" w:defUIPriority="99" w:defSemiHidden="0" w:defUnhideWhenUsed="0" w:defQFormat="0" w:count="371">
     <w:lsdException w:name="Normal" w:uiPriority="0" w:qFormat="1"/>
     <w:lsdException w:name="heading 1" w:uiPriority="9" w:qFormat="1"/>
     <w:lsdException w:name="heading 2" w:semiHidden="1" w:uiPriority="9" w:unhideWhenUsed="1" w:qFormat="1"/>
@@ -1172,11 +1055,6 @@
     <w:lsdException w:name="List Table 5 Dark Accent 6" w:uiPriority="50"/>
     <w:lsdException w:name="List Table 6 Colorful Accent 6" w:uiPriority="51"/>
     <w:lsdException w:name="List Table 7 Colorful Accent 6" w:uiPriority="52"/>
-    <w:lsdException w:name="Mention" w:semiHidden="1" w:unhideWhenUsed="1"/>
-    <w:lsdException w:name="Smart Hyperlink" w:semiHidden="1" w:unhideWhenUsed="1"/>
-    <w:lsdException w:name="Hashtag" w:semiHidden="1" w:unhideWhenUsed="1"/>
-    <w:lsdException w:name="Unresolved Mention" w:semiHidden="1" w:unhideWhenUsed="1"/>
-    <w:lsdException w:name="Smart Link" w:semiHidden="1" w:unhideWhenUsed="1"/>
   </w:latentStyles>
   <w:style w:type="paragraph" w:default="1" w:styleId="Normal">
     <w:name w:val="Normal"/>

</xml_diff>

<commit_message>
Fase inicial y final para administrativos implementada
</commit_message>
<xml_diff>
--- a/Modelos_documentos/conformidad_contrato.docx
+++ b/Modelos_documentos/conformidad_contrato.docx
@@ -190,7 +190,7 @@
           <w:sz w:val="24"/>
           <w:szCs w:val="24"/>
         </w:rPr>
-        <w:t>25 de agosto de 2025</w:t>
+        <w:t>26 de agosto de 2025</w:t>
       </w:r>
       <w:r>
         <w:rPr>
@@ -233,18 +233,34 @@
           <w:sz w:val="24"/>
           <w:szCs w:val="24"/>
         </w:rPr>
-        <w:t>Por medio de la presente se deja constancia de que nombre, con RUC N.º ruc, ha realizado satisfactoriamente el descripcion_cursos en el Centro de Idiomas de la FLCH, bajo la modalidad híbrida, según orden de servicio N.º ________, y en cumplimiento de la numero_armada armada del contrato de locación de servicios N.º Nro</w:t>
-      </w:r>
-      <w:r>
-        <w:rPr>
-          <w:rFonts w:ascii="Garamond" w:hAnsi="Garamond"/>
-          <w:sz w:val="24"/>
-          <w:szCs w:val="24"/>
-        </w:rPr>
-        <w:t>_Contrato/UNMSM</w:t>
+        <w:t xml:space="preserve">Por medio de la presente se deja constancia de que nombre, con RUC N.º ruc, ha realizado satisfactoriamente el descripcion_cursos en el Centro de Idiomas de la FLCH, bajo la modalidad </w:t>
+      </w:r>
+      <w:r>
+        <w:rPr>
+          <w:rFonts w:ascii="Garamond" w:hAnsi="Garamond"/>
+          <w:sz w:val="24"/>
+          <w:szCs w:val="24"/>
+        </w:rPr>
+        <w:t>modalidad_servicio</w:t>
       </w:r>
       <w:bookmarkStart w:id="0" w:name="_GoBack"/>
       <w:bookmarkEnd w:id="0"/>
+      <w:r>
+        <w:rPr>
+          <w:rFonts w:ascii="Garamond" w:hAnsi="Garamond"/>
+          <w:sz w:val="24"/>
+          <w:szCs w:val="24"/>
+        </w:rPr>
+        <w:t>, según orden de servicio N.º ________, y en cumplimiento de la numero_armada armada del contrato de locación de servicios N.º Nro</w:t>
+      </w:r>
+      <w:r>
+        <w:rPr>
+          <w:rFonts w:ascii="Garamond" w:hAnsi="Garamond"/>
+          <w:sz w:val="24"/>
+          <w:szCs w:val="24"/>
+        </w:rPr>
+        <w:t>_Contrato/UNMSM</w:t>
+      </w:r>
       <w:r>
         <w:rPr>
           <w:rFonts w:ascii="Garamond" w:hAnsi="Garamond"/>

</xml_diff>

<commit_message>
Corrección de errores en generación de fase inicial y final para administrativos
</commit_message>
<xml_diff>
--- a/Modelos_documentos/conformidad_contrato.docx
+++ b/Modelos_documentos/conformidad_contrato.docx
@@ -190,7 +190,7 @@
           <w:sz w:val="24"/>
           <w:szCs w:val="24"/>
         </w:rPr>
-        <w:t>26 de agosto de 2025</w:t>
+        <w:t>2 de septiembre de 2025</w:t>
       </w:r>
       <w:r>
         <w:rPr>
@@ -243,8 +243,6 @@
         </w:rPr>
         <w:t>modalidad_servicio</w:t>
       </w:r>
-      <w:bookmarkStart w:id="0" w:name="_GoBack"/>
-      <w:bookmarkEnd w:id="0"/>
       <w:r>
         <w:rPr>
           <w:rFonts w:ascii="Garamond" w:hAnsi="Garamond"/>
@@ -385,126 +383,144 @@
           <w:szCs w:val="24"/>
         </w:rPr>
       </w:pPr>
-    </w:p>
-    <w:p>
-      <w:pPr>
-        <w:pStyle w:val="Textoindependiente"/>
-        <w:rPr>
-          <w:rFonts w:ascii="Garamond" w:hAnsi="Garamond"/>
-          <w:sz w:val="24"/>
-          <w:szCs w:val="24"/>
-        </w:rPr>
-      </w:pPr>
-    </w:p>
-    <w:p>
-      <w:pPr>
-        <w:pStyle w:val="Textoindependiente"/>
-        <w:rPr>
-          <w:rFonts w:ascii="Garamond" w:hAnsi="Garamond"/>
-          <w:sz w:val="24"/>
-          <w:szCs w:val="24"/>
-        </w:rPr>
-      </w:pPr>
-    </w:p>
-    <w:p>
-      <w:pPr>
-        <w:pStyle w:val="Textoindependiente"/>
-        <w:rPr>
-          <w:rFonts w:ascii="Garamond" w:hAnsi="Garamond"/>
-          <w:sz w:val="24"/>
-          <w:szCs w:val="24"/>
-        </w:rPr>
-      </w:pPr>
-    </w:p>
-    <w:p>
-      <w:pPr>
-        <w:pStyle w:val="Textoindependiente"/>
-        <w:rPr>
-          <w:rFonts w:ascii="Garamond" w:hAnsi="Garamond"/>
-          <w:sz w:val="24"/>
-          <w:szCs w:val="24"/>
-        </w:rPr>
-      </w:pPr>
-    </w:p>
-    <w:p>
-      <w:pPr>
-        <w:pStyle w:val="Textoindependiente"/>
+      <w:bookmarkStart w:id="0" w:name="_GoBack"/>
+      <w:bookmarkEnd w:id="0"/>
+    </w:p>
+    <w:p>
+      <w:pPr>
+        <w:pStyle w:val="Textoindependiente"/>
+        <w:rPr>
+          <w:rFonts w:ascii="Garamond" w:hAnsi="Garamond"/>
+          <w:sz w:val="24"/>
+          <w:szCs w:val="24"/>
+        </w:rPr>
+      </w:pPr>
+    </w:p>
+    <w:p>
+      <w:pPr>
+        <w:pStyle w:val="Textoindependiente"/>
+        <w:rPr>
+          <w:rFonts w:ascii="Garamond" w:hAnsi="Garamond"/>
+          <w:sz w:val="24"/>
+          <w:szCs w:val="24"/>
+        </w:rPr>
+      </w:pPr>
+    </w:p>
+    <w:p>
+      <w:pPr>
+        <w:pStyle w:val="Textoindependiente"/>
+        <w:rPr>
+          <w:rFonts w:ascii="Garamond" w:hAnsi="Garamond"/>
+          <w:sz w:val="24"/>
+          <w:szCs w:val="24"/>
+        </w:rPr>
+      </w:pPr>
+    </w:p>
+    <w:p>
+      <w:pPr>
+        <w:pStyle w:val="Textoindependiente"/>
+        <w:rPr>
+          <w:rFonts w:ascii="Garamond" w:hAnsi="Garamond"/>
+          <w:sz w:val="28"/>
+          <w:szCs w:val="24"/>
+        </w:rPr>
+      </w:pPr>
+    </w:p>
+    <w:p>
+      <w:pPr>
+        <w:spacing w:line="276" w:lineRule="auto"/>
+        <w:ind w:right="-2"/>
         <w:jc w:val="center"/>
         <w:rPr>
-          <w:rFonts w:ascii="Garamond" w:hAnsi="Garamond" w:cs="Arial"/>
+          <w:rFonts w:ascii="Garamond" w:hAnsi="Garamond"/>
           <w:b/>
-          <w:bCs/>
-          <w:sz w:val="24"/>
-          <w:szCs w:val="24"/>
-        </w:rPr>
-      </w:pPr>
-      <w:r>
-        <w:rPr>
-          <w:rFonts w:ascii="Garamond" w:hAnsi="Garamond" w:cs="Arial"/>
+          <w:sz w:val="24"/>
+        </w:rPr>
+      </w:pPr>
+      <w:r>
+        <w:rPr>
+          <w:rFonts w:ascii="Garamond" w:hAnsi="Garamond"/>
           <w:b/>
-          <w:bCs/>
-          <w:sz w:val="24"/>
-          <w:szCs w:val="24"/>
-        </w:rPr>
-        <w:t>Mg. Jacobo Virgilio Alva Mendo</w:t>
-      </w:r>
-    </w:p>
-    <w:p>
-      <w:pPr>
-        <w:pStyle w:val="Textoindependiente"/>
+          <w:sz w:val="24"/>
+        </w:rPr>
+        <w:t>Dr.</w:t>
+      </w:r>
+      <w:r>
+        <w:rPr>
+          <w:rFonts w:ascii="Garamond" w:hAnsi="Garamond"/>
+          <w:b/>
+          <w:spacing w:val="-14"/>
+          <w:sz w:val="24"/>
+        </w:rPr>
+        <w:t xml:space="preserve"> Marcel Martín Velázquez Castro </w:t>
+      </w:r>
+    </w:p>
+    <w:p>
+      <w:pPr>
+        <w:ind w:right="-2"/>
         <w:jc w:val="center"/>
         <w:rPr>
-          <w:rFonts w:ascii="Garamond" w:hAnsi="Garamond" w:cs="Arial"/>
-          <w:bCs/>
-          <w:sz w:val="24"/>
-          <w:szCs w:val="24"/>
-        </w:rPr>
-      </w:pPr>
-      <w:r>
-        <w:rPr>
-          <w:rFonts w:ascii="Garamond" w:hAnsi="Garamond" w:cs="Arial"/>
-          <w:bCs/>
-          <w:sz w:val="24"/>
-          <w:szCs w:val="24"/>
-        </w:rPr>
-        <w:t xml:space="preserve">Director de </w:t>
-      </w:r>
-      <w:r>
-        <w:rPr>
-          <w:rFonts w:ascii="Garamond" w:hAnsi="Garamond" w:cs="Arial"/>
-          <w:bCs/>
-          <w:sz w:val="24"/>
-          <w:szCs w:val="24"/>
-        </w:rPr>
-        <w:t xml:space="preserve">la </w:t>
-      </w:r>
-      <w:r>
-        <w:rPr>
-          <w:rFonts w:ascii="Garamond" w:hAnsi="Garamond" w:cs="Arial"/>
-          <w:bCs/>
-          <w:sz w:val="24"/>
-          <w:szCs w:val="24"/>
-        </w:rPr>
-        <w:t xml:space="preserve">Dirección de Gestión Institucional </w:t>
-      </w:r>
-    </w:p>
-    <w:p>
-      <w:pPr>
-        <w:pStyle w:val="Textoindependiente"/>
+          <w:rFonts w:ascii="Garamond" w:hAnsi="Garamond"/>
+          <w:spacing w:val="-2"/>
+          <w:sz w:val="24"/>
+        </w:rPr>
+      </w:pPr>
+      <w:r>
+        <w:rPr>
+          <w:rFonts w:ascii="Garamond" w:hAnsi="Garamond"/>
+          <w:spacing w:val="-2"/>
+          <w:sz w:val="24"/>
+        </w:rPr>
+        <w:t>Director</w:t>
+      </w:r>
+      <w:r>
+        <w:rPr>
+          <w:rFonts w:ascii="Garamond" w:hAnsi="Garamond"/>
+          <w:spacing w:val="5"/>
+          <w:sz w:val="24"/>
+        </w:rPr>
+        <w:t xml:space="preserve"> (e) </w:t>
+      </w:r>
+      <w:r>
+        <w:rPr>
+          <w:rFonts w:ascii="Garamond" w:hAnsi="Garamond"/>
+          <w:spacing w:val="-2"/>
+          <w:sz w:val="24"/>
+        </w:rPr>
+        <w:t>de la Dirección de Gestión</w:t>
+      </w:r>
+      <w:r>
+        <w:rPr>
+          <w:rFonts w:ascii="Garamond" w:hAnsi="Garamond"/>
+          <w:spacing w:val="1"/>
+          <w:sz w:val="24"/>
+        </w:rPr>
+        <w:t xml:space="preserve"> </w:t>
+      </w:r>
+      <w:r>
+        <w:rPr>
+          <w:rFonts w:ascii="Garamond" w:hAnsi="Garamond"/>
+          <w:spacing w:val="-2"/>
+          <w:sz w:val="24"/>
+        </w:rPr>
+        <w:t>Institucional</w:t>
+      </w:r>
+    </w:p>
+    <w:p>
+      <w:pPr>
+        <w:ind w:right="-2"/>
         <w:jc w:val="center"/>
         <w:rPr>
-          <w:rFonts w:ascii="Garamond" w:hAnsi="Garamond" w:cs="Arial"/>
-          <w:bCs/>
-          <w:sz w:val="24"/>
-          <w:szCs w:val="24"/>
-        </w:rPr>
-      </w:pPr>
-      <w:r>
-        <w:rPr>
-          <w:rFonts w:ascii="Garamond" w:hAnsi="Garamond" w:cs="Arial"/>
-          <w:bCs/>
-          <w:sz w:val="24"/>
-          <w:szCs w:val="24"/>
+          <w:rFonts w:ascii="Garamond" w:hAnsi="Garamond"/>
+          <w:spacing w:val="-2"/>
+          <w:sz w:val="24"/>
+        </w:rPr>
+      </w:pPr>
+      <w:r>
+        <w:rPr>
+          <w:rFonts w:ascii="Garamond" w:hAnsi="Garamond"/>
+          <w:spacing w:val="-2"/>
+          <w:sz w:val="24"/>
         </w:rPr>
         <w:t>Centro de Idiomas de la UNMSM</w:t>
       </w:r>

</xml_diff>

<commit_message>
Actualización de firmas en los  documentos.
</commit_message>
<xml_diff>
--- a/Modelos_documentos/conformidad_contrato.docx
+++ b/Modelos_documentos/conformidad_contrato.docx
@@ -190,7 +190,7 @@
           <w:sz w:val="24"/>
           <w:szCs w:val="24"/>
         </w:rPr>
-        <w:t>2 de septiembre de 2025</w:t>
+        <w:t>8 de septiembre de 2025</w:t>
       </w:r>
       <w:r>
         <w:rPr>
@@ -265,36 +265,16 @@
           <w:sz w:val="24"/>
           <w:szCs w:val="24"/>
         </w:rPr>
-        <w:t xml:space="preserve">-FLCH/2025 por el importe de </w:t>
-      </w:r>
-      <w:proofErr w:type="spellStart"/>
-      <w:r>
-        <w:rPr>
-          <w:rFonts w:ascii="Garamond" w:hAnsi="Garamond"/>
-          <w:sz w:val="24"/>
-          <w:szCs w:val="24"/>
-        </w:rPr>
-        <w:t>monto_subtotal</w:t>
-      </w:r>
-      <w:proofErr w:type="spellEnd"/>
-      <w:r>
-        <w:rPr>
-          <w:rFonts w:ascii="Garamond" w:hAnsi="Garamond"/>
-          <w:sz w:val="24"/>
-          <w:szCs w:val="24"/>
-        </w:rPr>
-        <w:t xml:space="preserve">, monto por hora: </w:t>
-      </w:r>
-      <w:proofErr w:type="spellStart"/>
-      <w:r>
-        <w:rPr>
-          <w:rFonts w:ascii="Garamond" w:hAnsi="Garamond"/>
-          <w:sz w:val="24"/>
-          <w:szCs w:val="24"/>
-        </w:rPr>
-        <w:t>monto_hora</w:t>
-      </w:r>
-      <w:proofErr w:type="spellEnd"/>
+        <w:t>-FLCH/2025 por el importe de monto_subtotal</w:t>
+      </w:r>
+      <w:r>
+        <w:rPr>
+          <w:rFonts w:ascii="Garamond" w:hAnsi="Garamond"/>
+          <w:sz w:val="24"/>
+          <w:szCs w:val="24"/>
+        </w:rPr>
+        <w:t>, monto por hora: monto_hora</w:t>
+      </w:r>
       <w:r>
         <w:rPr>
           <w:rFonts w:ascii="Garamond" w:hAnsi="Garamond"/>
@@ -383,158 +363,105 @@
           <w:szCs w:val="24"/>
         </w:rPr>
       </w:pPr>
+    </w:p>
+    <w:p>
+      <w:pPr>
+        <w:pStyle w:val="Textoindependiente"/>
+        <w:rPr>
+          <w:rFonts w:ascii="Garamond" w:hAnsi="Garamond"/>
+          <w:sz w:val="24"/>
+          <w:szCs w:val="24"/>
+        </w:rPr>
+      </w:pPr>
+    </w:p>
+    <w:p>
+      <w:pPr>
+        <w:pStyle w:val="Textoindependiente"/>
+        <w:rPr>
+          <w:rFonts w:ascii="Garamond" w:hAnsi="Garamond"/>
+          <w:sz w:val="24"/>
+          <w:szCs w:val="24"/>
+        </w:rPr>
+      </w:pPr>
+    </w:p>
+    <w:p>
+      <w:pPr>
+        <w:pStyle w:val="Textoindependiente"/>
+        <w:rPr>
+          <w:rFonts w:ascii="Garamond" w:hAnsi="Garamond"/>
+          <w:sz w:val="24"/>
+          <w:szCs w:val="24"/>
+        </w:rPr>
+      </w:pPr>
+    </w:p>
+    <w:p>
+      <w:pPr>
+        <w:pStyle w:val="Textoindependiente"/>
+        <w:spacing w:line="276" w:lineRule="auto"/>
+        <w:jc w:val="center"/>
+        <w:rPr>
+          <w:rFonts w:ascii="Garamond" w:hAnsi="Garamond"/>
+          <w:b/>
+          <w:sz w:val="24"/>
+        </w:rPr>
+      </w:pPr>
+      <w:r>
+        <w:rPr>
+          <w:rFonts w:ascii="Garamond" w:hAnsi="Garamond"/>
+          <w:b/>
+          <w:sz w:val="24"/>
+        </w:rPr>
+        <w:t>Dr. Giullaume Oisel</w:t>
+      </w:r>
+    </w:p>
+    <w:p>
+      <w:pPr>
+        <w:pStyle w:val="Textoindependiente"/>
+        <w:spacing w:line="276" w:lineRule="auto"/>
+        <w:jc w:val="center"/>
+        <w:rPr>
+          <w:rFonts w:ascii="Garamond" w:hAnsi="Garamond"/>
+          <w:sz w:val="24"/>
+        </w:rPr>
+      </w:pPr>
+      <w:r>
+        <w:rPr>
+          <w:rFonts w:ascii="Garamond" w:hAnsi="Garamond"/>
+          <w:sz w:val="24"/>
+        </w:rPr>
+        <w:t>Director de la Dirección Académica</w:t>
+      </w:r>
+    </w:p>
+    <w:p>
+      <w:pPr>
+        <w:pStyle w:val="Textoindependiente"/>
+        <w:spacing w:line="276" w:lineRule="auto"/>
+        <w:jc w:val="center"/>
+        <w:rPr>
+          <w:rFonts w:ascii="Garamond" w:hAnsi="Garamond"/>
+          <w:sz w:val="24"/>
+        </w:rPr>
+      </w:pPr>
+      <w:r>
+        <w:rPr>
+          <w:rFonts w:ascii="Garamond" w:hAnsi="Garamond"/>
+          <w:sz w:val="24"/>
+        </w:rPr>
+        <w:t>Centro de Idiomas de la UNMSM</w:t>
+      </w:r>
+    </w:p>
+    <w:p>
+      <w:pPr>
+        <w:pStyle w:val="Textoindependiente"/>
+        <w:rPr>
+          <w:rFonts w:ascii="Garamond" w:hAnsi="Garamond"/>
+          <w:b/>
+          <w:sz w:val="24"/>
+          <w:szCs w:val="24"/>
+        </w:rPr>
+      </w:pPr>
       <w:bookmarkStart w:id="0" w:name="_GoBack"/>
       <w:bookmarkEnd w:id="0"/>
-    </w:p>
-    <w:p>
-      <w:pPr>
-        <w:pStyle w:val="Textoindependiente"/>
-        <w:rPr>
-          <w:rFonts w:ascii="Garamond" w:hAnsi="Garamond"/>
-          <w:sz w:val="24"/>
-          <w:szCs w:val="24"/>
-        </w:rPr>
-      </w:pPr>
-    </w:p>
-    <w:p>
-      <w:pPr>
-        <w:pStyle w:val="Textoindependiente"/>
-        <w:rPr>
-          <w:rFonts w:ascii="Garamond" w:hAnsi="Garamond"/>
-          <w:sz w:val="24"/>
-          <w:szCs w:val="24"/>
-        </w:rPr>
-      </w:pPr>
-    </w:p>
-    <w:p>
-      <w:pPr>
-        <w:pStyle w:val="Textoindependiente"/>
-        <w:rPr>
-          <w:rFonts w:ascii="Garamond" w:hAnsi="Garamond"/>
-          <w:sz w:val="24"/>
-          <w:szCs w:val="24"/>
-        </w:rPr>
-      </w:pPr>
-    </w:p>
-    <w:p>
-      <w:pPr>
-        <w:pStyle w:val="Textoindependiente"/>
-        <w:rPr>
-          <w:rFonts w:ascii="Garamond" w:hAnsi="Garamond"/>
-          <w:sz w:val="28"/>
-          <w:szCs w:val="24"/>
-        </w:rPr>
-      </w:pPr>
-    </w:p>
-    <w:p>
-      <w:pPr>
-        <w:spacing w:line="276" w:lineRule="auto"/>
-        <w:ind w:right="-2"/>
-        <w:jc w:val="center"/>
-        <w:rPr>
-          <w:rFonts w:ascii="Garamond" w:hAnsi="Garamond"/>
-          <w:b/>
-          <w:sz w:val="24"/>
-        </w:rPr>
-      </w:pPr>
-      <w:r>
-        <w:rPr>
-          <w:rFonts w:ascii="Garamond" w:hAnsi="Garamond"/>
-          <w:b/>
-          <w:sz w:val="24"/>
-        </w:rPr>
-        <w:t>Dr.</w:t>
-      </w:r>
-      <w:r>
-        <w:rPr>
-          <w:rFonts w:ascii="Garamond" w:hAnsi="Garamond"/>
-          <w:b/>
-          <w:spacing w:val="-14"/>
-          <w:sz w:val="24"/>
-        </w:rPr>
-        <w:t xml:space="preserve"> Marcel Martín Velázquez Castro </w:t>
-      </w:r>
-    </w:p>
-    <w:p>
-      <w:pPr>
-        <w:ind w:right="-2"/>
-        <w:jc w:val="center"/>
-        <w:rPr>
-          <w:rFonts w:ascii="Garamond" w:hAnsi="Garamond"/>
-          <w:spacing w:val="-2"/>
-          <w:sz w:val="24"/>
-        </w:rPr>
-      </w:pPr>
-      <w:r>
-        <w:rPr>
-          <w:rFonts w:ascii="Garamond" w:hAnsi="Garamond"/>
-          <w:spacing w:val="-2"/>
-          <w:sz w:val="24"/>
-        </w:rPr>
-        <w:t>Director</w:t>
-      </w:r>
-      <w:r>
-        <w:rPr>
-          <w:rFonts w:ascii="Garamond" w:hAnsi="Garamond"/>
-          <w:spacing w:val="5"/>
-          <w:sz w:val="24"/>
-        </w:rPr>
-        <w:t xml:space="preserve"> (e) </w:t>
-      </w:r>
-      <w:r>
-        <w:rPr>
-          <w:rFonts w:ascii="Garamond" w:hAnsi="Garamond"/>
-          <w:spacing w:val="-2"/>
-          <w:sz w:val="24"/>
-        </w:rPr>
-        <w:t>de la Dirección de Gestión</w:t>
-      </w:r>
-      <w:r>
-        <w:rPr>
-          <w:rFonts w:ascii="Garamond" w:hAnsi="Garamond"/>
-          <w:spacing w:val="1"/>
-          <w:sz w:val="24"/>
-        </w:rPr>
-        <w:t xml:space="preserve"> </w:t>
-      </w:r>
-      <w:r>
-        <w:rPr>
-          <w:rFonts w:ascii="Garamond" w:hAnsi="Garamond"/>
-          <w:spacing w:val="-2"/>
-          <w:sz w:val="24"/>
-        </w:rPr>
-        <w:t>Institucional</w:t>
-      </w:r>
-    </w:p>
-    <w:p>
-      <w:pPr>
-        <w:ind w:right="-2"/>
-        <w:jc w:val="center"/>
-        <w:rPr>
-          <w:rFonts w:ascii="Garamond" w:hAnsi="Garamond"/>
-          <w:spacing w:val="-2"/>
-          <w:sz w:val="24"/>
-        </w:rPr>
-      </w:pPr>
-      <w:r>
-        <w:rPr>
-          <w:rFonts w:ascii="Garamond" w:hAnsi="Garamond"/>
-          <w:spacing w:val="-2"/>
-          <w:sz w:val="24"/>
-        </w:rPr>
-        <w:t>Centro de Idiomas de la UNMSM</w:t>
-      </w:r>
-    </w:p>
-    <w:p>
-      <w:pPr>
-        <w:pStyle w:val="Textoindependiente"/>
-        <w:rPr>
-          <w:rFonts w:ascii="Garamond" w:hAnsi="Garamond"/>
-          <w:b/>
-          <w:sz w:val="24"/>
-          <w:szCs w:val="24"/>
-        </w:rPr>
-      </w:pPr>
     </w:p>
     <w:p>
       <w:pPr>

</xml_diff>

<commit_message>
Corrección en firma de Director Académico.
</commit_message>
<xml_diff>
--- a/Modelos_documentos/conformidad_contrato.docx
+++ b/Modelos_documentos/conformidad_contrato.docx
@@ -190,7 +190,7 @@
           <w:sz w:val="24"/>
           <w:szCs w:val="24"/>
         </w:rPr>
-        <w:t>8 de septiembre de 2025</w:t>
+        <w:t>9 de septiembre de 2025</w:t>
       </w:r>
       <w:r>
         <w:rPr>
@@ -233,8 +233,27 @@
           <w:sz w:val="24"/>
           <w:szCs w:val="24"/>
         </w:rPr>
-        <w:t xml:space="preserve">Por medio de la presente se deja constancia de que nombre, con RUC N.º ruc, ha realizado satisfactoriamente el descripcion_cursos en el Centro de Idiomas de la FLCH, bajo la modalidad </w:t>
-      </w:r>
+        <w:t xml:space="preserve">Por medio de la presente se deja constancia de que nombre, con RUC N.º ruc, ha realizado satisfactoriamente el </w:t>
+      </w:r>
+      <w:proofErr w:type="spellStart"/>
+      <w:r>
+        <w:rPr>
+          <w:rFonts w:ascii="Garamond" w:hAnsi="Garamond"/>
+          <w:sz w:val="24"/>
+          <w:szCs w:val="24"/>
+        </w:rPr>
+        <w:t>descripcion_cursos</w:t>
+      </w:r>
+      <w:proofErr w:type="spellEnd"/>
+      <w:r>
+        <w:rPr>
+          <w:rFonts w:ascii="Garamond" w:hAnsi="Garamond"/>
+          <w:sz w:val="24"/>
+          <w:szCs w:val="24"/>
+        </w:rPr>
+        <w:t xml:space="preserve"> en el Centro de Idiomas de la FLCH, bajo la modalidad </w:t>
+      </w:r>
+      <w:proofErr w:type="spellStart"/>
       <w:r>
         <w:rPr>
           <w:rFonts w:ascii="Garamond" w:hAnsi="Garamond"/>
@@ -243,38 +262,95 @@
         </w:rPr>
         <w:t>modalidad_servicio</w:t>
       </w:r>
-      <w:r>
-        <w:rPr>
-          <w:rFonts w:ascii="Garamond" w:hAnsi="Garamond"/>
-          <w:sz w:val="24"/>
-          <w:szCs w:val="24"/>
-        </w:rPr>
-        <w:t>, según orden de servicio N.º ________, y en cumplimiento de la numero_armada armada del contrato de locación de servicios N.º Nro</w:t>
-      </w:r>
-      <w:r>
-        <w:rPr>
-          <w:rFonts w:ascii="Garamond" w:hAnsi="Garamond"/>
-          <w:sz w:val="24"/>
-          <w:szCs w:val="24"/>
-        </w:rPr>
-        <w:t>_Contrato/UNMSM</w:t>
-      </w:r>
-      <w:r>
-        <w:rPr>
-          <w:rFonts w:ascii="Garamond" w:hAnsi="Garamond"/>
-          <w:sz w:val="24"/>
-          <w:szCs w:val="24"/>
-        </w:rPr>
-        <w:t>-FLCH/2025 por el importe de monto_subtotal</w:t>
-      </w:r>
-      <w:r>
-        <w:rPr>
-          <w:rFonts w:ascii="Garamond" w:hAnsi="Garamond"/>
-          <w:sz w:val="24"/>
-          <w:szCs w:val="24"/>
-        </w:rPr>
-        <w:t>, monto por hora: monto_hora</w:t>
-      </w:r>
+      <w:proofErr w:type="spellEnd"/>
+      <w:r>
+        <w:rPr>
+          <w:rFonts w:ascii="Garamond" w:hAnsi="Garamond"/>
+          <w:sz w:val="24"/>
+          <w:szCs w:val="24"/>
+        </w:rPr>
+        <w:t xml:space="preserve">, según orden de servicio N.º ________, y en cumplimiento de la </w:t>
+      </w:r>
+      <w:proofErr w:type="spellStart"/>
+      <w:r>
+        <w:rPr>
+          <w:rFonts w:ascii="Garamond" w:hAnsi="Garamond"/>
+          <w:sz w:val="24"/>
+          <w:szCs w:val="24"/>
+        </w:rPr>
+        <w:t>numero_armada</w:t>
+      </w:r>
+      <w:proofErr w:type="spellEnd"/>
+      <w:r>
+        <w:rPr>
+          <w:rFonts w:ascii="Garamond" w:hAnsi="Garamond"/>
+          <w:sz w:val="24"/>
+          <w:szCs w:val="24"/>
+        </w:rPr>
+        <w:t xml:space="preserve"> armada del contrato de locación de servicios N.º </w:t>
+      </w:r>
+      <w:proofErr w:type="spellStart"/>
+      <w:r>
+        <w:rPr>
+          <w:rFonts w:ascii="Garamond" w:hAnsi="Garamond"/>
+          <w:sz w:val="24"/>
+          <w:szCs w:val="24"/>
+        </w:rPr>
+        <w:t>Nro</w:t>
+      </w:r>
+      <w:r>
+        <w:rPr>
+          <w:rFonts w:ascii="Garamond" w:hAnsi="Garamond"/>
+          <w:sz w:val="24"/>
+          <w:szCs w:val="24"/>
+        </w:rPr>
+        <w:t>_Contrato</w:t>
+      </w:r>
+      <w:proofErr w:type="spellEnd"/>
+      <w:r>
+        <w:rPr>
+          <w:rFonts w:ascii="Garamond" w:hAnsi="Garamond"/>
+          <w:sz w:val="24"/>
+          <w:szCs w:val="24"/>
+        </w:rPr>
+        <w:t>/UNMSM</w:t>
+      </w:r>
+      <w:r>
+        <w:rPr>
+          <w:rFonts w:ascii="Garamond" w:hAnsi="Garamond"/>
+          <w:sz w:val="24"/>
+          <w:szCs w:val="24"/>
+        </w:rPr>
+        <w:t xml:space="preserve">-FLCH/2025 por el importe de </w:t>
+      </w:r>
+      <w:proofErr w:type="spellStart"/>
+      <w:r>
+        <w:rPr>
+          <w:rFonts w:ascii="Garamond" w:hAnsi="Garamond"/>
+          <w:sz w:val="24"/>
+          <w:szCs w:val="24"/>
+        </w:rPr>
+        <w:t>monto_subtotal</w:t>
+      </w:r>
+      <w:proofErr w:type="spellEnd"/>
+      <w:r>
+        <w:rPr>
+          <w:rFonts w:ascii="Garamond" w:hAnsi="Garamond"/>
+          <w:sz w:val="24"/>
+          <w:szCs w:val="24"/>
+        </w:rPr>
+        <w:t xml:space="preserve">, monto por hora: </w:t>
+      </w:r>
+      <w:proofErr w:type="spellStart"/>
+      <w:r>
+        <w:rPr>
+          <w:rFonts w:ascii="Garamond" w:hAnsi="Garamond"/>
+          <w:sz w:val="24"/>
+          <w:szCs w:val="24"/>
+        </w:rPr>
+        <w:t>monto_hora</w:t>
+      </w:r>
+      <w:proofErr w:type="spellEnd"/>
       <w:r>
         <w:rPr>
           <w:rFonts w:ascii="Garamond" w:hAnsi="Garamond"/>
@@ -411,8 +487,54 @@
           <w:b/>
           <w:sz w:val="24"/>
         </w:rPr>
-        <w:t>Dr. Giullaume Oisel</w:t>
-      </w:r>
+        <w:t xml:space="preserve">Dr. Guillaume </w:t>
+      </w:r>
+      <w:proofErr w:type="spellStart"/>
+      <w:r>
+        <w:rPr>
+          <w:rFonts w:ascii="Garamond" w:hAnsi="Garamond"/>
+          <w:b/>
+          <w:sz w:val="24"/>
+        </w:rPr>
+        <w:t>Yannick</w:t>
+      </w:r>
+      <w:proofErr w:type="spellEnd"/>
+      <w:r>
+        <w:rPr>
+          <w:rFonts w:ascii="Garamond" w:hAnsi="Garamond"/>
+          <w:b/>
+          <w:sz w:val="24"/>
+        </w:rPr>
+        <w:t xml:space="preserve"> </w:t>
+      </w:r>
+      <w:proofErr w:type="spellStart"/>
+      <w:r>
+        <w:rPr>
+          <w:rFonts w:ascii="Garamond" w:hAnsi="Garamond"/>
+          <w:b/>
+          <w:sz w:val="24"/>
+        </w:rPr>
+        <w:t>Serge</w:t>
+      </w:r>
+      <w:proofErr w:type="spellEnd"/>
+      <w:r>
+        <w:rPr>
+          <w:rFonts w:ascii="Garamond" w:hAnsi="Garamond"/>
+          <w:b/>
+          <w:sz w:val="24"/>
+        </w:rPr>
+        <w:t xml:space="preserve"> </w:t>
+      </w:r>
+      <w:proofErr w:type="spellStart"/>
+      <w:r>
+        <w:rPr>
+          <w:rFonts w:ascii="Garamond" w:hAnsi="Garamond"/>
+          <w:b/>
+          <w:sz w:val="24"/>
+        </w:rPr>
+        <w:t>Oisel</w:t>
+      </w:r>
+      <w:proofErr w:type="spellEnd"/>
     </w:p>
     <w:p>
       <w:pPr>

</xml_diff>

<commit_message>
Actualización de firma añadiendo a la nueva directora académica
</commit_message>
<xml_diff>
--- a/Modelos_documentos/conformidad_contrato.docx
+++ b/Modelos_documentos/conformidad_contrato.docx
@@ -1,6 +1,6 @@
 
 <file path=word/document.xml><?xml version="1.0" encoding="utf-8"?>
-<w:document xmlns:wpc="http://schemas.microsoft.com/office/word/2010/wordprocessingCanvas" xmlns:cx="http://schemas.microsoft.com/office/drawing/2014/chartex" xmlns:mc="http://schemas.openxmlformats.org/markup-compatibility/2006" xmlns:o="urn:schemas-microsoft-com:office:office" xmlns:r="http://schemas.openxmlformats.org/officeDocument/2006/relationships" xmlns:m="http://schemas.openxmlformats.org/officeDocument/2006/math" xmlns:v="urn:schemas-microsoft-com:vml" xmlns:wp14="http://schemas.microsoft.com/office/word/2010/wordprocessingDrawing" xmlns:wp="http://schemas.openxmlformats.org/drawingml/2006/wordprocessingDrawing" xmlns:w10="urn:schemas-microsoft-com:office:word" xmlns:w="http://schemas.openxmlformats.org/wordprocessingml/2006/main" xmlns:w14="http://schemas.microsoft.com/office/word/2010/wordml" xmlns:w15="http://schemas.microsoft.com/office/word/2012/wordml" xmlns:w16se="http://schemas.microsoft.com/office/word/2015/wordml/symex" xmlns:wpg="http://schemas.microsoft.com/office/word/2010/wordprocessingGroup" xmlns:wpi="http://schemas.microsoft.com/office/word/2010/wordprocessingInk" xmlns:wne="http://schemas.microsoft.com/office/word/2006/wordml" xmlns:wps="http://schemas.microsoft.com/office/word/2010/wordprocessingShape" mc:Ignorable="w14 w15 w16se wp14">
+<w:document xmlns:wpc="http://schemas.microsoft.com/office/word/2010/wordprocessingCanvas" xmlns:cx="http://schemas.microsoft.com/office/drawing/2014/chartex" xmlns:cx1="http://schemas.microsoft.com/office/drawing/2015/9/8/chartex" xmlns:cx2="http://schemas.microsoft.com/office/drawing/2015/10/21/chartex" xmlns:cx3="http://schemas.microsoft.com/office/drawing/2016/5/9/chartex" xmlns:cx4="http://schemas.microsoft.com/office/drawing/2016/5/10/chartex" xmlns:cx5="http://schemas.microsoft.com/office/drawing/2016/5/11/chartex" xmlns:cx6="http://schemas.microsoft.com/office/drawing/2016/5/12/chartex" xmlns:cx7="http://schemas.microsoft.com/office/drawing/2016/5/13/chartex" xmlns:cx8="http://schemas.microsoft.com/office/drawing/2016/5/14/chartex" xmlns:mc="http://schemas.openxmlformats.org/markup-compatibility/2006" xmlns:aink="http://schemas.microsoft.com/office/drawing/2016/ink" xmlns:am3d="http://schemas.microsoft.com/office/drawing/2017/model3d" xmlns:o="urn:schemas-microsoft-com:office:office" xmlns:oel="http://schemas.microsoft.com/office/2019/extlst" xmlns:r="http://schemas.openxmlformats.org/officeDocument/2006/relationships" xmlns:m="http://schemas.openxmlformats.org/officeDocument/2006/math" xmlns:v="urn:schemas-microsoft-com:vml" xmlns:wp14="http://schemas.microsoft.com/office/word/2010/wordprocessingDrawing" xmlns:wp="http://schemas.openxmlformats.org/drawingml/2006/wordprocessingDrawing" xmlns:w10="urn:schemas-microsoft-com:office:word" xmlns:w="http://schemas.openxmlformats.org/wordprocessingml/2006/main" xmlns:w14="http://schemas.microsoft.com/office/word/2010/wordml" xmlns:w15="http://schemas.microsoft.com/office/word/2012/wordml" xmlns:w16cex="http://schemas.microsoft.com/office/word/2018/wordml/cex" xmlns:w16cid="http://schemas.microsoft.com/office/word/2016/wordml/cid" xmlns:w16="http://schemas.microsoft.com/office/word/2018/wordml" xmlns:w16du="http://schemas.microsoft.com/office/word/2023/wordml/word16du" xmlns:w16sdtdh="http://schemas.microsoft.com/office/word/2020/wordml/sdtdatahash" xmlns:w16sdtfl="http://schemas.microsoft.com/office/word/2024/wordml/sdtformatlock" xmlns:w16se="http://schemas.microsoft.com/office/word/2015/wordml/symex" xmlns:wpg="http://schemas.microsoft.com/office/word/2010/wordprocessingGroup" xmlns:wpi="http://schemas.microsoft.com/office/word/2010/wordprocessingInk" xmlns:wne="http://schemas.microsoft.com/office/word/2006/wordml" xmlns:wps="http://schemas.microsoft.com/office/word/2010/wordprocessingShape" mc:Ignorable="w14 w15 w16se w16cid w16 w16cex w16sdtdh w16sdtfl w16du wp14">
   <w:body>
     <w:p>
       <w:pPr>
@@ -190,7 +190,7 @@
           <w:sz w:val="24"/>
           <w:szCs w:val="24"/>
         </w:rPr>
-        <w:t>9 de septiembre de 2025</w:t>
+        <w:t>4 de noviembre de 2025</w:t>
       </w:r>
       <w:r>
         <w:rPr>
@@ -233,27 +233,24 @@
           <w:sz w:val="24"/>
           <w:szCs w:val="24"/>
         </w:rPr>
-        <w:t xml:space="preserve">Por medio de la presente se deja constancia de que nombre, con RUC N.º ruc, ha realizado satisfactoriamente el </w:t>
-      </w:r>
-      <w:proofErr w:type="spellStart"/>
-      <w:r>
-        <w:rPr>
-          <w:rFonts w:ascii="Garamond" w:hAnsi="Garamond"/>
-          <w:sz w:val="24"/>
-          <w:szCs w:val="24"/>
-        </w:rPr>
-        <w:t>descripcion_cursos</w:t>
-      </w:r>
-      <w:proofErr w:type="spellEnd"/>
-      <w:r>
-        <w:rPr>
-          <w:rFonts w:ascii="Garamond" w:hAnsi="Garamond"/>
-          <w:sz w:val="24"/>
-          <w:szCs w:val="24"/>
-        </w:rPr>
-        <w:t xml:space="preserve"> en el Centro de Idiomas de la FLCH, bajo la modalidad </w:t>
-      </w:r>
-      <w:proofErr w:type="spellStart"/>
+        <w:t>Por medio de la presente se deja constancia de que nombre</w:t>
+      </w:r>
+      <w:r>
+        <w:rPr>
+          <w:rFonts w:ascii="Garamond" w:hAnsi="Garamond"/>
+          <w:sz w:val="24"/>
+          <w:szCs w:val="24"/>
+        </w:rPr>
+        <w:t>_docente</w:t>
+      </w:r>
+      <w:r>
+        <w:rPr>
+          <w:rFonts w:ascii="Garamond" w:hAnsi="Garamond"/>
+          <w:sz w:val="24"/>
+          <w:szCs w:val="24"/>
+        </w:rPr>
+        <w:t xml:space="preserve">, con RUC N.º ruc, ha realizado satisfactoriamente el descripcion_cursos en el Centro de Idiomas de la FLCH, bajo la modalidad </w:t>
+      </w:r>
       <w:r>
         <w:rPr>
           <w:rFonts w:ascii="Garamond" w:hAnsi="Garamond"/>
@@ -262,95 +259,38 @@
         </w:rPr>
         <w:t>modalidad_servicio</w:t>
       </w:r>
-      <w:proofErr w:type="spellEnd"/>
-      <w:r>
-        <w:rPr>
-          <w:rFonts w:ascii="Garamond" w:hAnsi="Garamond"/>
-          <w:sz w:val="24"/>
-          <w:szCs w:val="24"/>
-        </w:rPr>
-        <w:t xml:space="preserve">, según orden de servicio N.º ________, y en cumplimiento de la </w:t>
-      </w:r>
-      <w:proofErr w:type="spellStart"/>
-      <w:r>
-        <w:rPr>
-          <w:rFonts w:ascii="Garamond" w:hAnsi="Garamond"/>
-          <w:sz w:val="24"/>
-          <w:szCs w:val="24"/>
-        </w:rPr>
-        <w:t>numero_armada</w:t>
-      </w:r>
-      <w:proofErr w:type="spellEnd"/>
-      <w:r>
-        <w:rPr>
-          <w:rFonts w:ascii="Garamond" w:hAnsi="Garamond"/>
-          <w:sz w:val="24"/>
-          <w:szCs w:val="24"/>
-        </w:rPr>
-        <w:t xml:space="preserve"> armada del contrato de locación de servicios N.º </w:t>
-      </w:r>
-      <w:proofErr w:type="spellStart"/>
-      <w:r>
-        <w:rPr>
-          <w:rFonts w:ascii="Garamond" w:hAnsi="Garamond"/>
-          <w:sz w:val="24"/>
-          <w:szCs w:val="24"/>
-        </w:rPr>
-        <w:t>Nro</w:t>
-      </w:r>
-      <w:r>
-        <w:rPr>
-          <w:rFonts w:ascii="Garamond" w:hAnsi="Garamond"/>
-          <w:sz w:val="24"/>
-          <w:szCs w:val="24"/>
-        </w:rPr>
-        <w:t>_Contrato</w:t>
-      </w:r>
-      <w:proofErr w:type="spellEnd"/>
-      <w:r>
-        <w:rPr>
-          <w:rFonts w:ascii="Garamond" w:hAnsi="Garamond"/>
-          <w:sz w:val="24"/>
-          <w:szCs w:val="24"/>
-        </w:rPr>
-        <w:t>/UNMSM</w:t>
-      </w:r>
-      <w:r>
-        <w:rPr>
-          <w:rFonts w:ascii="Garamond" w:hAnsi="Garamond"/>
-          <w:sz w:val="24"/>
-          <w:szCs w:val="24"/>
-        </w:rPr>
-        <w:t xml:space="preserve">-FLCH/2025 por el importe de </w:t>
-      </w:r>
-      <w:proofErr w:type="spellStart"/>
-      <w:r>
-        <w:rPr>
-          <w:rFonts w:ascii="Garamond" w:hAnsi="Garamond"/>
-          <w:sz w:val="24"/>
-          <w:szCs w:val="24"/>
-        </w:rPr>
-        <w:t>monto_subtotal</w:t>
-      </w:r>
-      <w:proofErr w:type="spellEnd"/>
-      <w:r>
-        <w:rPr>
-          <w:rFonts w:ascii="Garamond" w:hAnsi="Garamond"/>
-          <w:sz w:val="24"/>
-          <w:szCs w:val="24"/>
-        </w:rPr>
-        <w:t xml:space="preserve">, monto por hora: </w:t>
-      </w:r>
-      <w:proofErr w:type="spellStart"/>
-      <w:r>
-        <w:rPr>
-          <w:rFonts w:ascii="Garamond" w:hAnsi="Garamond"/>
-          <w:sz w:val="24"/>
-          <w:szCs w:val="24"/>
-        </w:rPr>
-        <w:t>monto_hora</w:t>
-      </w:r>
-      <w:proofErr w:type="spellEnd"/>
+      <w:r>
+        <w:rPr>
+          <w:rFonts w:ascii="Garamond" w:hAnsi="Garamond"/>
+          <w:sz w:val="24"/>
+          <w:szCs w:val="24"/>
+        </w:rPr>
+        <w:t>, según orden de servicio N.º ________, y en cumplimiento de la numero_armada armada del contrato de locación de servicios N.º Nro</w:t>
+      </w:r>
+      <w:r>
+        <w:rPr>
+          <w:rFonts w:ascii="Garamond" w:hAnsi="Garamond"/>
+          <w:sz w:val="24"/>
+          <w:szCs w:val="24"/>
+        </w:rPr>
+        <w:t>_Contrato/UNMSM</w:t>
+      </w:r>
+      <w:r>
+        <w:rPr>
+          <w:rFonts w:ascii="Garamond" w:hAnsi="Garamond"/>
+          <w:sz w:val="24"/>
+          <w:szCs w:val="24"/>
+        </w:rPr>
+        <w:t>-FLCH/2025 por el importe de monto_subtotal</w:t>
+      </w:r>
+      <w:r>
+        <w:rPr>
+          <w:rFonts w:ascii="Garamond" w:hAnsi="Garamond"/>
+          <w:sz w:val="24"/>
+          <w:szCs w:val="24"/>
+        </w:rPr>
+        <w:t>, monto por hora: monto_hora</w:t>
+      </w:r>
       <w:r>
         <w:rPr>
           <w:rFonts w:ascii="Garamond" w:hAnsi="Garamond"/>
@@ -487,54 +427,8 @@
           <w:b/>
           <w:sz w:val="24"/>
         </w:rPr>
-        <w:t xml:space="preserve">Dr. Guillaume </w:t>
-      </w:r>
-      <w:proofErr w:type="spellStart"/>
-      <w:r>
-        <w:rPr>
-          <w:rFonts w:ascii="Garamond" w:hAnsi="Garamond"/>
-          <w:b/>
-          <w:sz w:val="24"/>
-        </w:rPr>
-        <w:t>Yannick</w:t>
-      </w:r>
-      <w:proofErr w:type="spellEnd"/>
-      <w:r>
-        <w:rPr>
-          <w:rFonts w:ascii="Garamond" w:hAnsi="Garamond"/>
-          <w:b/>
-          <w:sz w:val="24"/>
-        </w:rPr>
-        <w:t xml:space="preserve"> </w:t>
-      </w:r>
-      <w:proofErr w:type="spellStart"/>
-      <w:r>
-        <w:rPr>
-          <w:rFonts w:ascii="Garamond" w:hAnsi="Garamond"/>
-          <w:b/>
-          <w:sz w:val="24"/>
-        </w:rPr>
-        <w:t>Serge</w:t>
-      </w:r>
-      <w:proofErr w:type="spellEnd"/>
-      <w:r>
-        <w:rPr>
-          <w:rFonts w:ascii="Garamond" w:hAnsi="Garamond"/>
-          <w:b/>
-          <w:sz w:val="24"/>
-        </w:rPr>
-        <w:t xml:space="preserve"> </w:t>
-      </w:r>
-      <w:proofErr w:type="spellStart"/>
-      <w:r>
-        <w:rPr>
-          <w:rFonts w:ascii="Garamond" w:hAnsi="Garamond"/>
-          <w:b/>
-          <w:sz w:val="24"/>
-        </w:rPr>
-        <w:t>Oisel</w:t>
-      </w:r>
-      <w:proofErr w:type="spellEnd"/>
+        <w:t>nombre_director</w:t>
+      </w:r>
     </w:p>
     <w:p>
       <w:pPr>
@@ -551,7 +445,7 @@
           <w:rFonts w:ascii="Garamond" w:hAnsi="Garamond"/>
           <w:sz w:val="24"/>
         </w:rPr>
-        <w:t>Director de la Dirección Académica</w:t>
+        <w:t>cargo_director</w:t>
       </w:r>
     </w:p>
     <w:p>
@@ -582,8 +476,6 @@
           <w:szCs w:val="24"/>
         </w:rPr>
       </w:pPr>
-      <w:bookmarkStart w:id="0" w:name="_GoBack"/>
-      <w:bookmarkEnd w:id="0"/>
     </w:p>
     <w:p>
       <w:pPr>
@@ -631,7 +523,7 @@
 </file>
 
 <file path=word/endnotes.xml><?xml version="1.0" encoding="utf-8"?>
-<w:endnotes xmlns:wpc="http://schemas.microsoft.com/office/word/2010/wordprocessingCanvas" xmlns:cx="http://schemas.microsoft.com/office/drawing/2014/chartex" xmlns:mc="http://schemas.openxmlformats.org/markup-compatibility/2006" xmlns:o="urn:schemas-microsoft-com:office:office" xmlns:r="http://schemas.openxmlformats.org/officeDocument/2006/relationships" xmlns:m="http://schemas.openxmlformats.org/officeDocument/2006/math" xmlns:v="urn:schemas-microsoft-com:vml" xmlns:wp14="http://schemas.microsoft.com/office/word/2010/wordprocessingDrawing" xmlns:wp="http://schemas.openxmlformats.org/drawingml/2006/wordprocessingDrawing" xmlns:w10="urn:schemas-microsoft-com:office:word" xmlns:w="http://schemas.openxmlformats.org/wordprocessingml/2006/main" xmlns:w14="http://schemas.microsoft.com/office/word/2010/wordml" xmlns:w15="http://schemas.microsoft.com/office/word/2012/wordml" xmlns:w16se="http://schemas.microsoft.com/office/word/2015/wordml/symex" xmlns:wpg="http://schemas.microsoft.com/office/word/2010/wordprocessingGroup" xmlns:wpi="http://schemas.microsoft.com/office/word/2010/wordprocessingInk" xmlns:wne="http://schemas.microsoft.com/office/word/2006/wordml" xmlns:wps="http://schemas.microsoft.com/office/word/2010/wordprocessingShape" mc:Ignorable="w14 w15 w16se wp14">
+<w:endnotes xmlns:wpc="http://schemas.microsoft.com/office/word/2010/wordprocessingCanvas" xmlns:cx="http://schemas.microsoft.com/office/drawing/2014/chartex" xmlns:cx1="http://schemas.microsoft.com/office/drawing/2015/9/8/chartex" xmlns:cx2="http://schemas.microsoft.com/office/drawing/2015/10/21/chartex" xmlns:cx3="http://schemas.microsoft.com/office/drawing/2016/5/9/chartex" xmlns:cx4="http://schemas.microsoft.com/office/drawing/2016/5/10/chartex" xmlns:cx5="http://schemas.microsoft.com/office/drawing/2016/5/11/chartex" xmlns:cx6="http://schemas.microsoft.com/office/drawing/2016/5/12/chartex" xmlns:cx7="http://schemas.microsoft.com/office/drawing/2016/5/13/chartex" xmlns:cx8="http://schemas.microsoft.com/office/drawing/2016/5/14/chartex" xmlns:mc="http://schemas.openxmlformats.org/markup-compatibility/2006" xmlns:aink="http://schemas.microsoft.com/office/drawing/2016/ink" xmlns:am3d="http://schemas.microsoft.com/office/drawing/2017/model3d" xmlns:o="urn:schemas-microsoft-com:office:office" xmlns:oel="http://schemas.microsoft.com/office/2019/extlst" xmlns:r="http://schemas.openxmlformats.org/officeDocument/2006/relationships" xmlns:m="http://schemas.openxmlformats.org/officeDocument/2006/math" xmlns:v="urn:schemas-microsoft-com:vml" xmlns:wp14="http://schemas.microsoft.com/office/word/2010/wordprocessingDrawing" xmlns:wp="http://schemas.openxmlformats.org/drawingml/2006/wordprocessingDrawing" xmlns:w10="urn:schemas-microsoft-com:office:word" xmlns:w="http://schemas.openxmlformats.org/wordprocessingml/2006/main" xmlns:w14="http://schemas.microsoft.com/office/word/2010/wordml" xmlns:w15="http://schemas.microsoft.com/office/word/2012/wordml" xmlns:w16cex="http://schemas.microsoft.com/office/word/2018/wordml/cex" xmlns:w16cid="http://schemas.microsoft.com/office/word/2016/wordml/cid" xmlns:w16="http://schemas.microsoft.com/office/word/2018/wordml" xmlns:w16du="http://schemas.microsoft.com/office/word/2023/wordml/word16du" xmlns:w16sdtdh="http://schemas.microsoft.com/office/word/2020/wordml/sdtdatahash" xmlns:w16sdtfl="http://schemas.microsoft.com/office/word/2024/wordml/sdtformatlock" xmlns:w16se="http://schemas.microsoft.com/office/word/2015/wordml/symex" xmlns:wpg="http://schemas.microsoft.com/office/word/2010/wordprocessingGroup" xmlns:wpi="http://schemas.microsoft.com/office/word/2010/wordprocessingInk" xmlns:wne="http://schemas.microsoft.com/office/word/2006/wordml" xmlns:wps="http://schemas.microsoft.com/office/word/2010/wordprocessingShape" mc:Ignorable="w14 w15 w16se w16cid w16 w16cex w16sdtdh w16sdtfl w16du wp14">
   <w:endnote w:type="separator" w:id="-1">
     <w:p>
       <w:r>
@@ -650,7 +542,7 @@
 </file>
 
 <file path=word/footnotes.xml><?xml version="1.0" encoding="utf-8"?>
-<w:footnotes xmlns:wpc="http://schemas.microsoft.com/office/word/2010/wordprocessingCanvas" xmlns:cx="http://schemas.microsoft.com/office/drawing/2014/chartex" xmlns:mc="http://schemas.openxmlformats.org/markup-compatibility/2006" xmlns:o="urn:schemas-microsoft-com:office:office" xmlns:r="http://schemas.openxmlformats.org/officeDocument/2006/relationships" xmlns:m="http://schemas.openxmlformats.org/officeDocument/2006/math" xmlns:v="urn:schemas-microsoft-com:vml" xmlns:wp14="http://schemas.microsoft.com/office/word/2010/wordprocessingDrawing" xmlns:wp="http://schemas.openxmlformats.org/drawingml/2006/wordprocessingDrawing" xmlns:w10="urn:schemas-microsoft-com:office:word" xmlns:w="http://schemas.openxmlformats.org/wordprocessingml/2006/main" xmlns:w14="http://schemas.microsoft.com/office/word/2010/wordml" xmlns:w15="http://schemas.microsoft.com/office/word/2012/wordml" xmlns:w16se="http://schemas.microsoft.com/office/word/2015/wordml/symex" xmlns:wpg="http://schemas.microsoft.com/office/word/2010/wordprocessingGroup" xmlns:wpi="http://schemas.microsoft.com/office/word/2010/wordprocessingInk" xmlns:wne="http://schemas.microsoft.com/office/word/2006/wordml" xmlns:wps="http://schemas.microsoft.com/office/word/2010/wordprocessingShape" mc:Ignorable="w14 w15 w16se wp14">
+<w:footnotes xmlns:wpc="http://schemas.microsoft.com/office/word/2010/wordprocessingCanvas" xmlns:cx="http://schemas.microsoft.com/office/drawing/2014/chartex" xmlns:cx1="http://schemas.microsoft.com/office/drawing/2015/9/8/chartex" xmlns:cx2="http://schemas.microsoft.com/office/drawing/2015/10/21/chartex" xmlns:cx3="http://schemas.microsoft.com/office/drawing/2016/5/9/chartex" xmlns:cx4="http://schemas.microsoft.com/office/drawing/2016/5/10/chartex" xmlns:cx5="http://schemas.microsoft.com/office/drawing/2016/5/11/chartex" xmlns:cx6="http://schemas.microsoft.com/office/drawing/2016/5/12/chartex" xmlns:cx7="http://schemas.microsoft.com/office/drawing/2016/5/13/chartex" xmlns:cx8="http://schemas.microsoft.com/office/drawing/2016/5/14/chartex" xmlns:mc="http://schemas.openxmlformats.org/markup-compatibility/2006" xmlns:aink="http://schemas.microsoft.com/office/drawing/2016/ink" xmlns:am3d="http://schemas.microsoft.com/office/drawing/2017/model3d" xmlns:o="urn:schemas-microsoft-com:office:office" xmlns:oel="http://schemas.microsoft.com/office/2019/extlst" xmlns:r="http://schemas.openxmlformats.org/officeDocument/2006/relationships" xmlns:m="http://schemas.openxmlformats.org/officeDocument/2006/math" xmlns:v="urn:schemas-microsoft-com:vml" xmlns:wp14="http://schemas.microsoft.com/office/word/2010/wordprocessingDrawing" xmlns:wp="http://schemas.openxmlformats.org/drawingml/2006/wordprocessingDrawing" xmlns:w10="urn:schemas-microsoft-com:office:word" xmlns:w="http://schemas.openxmlformats.org/wordprocessingml/2006/main" xmlns:w14="http://schemas.microsoft.com/office/word/2010/wordml" xmlns:w15="http://schemas.microsoft.com/office/word/2012/wordml" xmlns:w16cex="http://schemas.microsoft.com/office/word/2018/wordml/cex" xmlns:w16cid="http://schemas.microsoft.com/office/word/2016/wordml/cid" xmlns:w16="http://schemas.microsoft.com/office/word/2018/wordml" xmlns:w16du="http://schemas.microsoft.com/office/word/2023/wordml/word16du" xmlns:w16sdtdh="http://schemas.microsoft.com/office/word/2020/wordml/sdtdatahash" xmlns:w16sdtfl="http://schemas.microsoft.com/office/word/2024/wordml/sdtformatlock" xmlns:w16se="http://schemas.microsoft.com/office/word/2015/wordml/symex" xmlns:wpg="http://schemas.microsoft.com/office/word/2010/wordprocessingGroup" xmlns:wpi="http://schemas.microsoft.com/office/word/2010/wordprocessingInk" xmlns:wne="http://schemas.microsoft.com/office/word/2006/wordml" xmlns:wps="http://schemas.microsoft.com/office/word/2010/wordprocessingShape" mc:Ignorable="w14 w15 w16se w16cid w16 w16cex w16sdtdh w16sdtfl w16du wp14">
   <w:footnote w:type="separator" w:id="-1">
     <w:p>
       <w:r>
@@ -669,7 +561,7 @@
 </file>
 
 <file path=word/header1.xml><?xml version="1.0" encoding="utf-8"?>
-<w:hdr xmlns:wpc="http://schemas.microsoft.com/office/word/2010/wordprocessingCanvas" xmlns:cx="http://schemas.microsoft.com/office/drawing/2014/chartex" xmlns:mc="http://schemas.openxmlformats.org/markup-compatibility/2006" xmlns:o="urn:schemas-microsoft-com:office:office" xmlns:r="http://schemas.openxmlformats.org/officeDocument/2006/relationships" xmlns:m="http://schemas.openxmlformats.org/officeDocument/2006/math" xmlns:v="urn:schemas-microsoft-com:vml" xmlns:wp14="http://schemas.microsoft.com/office/word/2010/wordprocessingDrawing" xmlns:wp="http://schemas.openxmlformats.org/drawingml/2006/wordprocessingDrawing" xmlns:w10="urn:schemas-microsoft-com:office:word" xmlns:w="http://schemas.openxmlformats.org/wordprocessingml/2006/main" xmlns:w14="http://schemas.microsoft.com/office/word/2010/wordml" xmlns:w15="http://schemas.microsoft.com/office/word/2012/wordml" xmlns:w16se="http://schemas.microsoft.com/office/word/2015/wordml/symex" xmlns:wpg="http://schemas.microsoft.com/office/word/2010/wordprocessingGroup" xmlns:wpi="http://schemas.microsoft.com/office/word/2010/wordprocessingInk" xmlns:wne="http://schemas.microsoft.com/office/word/2006/wordml" xmlns:wps="http://schemas.microsoft.com/office/word/2010/wordprocessingShape" mc:Ignorable="w14 w15 w16se wp14">
+<w:hdr xmlns:wpc="http://schemas.microsoft.com/office/word/2010/wordprocessingCanvas" xmlns:cx="http://schemas.microsoft.com/office/drawing/2014/chartex" xmlns:cx1="http://schemas.microsoft.com/office/drawing/2015/9/8/chartex" xmlns:cx2="http://schemas.microsoft.com/office/drawing/2015/10/21/chartex" xmlns:cx3="http://schemas.microsoft.com/office/drawing/2016/5/9/chartex" xmlns:cx4="http://schemas.microsoft.com/office/drawing/2016/5/10/chartex" xmlns:cx5="http://schemas.microsoft.com/office/drawing/2016/5/11/chartex" xmlns:cx6="http://schemas.microsoft.com/office/drawing/2016/5/12/chartex" xmlns:cx7="http://schemas.microsoft.com/office/drawing/2016/5/13/chartex" xmlns:cx8="http://schemas.microsoft.com/office/drawing/2016/5/14/chartex" xmlns:mc="http://schemas.openxmlformats.org/markup-compatibility/2006" xmlns:aink="http://schemas.microsoft.com/office/drawing/2016/ink" xmlns:am3d="http://schemas.microsoft.com/office/drawing/2017/model3d" xmlns:o="urn:schemas-microsoft-com:office:office" xmlns:oel="http://schemas.microsoft.com/office/2019/extlst" xmlns:r="http://schemas.openxmlformats.org/officeDocument/2006/relationships" xmlns:m="http://schemas.openxmlformats.org/officeDocument/2006/math" xmlns:v="urn:schemas-microsoft-com:vml" xmlns:wp14="http://schemas.microsoft.com/office/word/2010/wordprocessingDrawing" xmlns:wp="http://schemas.openxmlformats.org/drawingml/2006/wordprocessingDrawing" xmlns:w10="urn:schemas-microsoft-com:office:word" xmlns:w="http://schemas.openxmlformats.org/wordprocessingml/2006/main" xmlns:w14="http://schemas.microsoft.com/office/word/2010/wordml" xmlns:w15="http://schemas.microsoft.com/office/word/2012/wordml" xmlns:w16cex="http://schemas.microsoft.com/office/word/2018/wordml/cex" xmlns:w16cid="http://schemas.microsoft.com/office/word/2016/wordml/cid" xmlns:w16="http://schemas.microsoft.com/office/word/2018/wordml" xmlns:w16du="http://schemas.microsoft.com/office/word/2023/wordml/word16du" xmlns:w16sdtdh="http://schemas.microsoft.com/office/word/2020/wordml/sdtdatahash" xmlns:w16sdtfl="http://schemas.microsoft.com/office/word/2024/wordml/sdtformatlock" xmlns:w16se="http://schemas.microsoft.com/office/word/2015/wordml/symex" xmlns:wpg="http://schemas.microsoft.com/office/word/2010/wordprocessingGroup" xmlns:wpi="http://schemas.microsoft.com/office/word/2010/wordprocessingInk" xmlns:wne="http://schemas.microsoft.com/office/word/2006/wordml" xmlns:wps="http://schemas.microsoft.com/office/word/2010/wordprocessingShape" mc:Ignorable="w14 w15 w16se w16cid w16 w16cex w16sdtdh w16sdtfl w16du wp14">
   <w:p>
     <w:pPr>
       <w:pStyle w:val="Encabezado"/>
@@ -746,7 +638,7 @@
 </file>
 
 <file path=word/styles.xml><?xml version="1.0" encoding="utf-8"?>
-<w:styles xmlns:mc="http://schemas.openxmlformats.org/markup-compatibility/2006" xmlns:r="http://schemas.openxmlformats.org/officeDocument/2006/relationships" xmlns:w="http://schemas.openxmlformats.org/wordprocessingml/2006/main" xmlns:w14="http://schemas.microsoft.com/office/word/2010/wordml" xmlns:w15="http://schemas.microsoft.com/office/word/2012/wordml" xmlns:w16se="http://schemas.microsoft.com/office/word/2015/wordml/symex" mc:Ignorable="w14 w15 w16se">
+<w:styles xmlns:mc="http://schemas.openxmlformats.org/markup-compatibility/2006" xmlns:r="http://schemas.openxmlformats.org/officeDocument/2006/relationships" xmlns:w="http://schemas.openxmlformats.org/wordprocessingml/2006/main" xmlns:w14="http://schemas.microsoft.com/office/word/2010/wordml" xmlns:w15="http://schemas.microsoft.com/office/word/2012/wordml" xmlns:w16cex="http://schemas.microsoft.com/office/word/2018/wordml/cex" xmlns:w16cid="http://schemas.microsoft.com/office/word/2016/wordml/cid" xmlns:w16="http://schemas.microsoft.com/office/word/2018/wordml" xmlns:w16du="http://schemas.microsoft.com/office/word/2023/wordml/word16du" xmlns:w16sdtdh="http://schemas.microsoft.com/office/word/2020/wordml/sdtdatahash" xmlns:w16sdtfl="http://schemas.microsoft.com/office/word/2024/wordml/sdtformatlock" xmlns:w16se="http://schemas.microsoft.com/office/word/2015/wordml/symex" mc:Ignorable="w14 w15 w16se w16cid w16 w16cex w16sdtdh w16sdtfl w16du">
   <w:docDefaults>
     <w:rPrDefault>
       <w:rPr>
@@ -764,7 +656,7 @@
       </w:pPr>
     </w:pPrDefault>
   </w:docDefaults>
-  <w:latentStyles w:defLockedState="0" w:defUIPriority="99" w:defSemiHidden="0" w:defUnhideWhenUsed="0" w:defQFormat="0" w:count="371">
+  <w:latentStyles w:defLockedState="0" w:defUIPriority="99" w:defSemiHidden="0" w:defUnhideWhenUsed="0" w:defQFormat="0" w:count="376">
     <w:lsdException w:name="Normal" w:uiPriority="0" w:qFormat="1"/>
     <w:lsdException w:name="heading 1" w:uiPriority="9" w:qFormat="1"/>
     <w:lsdException w:name="heading 2" w:semiHidden="1" w:uiPriority="9" w:unhideWhenUsed="1" w:qFormat="1"/>
@@ -1136,6 +1028,11 @@
     <w:lsdException w:name="List Table 5 Dark Accent 6" w:uiPriority="50"/>
     <w:lsdException w:name="List Table 6 Colorful Accent 6" w:uiPriority="51"/>
     <w:lsdException w:name="List Table 7 Colorful Accent 6" w:uiPriority="52"/>
+    <w:lsdException w:name="Mention" w:semiHidden="1" w:unhideWhenUsed="1"/>
+    <w:lsdException w:name="Smart Hyperlink" w:semiHidden="1" w:unhideWhenUsed="1"/>
+    <w:lsdException w:name="Hashtag" w:semiHidden="1" w:unhideWhenUsed="1"/>
+    <w:lsdException w:name="Unresolved Mention" w:semiHidden="1" w:unhideWhenUsed="1"/>
+    <w:lsdException w:name="Smart Link" w:semiHidden="1" w:unhideWhenUsed="1"/>
   </w:latentStyles>
   <w:style w:type="paragraph" w:default="1" w:styleId="Normal">
     <w:name w:val="Normal"/>

</xml_diff>

<commit_message>
Actualización de firmas en documentos
</commit_message>
<xml_diff>
--- a/Modelos_documentos/conformidad_contrato.docx
+++ b/Modelos_documentos/conformidad_contrato.docx
@@ -1,6 +1,6 @@
 
 <file path=word/document.xml><?xml version="1.0" encoding="utf-8"?>
-<w:document xmlns:wpc="http://schemas.microsoft.com/office/word/2010/wordprocessingCanvas" xmlns:cx="http://schemas.microsoft.com/office/drawing/2014/chartex" xmlns:cx1="http://schemas.microsoft.com/office/drawing/2015/9/8/chartex" xmlns:cx2="http://schemas.microsoft.com/office/drawing/2015/10/21/chartex" xmlns:cx3="http://schemas.microsoft.com/office/drawing/2016/5/9/chartex" xmlns:cx4="http://schemas.microsoft.com/office/drawing/2016/5/10/chartex" xmlns:cx5="http://schemas.microsoft.com/office/drawing/2016/5/11/chartex" xmlns:cx6="http://schemas.microsoft.com/office/drawing/2016/5/12/chartex" xmlns:cx7="http://schemas.microsoft.com/office/drawing/2016/5/13/chartex" xmlns:cx8="http://schemas.microsoft.com/office/drawing/2016/5/14/chartex" xmlns:mc="http://schemas.openxmlformats.org/markup-compatibility/2006" xmlns:aink="http://schemas.microsoft.com/office/drawing/2016/ink" xmlns:am3d="http://schemas.microsoft.com/office/drawing/2017/model3d" xmlns:o="urn:schemas-microsoft-com:office:office" xmlns:oel="http://schemas.microsoft.com/office/2019/extlst" xmlns:r="http://schemas.openxmlformats.org/officeDocument/2006/relationships" xmlns:m="http://schemas.openxmlformats.org/officeDocument/2006/math" xmlns:v="urn:schemas-microsoft-com:vml" xmlns:wp14="http://schemas.microsoft.com/office/word/2010/wordprocessingDrawing" xmlns:wp="http://schemas.openxmlformats.org/drawingml/2006/wordprocessingDrawing" xmlns:w10="urn:schemas-microsoft-com:office:word" xmlns:w="http://schemas.openxmlformats.org/wordprocessingml/2006/main" xmlns:w14="http://schemas.microsoft.com/office/word/2010/wordml" xmlns:w15="http://schemas.microsoft.com/office/word/2012/wordml" xmlns:w16cex="http://schemas.microsoft.com/office/word/2018/wordml/cex" xmlns:w16cid="http://schemas.microsoft.com/office/word/2016/wordml/cid" xmlns:w16="http://schemas.microsoft.com/office/word/2018/wordml" xmlns:w16du="http://schemas.microsoft.com/office/word/2023/wordml/word16du" xmlns:w16sdtdh="http://schemas.microsoft.com/office/word/2020/wordml/sdtdatahash" xmlns:w16sdtfl="http://schemas.microsoft.com/office/word/2024/wordml/sdtformatlock" xmlns:w16se="http://schemas.microsoft.com/office/word/2015/wordml/symex" xmlns:wpg="http://schemas.microsoft.com/office/word/2010/wordprocessingGroup" xmlns:wpi="http://schemas.microsoft.com/office/word/2010/wordprocessingInk" xmlns:wne="http://schemas.microsoft.com/office/word/2006/wordml" xmlns:wps="http://schemas.microsoft.com/office/word/2010/wordprocessingShape" mc:Ignorable="w14 w15 w16se w16cid w16 w16cex w16sdtdh w16sdtfl w16du wp14">
+<w:document xmlns:wpc="http://schemas.microsoft.com/office/word/2010/wordprocessingCanvas" xmlns:cx="http://schemas.microsoft.com/office/drawing/2014/chartex" xmlns:mc="http://schemas.openxmlformats.org/markup-compatibility/2006" xmlns:o="urn:schemas-microsoft-com:office:office" xmlns:r="http://schemas.openxmlformats.org/officeDocument/2006/relationships" xmlns:m="http://schemas.openxmlformats.org/officeDocument/2006/math" xmlns:v="urn:schemas-microsoft-com:vml" xmlns:wp14="http://schemas.microsoft.com/office/word/2010/wordprocessingDrawing" xmlns:wp="http://schemas.openxmlformats.org/drawingml/2006/wordprocessingDrawing" xmlns:w10="urn:schemas-microsoft-com:office:word" xmlns:w="http://schemas.openxmlformats.org/wordprocessingml/2006/main" xmlns:w14="http://schemas.microsoft.com/office/word/2010/wordml" xmlns:w15="http://schemas.microsoft.com/office/word/2012/wordml" xmlns:w16se="http://schemas.microsoft.com/office/word/2015/wordml/symex" xmlns:wpg="http://schemas.microsoft.com/office/word/2010/wordprocessingGroup" xmlns:wpi="http://schemas.microsoft.com/office/word/2010/wordprocessingInk" xmlns:wne="http://schemas.microsoft.com/office/word/2006/wordml" xmlns:wps="http://schemas.microsoft.com/office/word/2010/wordprocessingShape" mc:Ignorable="w14 w15 w16se wp14">
   <w:body>
     <w:p>
       <w:pPr>
@@ -190,7 +190,7 @@
           <w:sz w:val="24"/>
           <w:szCs w:val="24"/>
         </w:rPr>
-        <w:t>4 de noviembre de 2025</w:t>
+        <w:t>13 de noviembre de 2025</w:t>
       </w:r>
       <w:r>
         <w:rPr>
@@ -233,7 +233,16 @@
           <w:sz w:val="24"/>
           <w:szCs w:val="24"/>
         </w:rPr>
-        <w:t>Por medio de la presente se deja constancia de que nombre</w:t>
+        <w:t xml:space="preserve">Por medio de la presente se deja constancia de que </w:t>
+      </w:r>
+      <w:proofErr w:type="spellStart"/>
+      <w:r>
+        <w:rPr>
+          <w:rFonts w:ascii="Garamond" w:hAnsi="Garamond"/>
+          <w:sz w:val="24"/>
+          <w:szCs w:val="24"/>
+        </w:rPr>
+        <w:t>nombre</w:t>
       </w:r>
       <w:r>
         <w:rPr>
@@ -243,14 +252,34 @@
         </w:rPr>
         <w:t>_docente</w:t>
       </w:r>
-      <w:r>
-        <w:rPr>
-          <w:rFonts w:ascii="Garamond" w:hAnsi="Garamond"/>
-          <w:sz w:val="24"/>
-          <w:szCs w:val="24"/>
-        </w:rPr>
-        <w:t xml:space="preserve">, con RUC N.º ruc, ha realizado satisfactoriamente el descripcion_cursos en el Centro de Idiomas de la FLCH, bajo la modalidad </w:t>
-      </w:r>
+      <w:proofErr w:type="spellEnd"/>
+      <w:r>
+        <w:rPr>
+          <w:rFonts w:ascii="Garamond" w:hAnsi="Garamond"/>
+          <w:sz w:val="24"/>
+          <w:szCs w:val="24"/>
+        </w:rPr>
+        <w:t xml:space="preserve">, con RUC N.º ruc, ha realizado satisfactoriamente el </w:t>
+      </w:r>
+      <w:proofErr w:type="spellStart"/>
+      <w:r>
+        <w:rPr>
+          <w:rFonts w:ascii="Garamond" w:hAnsi="Garamond"/>
+          <w:sz w:val="24"/>
+          <w:szCs w:val="24"/>
+        </w:rPr>
+        <w:t>descripcion_cursos</w:t>
+      </w:r>
+      <w:proofErr w:type="spellEnd"/>
+      <w:r>
+        <w:rPr>
+          <w:rFonts w:ascii="Garamond" w:hAnsi="Garamond"/>
+          <w:sz w:val="24"/>
+          <w:szCs w:val="24"/>
+        </w:rPr>
+        <w:t xml:space="preserve"> en el Centro de Idiomas de la FLCH, bajo la modalidad </w:t>
+      </w:r>
+      <w:proofErr w:type="spellStart"/>
       <w:r>
         <w:rPr>
           <w:rFonts w:ascii="Garamond" w:hAnsi="Garamond"/>
@@ -259,38 +288,95 @@
         </w:rPr>
         <w:t>modalidad_servicio</w:t>
       </w:r>
-      <w:r>
-        <w:rPr>
-          <w:rFonts w:ascii="Garamond" w:hAnsi="Garamond"/>
-          <w:sz w:val="24"/>
-          <w:szCs w:val="24"/>
-        </w:rPr>
-        <w:t>, según orden de servicio N.º ________, y en cumplimiento de la numero_armada armada del contrato de locación de servicios N.º Nro</w:t>
-      </w:r>
-      <w:r>
-        <w:rPr>
-          <w:rFonts w:ascii="Garamond" w:hAnsi="Garamond"/>
-          <w:sz w:val="24"/>
-          <w:szCs w:val="24"/>
-        </w:rPr>
-        <w:t>_Contrato/UNMSM</w:t>
-      </w:r>
-      <w:r>
-        <w:rPr>
-          <w:rFonts w:ascii="Garamond" w:hAnsi="Garamond"/>
-          <w:sz w:val="24"/>
-          <w:szCs w:val="24"/>
-        </w:rPr>
-        <w:t>-FLCH/2025 por el importe de monto_subtotal</w:t>
-      </w:r>
-      <w:r>
-        <w:rPr>
-          <w:rFonts w:ascii="Garamond" w:hAnsi="Garamond"/>
-          <w:sz w:val="24"/>
-          <w:szCs w:val="24"/>
-        </w:rPr>
-        <w:t>, monto por hora: monto_hora</w:t>
-      </w:r>
+      <w:proofErr w:type="spellEnd"/>
+      <w:r>
+        <w:rPr>
+          <w:rFonts w:ascii="Garamond" w:hAnsi="Garamond"/>
+          <w:sz w:val="24"/>
+          <w:szCs w:val="24"/>
+        </w:rPr>
+        <w:t xml:space="preserve">, según orden de servicio N.º ________, y en cumplimiento de la </w:t>
+      </w:r>
+      <w:proofErr w:type="spellStart"/>
+      <w:r>
+        <w:rPr>
+          <w:rFonts w:ascii="Garamond" w:hAnsi="Garamond"/>
+          <w:sz w:val="24"/>
+          <w:szCs w:val="24"/>
+        </w:rPr>
+        <w:t>numero_armada</w:t>
+      </w:r>
+      <w:proofErr w:type="spellEnd"/>
+      <w:r>
+        <w:rPr>
+          <w:rFonts w:ascii="Garamond" w:hAnsi="Garamond"/>
+          <w:sz w:val="24"/>
+          <w:szCs w:val="24"/>
+        </w:rPr>
+        <w:t xml:space="preserve"> armada del contrato de locación de servicios N.º </w:t>
+      </w:r>
+      <w:proofErr w:type="spellStart"/>
+      <w:r>
+        <w:rPr>
+          <w:rFonts w:ascii="Garamond" w:hAnsi="Garamond"/>
+          <w:sz w:val="24"/>
+          <w:szCs w:val="24"/>
+        </w:rPr>
+        <w:t>Nro</w:t>
+      </w:r>
+      <w:r>
+        <w:rPr>
+          <w:rFonts w:ascii="Garamond" w:hAnsi="Garamond"/>
+          <w:sz w:val="24"/>
+          <w:szCs w:val="24"/>
+        </w:rPr>
+        <w:t>_Contrato</w:t>
+      </w:r>
+      <w:proofErr w:type="spellEnd"/>
+      <w:r>
+        <w:rPr>
+          <w:rFonts w:ascii="Garamond" w:hAnsi="Garamond"/>
+          <w:sz w:val="24"/>
+          <w:szCs w:val="24"/>
+        </w:rPr>
+        <w:t>/UNMSM</w:t>
+      </w:r>
+      <w:r>
+        <w:rPr>
+          <w:rFonts w:ascii="Garamond" w:hAnsi="Garamond"/>
+          <w:sz w:val="24"/>
+          <w:szCs w:val="24"/>
+        </w:rPr>
+        <w:t xml:space="preserve">-FLCH/2025 por el importe de </w:t>
+      </w:r>
+      <w:proofErr w:type="spellStart"/>
+      <w:r>
+        <w:rPr>
+          <w:rFonts w:ascii="Garamond" w:hAnsi="Garamond"/>
+          <w:sz w:val="24"/>
+          <w:szCs w:val="24"/>
+        </w:rPr>
+        <w:t>monto_subtotal</w:t>
+      </w:r>
+      <w:proofErr w:type="spellEnd"/>
+      <w:r>
+        <w:rPr>
+          <w:rFonts w:ascii="Garamond" w:hAnsi="Garamond"/>
+          <w:sz w:val="24"/>
+          <w:szCs w:val="24"/>
+        </w:rPr>
+        <w:t xml:space="preserve">, monto por hora: </w:t>
+      </w:r>
+      <w:proofErr w:type="spellStart"/>
+      <w:r>
+        <w:rPr>
+          <w:rFonts w:ascii="Garamond" w:hAnsi="Garamond"/>
+          <w:sz w:val="24"/>
+          <w:szCs w:val="24"/>
+        </w:rPr>
+        <w:t>monto_hora</w:t>
+      </w:r>
+      <w:proofErr w:type="spellEnd"/>
       <w:r>
         <w:rPr>
           <w:rFonts w:ascii="Garamond" w:hAnsi="Garamond"/>
@@ -399,6 +485,8 @@
           <w:szCs w:val="24"/>
         </w:rPr>
       </w:pPr>
+      <w:bookmarkStart w:id="0" w:name="_GoBack"/>
+      <w:bookmarkEnd w:id="0"/>
     </w:p>
     <w:p>
       <w:pPr>
@@ -427,8 +515,54 @@
           <w:b/>
           <w:sz w:val="24"/>
         </w:rPr>
-        <w:t>nombre_director</w:t>
-      </w:r>
+        <w:t xml:space="preserve">Dr. Guillaume </w:t>
+      </w:r>
+      <w:proofErr w:type="spellStart"/>
+      <w:r>
+        <w:rPr>
+          <w:rFonts w:ascii="Garamond" w:hAnsi="Garamond"/>
+          <w:b/>
+          <w:sz w:val="24"/>
+        </w:rPr>
+        <w:t>Yannick</w:t>
+      </w:r>
+      <w:proofErr w:type="spellEnd"/>
+      <w:r>
+        <w:rPr>
+          <w:rFonts w:ascii="Garamond" w:hAnsi="Garamond"/>
+          <w:b/>
+          <w:sz w:val="24"/>
+        </w:rPr>
+        <w:t xml:space="preserve"> </w:t>
+      </w:r>
+      <w:proofErr w:type="spellStart"/>
+      <w:r>
+        <w:rPr>
+          <w:rFonts w:ascii="Garamond" w:hAnsi="Garamond"/>
+          <w:b/>
+          <w:sz w:val="24"/>
+        </w:rPr>
+        <w:t>Serge</w:t>
+      </w:r>
+      <w:proofErr w:type="spellEnd"/>
+      <w:r>
+        <w:rPr>
+          <w:rFonts w:ascii="Garamond" w:hAnsi="Garamond"/>
+          <w:b/>
+          <w:sz w:val="24"/>
+        </w:rPr>
+        <w:t xml:space="preserve"> </w:t>
+      </w:r>
+      <w:proofErr w:type="spellStart"/>
+      <w:r>
+        <w:rPr>
+          <w:rFonts w:ascii="Garamond" w:hAnsi="Garamond"/>
+          <w:b/>
+          <w:sz w:val="24"/>
+        </w:rPr>
+        <w:t>Oisel</w:t>
+      </w:r>
+      <w:proofErr w:type="spellEnd"/>
     </w:p>
     <w:p>
       <w:pPr>
@@ -445,7 +579,14 @@
           <w:rFonts w:ascii="Garamond" w:hAnsi="Garamond"/>
           <w:sz w:val="24"/>
         </w:rPr>
-        <w:t>cargo_director</w:t>
+        <w:t xml:space="preserve">Director de la Dirección </w:t>
+      </w:r>
+      <w:r>
+        <w:rPr>
+          <w:rFonts w:ascii="Garamond" w:hAnsi="Garamond"/>
+          <w:sz w:val="24"/>
+        </w:rPr>
+        <w:t>Ejecutiva</w:t>
       </w:r>
     </w:p>
     <w:p>
@@ -523,7 +664,7 @@
 </file>
 
 <file path=word/endnotes.xml><?xml version="1.0" encoding="utf-8"?>
-<w:endnotes xmlns:wpc="http://schemas.microsoft.com/office/word/2010/wordprocessingCanvas" xmlns:cx="http://schemas.microsoft.com/office/drawing/2014/chartex" xmlns:cx1="http://schemas.microsoft.com/office/drawing/2015/9/8/chartex" xmlns:cx2="http://schemas.microsoft.com/office/drawing/2015/10/21/chartex" xmlns:cx3="http://schemas.microsoft.com/office/drawing/2016/5/9/chartex" xmlns:cx4="http://schemas.microsoft.com/office/drawing/2016/5/10/chartex" xmlns:cx5="http://schemas.microsoft.com/office/drawing/2016/5/11/chartex" xmlns:cx6="http://schemas.microsoft.com/office/drawing/2016/5/12/chartex" xmlns:cx7="http://schemas.microsoft.com/office/drawing/2016/5/13/chartex" xmlns:cx8="http://schemas.microsoft.com/office/drawing/2016/5/14/chartex" xmlns:mc="http://schemas.openxmlformats.org/markup-compatibility/2006" xmlns:aink="http://schemas.microsoft.com/office/drawing/2016/ink" xmlns:am3d="http://schemas.microsoft.com/office/drawing/2017/model3d" xmlns:o="urn:schemas-microsoft-com:office:office" xmlns:oel="http://schemas.microsoft.com/office/2019/extlst" xmlns:r="http://schemas.openxmlformats.org/officeDocument/2006/relationships" xmlns:m="http://schemas.openxmlformats.org/officeDocument/2006/math" xmlns:v="urn:schemas-microsoft-com:vml" xmlns:wp14="http://schemas.microsoft.com/office/word/2010/wordprocessingDrawing" xmlns:wp="http://schemas.openxmlformats.org/drawingml/2006/wordprocessingDrawing" xmlns:w10="urn:schemas-microsoft-com:office:word" xmlns:w="http://schemas.openxmlformats.org/wordprocessingml/2006/main" xmlns:w14="http://schemas.microsoft.com/office/word/2010/wordml" xmlns:w15="http://schemas.microsoft.com/office/word/2012/wordml" xmlns:w16cex="http://schemas.microsoft.com/office/word/2018/wordml/cex" xmlns:w16cid="http://schemas.microsoft.com/office/word/2016/wordml/cid" xmlns:w16="http://schemas.microsoft.com/office/word/2018/wordml" xmlns:w16du="http://schemas.microsoft.com/office/word/2023/wordml/word16du" xmlns:w16sdtdh="http://schemas.microsoft.com/office/word/2020/wordml/sdtdatahash" xmlns:w16sdtfl="http://schemas.microsoft.com/office/word/2024/wordml/sdtformatlock" xmlns:w16se="http://schemas.microsoft.com/office/word/2015/wordml/symex" xmlns:wpg="http://schemas.microsoft.com/office/word/2010/wordprocessingGroup" xmlns:wpi="http://schemas.microsoft.com/office/word/2010/wordprocessingInk" xmlns:wne="http://schemas.microsoft.com/office/word/2006/wordml" xmlns:wps="http://schemas.microsoft.com/office/word/2010/wordprocessingShape" mc:Ignorable="w14 w15 w16se w16cid w16 w16cex w16sdtdh w16sdtfl w16du wp14">
+<w:endnotes xmlns:wpc="http://schemas.microsoft.com/office/word/2010/wordprocessingCanvas" xmlns:cx="http://schemas.microsoft.com/office/drawing/2014/chartex" xmlns:mc="http://schemas.openxmlformats.org/markup-compatibility/2006" xmlns:o="urn:schemas-microsoft-com:office:office" xmlns:r="http://schemas.openxmlformats.org/officeDocument/2006/relationships" xmlns:m="http://schemas.openxmlformats.org/officeDocument/2006/math" xmlns:v="urn:schemas-microsoft-com:vml" xmlns:wp14="http://schemas.microsoft.com/office/word/2010/wordprocessingDrawing" xmlns:wp="http://schemas.openxmlformats.org/drawingml/2006/wordprocessingDrawing" xmlns:w10="urn:schemas-microsoft-com:office:word" xmlns:w="http://schemas.openxmlformats.org/wordprocessingml/2006/main" xmlns:w14="http://schemas.microsoft.com/office/word/2010/wordml" xmlns:w15="http://schemas.microsoft.com/office/word/2012/wordml" xmlns:w16se="http://schemas.microsoft.com/office/word/2015/wordml/symex" xmlns:wpg="http://schemas.microsoft.com/office/word/2010/wordprocessingGroup" xmlns:wpi="http://schemas.microsoft.com/office/word/2010/wordprocessingInk" xmlns:wne="http://schemas.microsoft.com/office/word/2006/wordml" xmlns:wps="http://schemas.microsoft.com/office/word/2010/wordprocessingShape" mc:Ignorable="w14 w15 w16se wp14">
   <w:endnote w:type="separator" w:id="-1">
     <w:p>
       <w:r>
@@ -542,7 +683,7 @@
 </file>
 
 <file path=word/footnotes.xml><?xml version="1.0" encoding="utf-8"?>
-<w:footnotes xmlns:wpc="http://schemas.microsoft.com/office/word/2010/wordprocessingCanvas" xmlns:cx="http://schemas.microsoft.com/office/drawing/2014/chartex" xmlns:cx1="http://schemas.microsoft.com/office/drawing/2015/9/8/chartex" xmlns:cx2="http://schemas.microsoft.com/office/drawing/2015/10/21/chartex" xmlns:cx3="http://schemas.microsoft.com/office/drawing/2016/5/9/chartex" xmlns:cx4="http://schemas.microsoft.com/office/drawing/2016/5/10/chartex" xmlns:cx5="http://schemas.microsoft.com/office/drawing/2016/5/11/chartex" xmlns:cx6="http://schemas.microsoft.com/office/drawing/2016/5/12/chartex" xmlns:cx7="http://schemas.microsoft.com/office/drawing/2016/5/13/chartex" xmlns:cx8="http://schemas.microsoft.com/office/drawing/2016/5/14/chartex" xmlns:mc="http://schemas.openxmlformats.org/markup-compatibility/2006" xmlns:aink="http://schemas.microsoft.com/office/drawing/2016/ink" xmlns:am3d="http://schemas.microsoft.com/office/drawing/2017/model3d" xmlns:o="urn:schemas-microsoft-com:office:office" xmlns:oel="http://schemas.microsoft.com/office/2019/extlst" xmlns:r="http://schemas.openxmlformats.org/officeDocument/2006/relationships" xmlns:m="http://schemas.openxmlformats.org/officeDocument/2006/math" xmlns:v="urn:schemas-microsoft-com:vml" xmlns:wp14="http://schemas.microsoft.com/office/word/2010/wordprocessingDrawing" xmlns:wp="http://schemas.openxmlformats.org/drawingml/2006/wordprocessingDrawing" xmlns:w10="urn:schemas-microsoft-com:office:word" xmlns:w="http://schemas.openxmlformats.org/wordprocessingml/2006/main" xmlns:w14="http://schemas.microsoft.com/office/word/2010/wordml" xmlns:w15="http://schemas.microsoft.com/office/word/2012/wordml" xmlns:w16cex="http://schemas.microsoft.com/office/word/2018/wordml/cex" xmlns:w16cid="http://schemas.microsoft.com/office/word/2016/wordml/cid" xmlns:w16="http://schemas.microsoft.com/office/word/2018/wordml" xmlns:w16du="http://schemas.microsoft.com/office/word/2023/wordml/word16du" xmlns:w16sdtdh="http://schemas.microsoft.com/office/word/2020/wordml/sdtdatahash" xmlns:w16sdtfl="http://schemas.microsoft.com/office/word/2024/wordml/sdtformatlock" xmlns:w16se="http://schemas.microsoft.com/office/word/2015/wordml/symex" xmlns:wpg="http://schemas.microsoft.com/office/word/2010/wordprocessingGroup" xmlns:wpi="http://schemas.microsoft.com/office/word/2010/wordprocessingInk" xmlns:wne="http://schemas.microsoft.com/office/word/2006/wordml" xmlns:wps="http://schemas.microsoft.com/office/word/2010/wordprocessingShape" mc:Ignorable="w14 w15 w16se w16cid w16 w16cex w16sdtdh w16sdtfl w16du wp14">
+<w:footnotes xmlns:wpc="http://schemas.microsoft.com/office/word/2010/wordprocessingCanvas" xmlns:cx="http://schemas.microsoft.com/office/drawing/2014/chartex" xmlns:mc="http://schemas.openxmlformats.org/markup-compatibility/2006" xmlns:o="urn:schemas-microsoft-com:office:office" xmlns:r="http://schemas.openxmlformats.org/officeDocument/2006/relationships" xmlns:m="http://schemas.openxmlformats.org/officeDocument/2006/math" xmlns:v="urn:schemas-microsoft-com:vml" xmlns:wp14="http://schemas.microsoft.com/office/word/2010/wordprocessingDrawing" xmlns:wp="http://schemas.openxmlformats.org/drawingml/2006/wordprocessingDrawing" xmlns:w10="urn:schemas-microsoft-com:office:word" xmlns:w="http://schemas.openxmlformats.org/wordprocessingml/2006/main" xmlns:w14="http://schemas.microsoft.com/office/word/2010/wordml" xmlns:w15="http://schemas.microsoft.com/office/word/2012/wordml" xmlns:w16se="http://schemas.microsoft.com/office/word/2015/wordml/symex" xmlns:wpg="http://schemas.microsoft.com/office/word/2010/wordprocessingGroup" xmlns:wpi="http://schemas.microsoft.com/office/word/2010/wordprocessingInk" xmlns:wne="http://schemas.microsoft.com/office/word/2006/wordml" xmlns:wps="http://schemas.microsoft.com/office/word/2010/wordprocessingShape" mc:Ignorable="w14 w15 w16se wp14">
   <w:footnote w:type="separator" w:id="-1">
     <w:p>
       <w:r>
@@ -561,7 +702,7 @@
 </file>
 
 <file path=word/header1.xml><?xml version="1.0" encoding="utf-8"?>
-<w:hdr xmlns:wpc="http://schemas.microsoft.com/office/word/2010/wordprocessingCanvas" xmlns:cx="http://schemas.microsoft.com/office/drawing/2014/chartex" xmlns:cx1="http://schemas.microsoft.com/office/drawing/2015/9/8/chartex" xmlns:cx2="http://schemas.microsoft.com/office/drawing/2015/10/21/chartex" xmlns:cx3="http://schemas.microsoft.com/office/drawing/2016/5/9/chartex" xmlns:cx4="http://schemas.microsoft.com/office/drawing/2016/5/10/chartex" xmlns:cx5="http://schemas.microsoft.com/office/drawing/2016/5/11/chartex" xmlns:cx6="http://schemas.microsoft.com/office/drawing/2016/5/12/chartex" xmlns:cx7="http://schemas.microsoft.com/office/drawing/2016/5/13/chartex" xmlns:cx8="http://schemas.microsoft.com/office/drawing/2016/5/14/chartex" xmlns:mc="http://schemas.openxmlformats.org/markup-compatibility/2006" xmlns:aink="http://schemas.microsoft.com/office/drawing/2016/ink" xmlns:am3d="http://schemas.microsoft.com/office/drawing/2017/model3d" xmlns:o="urn:schemas-microsoft-com:office:office" xmlns:oel="http://schemas.microsoft.com/office/2019/extlst" xmlns:r="http://schemas.openxmlformats.org/officeDocument/2006/relationships" xmlns:m="http://schemas.openxmlformats.org/officeDocument/2006/math" xmlns:v="urn:schemas-microsoft-com:vml" xmlns:wp14="http://schemas.microsoft.com/office/word/2010/wordprocessingDrawing" xmlns:wp="http://schemas.openxmlformats.org/drawingml/2006/wordprocessingDrawing" xmlns:w10="urn:schemas-microsoft-com:office:word" xmlns:w="http://schemas.openxmlformats.org/wordprocessingml/2006/main" xmlns:w14="http://schemas.microsoft.com/office/word/2010/wordml" xmlns:w15="http://schemas.microsoft.com/office/word/2012/wordml" xmlns:w16cex="http://schemas.microsoft.com/office/word/2018/wordml/cex" xmlns:w16cid="http://schemas.microsoft.com/office/word/2016/wordml/cid" xmlns:w16="http://schemas.microsoft.com/office/word/2018/wordml" xmlns:w16du="http://schemas.microsoft.com/office/word/2023/wordml/word16du" xmlns:w16sdtdh="http://schemas.microsoft.com/office/word/2020/wordml/sdtdatahash" xmlns:w16sdtfl="http://schemas.microsoft.com/office/word/2024/wordml/sdtformatlock" xmlns:w16se="http://schemas.microsoft.com/office/word/2015/wordml/symex" xmlns:wpg="http://schemas.microsoft.com/office/word/2010/wordprocessingGroup" xmlns:wpi="http://schemas.microsoft.com/office/word/2010/wordprocessingInk" xmlns:wne="http://schemas.microsoft.com/office/word/2006/wordml" xmlns:wps="http://schemas.microsoft.com/office/word/2010/wordprocessingShape" mc:Ignorable="w14 w15 w16se w16cid w16 w16cex w16sdtdh w16sdtfl w16du wp14">
+<w:hdr xmlns:wpc="http://schemas.microsoft.com/office/word/2010/wordprocessingCanvas" xmlns:cx="http://schemas.microsoft.com/office/drawing/2014/chartex" xmlns:mc="http://schemas.openxmlformats.org/markup-compatibility/2006" xmlns:o="urn:schemas-microsoft-com:office:office" xmlns:r="http://schemas.openxmlformats.org/officeDocument/2006/relationships" xmlns:m="http://schemas.openxmlformats.org/officeDocument/2006/math" xmlns:v="urn:schemas-microsoft-com:vml" xmlns:wp14="http://schemas.microsoft.com/office/word/2010/wordprocessingDrawing" xmlns:wp="http://schemas.openxmlformats.org/drawingml/2006/wordprocessingDrawing" xmlns:w10="urn:schemas-microsoft-com:office:word" xmlns:w="http://schemas.openxmlformats.org/wordprocessingml/2006/main" xmlns:w14="http://schemas.microsoft.com/office/word/2010/wordml" xmlns:w15="http://schemas.microsoft.com/office/word/2012/wordml" xmlns:w16se="http://schemas.microsoft.com/office/word/2015/wordml/symex" xmlns:wpg="http://schemas.microsoft.com/office/word/2010/wordprocessingGroup" xmlns:wpi="http://schemas.microsoft.com/office/word/2010/wordprocessingInk" xmlns:wne="http://schemas.microsoft.com/office/word/2006/wordml" xmlns:wps="http://schemas.microsoft.com/office/word/2010/wordprocessingShape" mc:Ignorable="w14 w15 w16se wp14">
   <w:p>
     <w:pPr>
       <w:pStyle w:val="Encabezado"/>
@@ -638,7 +779,7 @@
 </file>
 
 <file path=word/styles.xml><?xml version="1.0" encoding="utf-8"?>
-<w:styles xmlns:mc="http://schemas.openxmlformats.org/markup-compatibility/2006" xmlns:r="http://schemas.openxmlformats.org/officeDocument/2006/relationships" xmlns:w="http://schemas.openxmlformats.org/wordprocessingml/2006/main" xmlns:w14="http://schemas.microsoft.com/office/word/2010/wordml" xmlns:w15="http://schemas.microsoft.com/office/word/2012/wordml" xmlns:w16cex="http://schemas.microsoft.com/office/word/2018/wordml/cex" xmlns:w16cid="http://schemas.microsoft.com/office/word/2016/wordml/cid" xmlns:w16="http://schemas.microsoft.com/office/word/2018/wordml" xmlns:w16du="http://schemas.microsoft.com/office/word/2023/wordml/word16du" xmlns:w16sdtdh="http://schemas.microsoft.com/office/word/2020/wordml/sdtdatahash" xmlns:w16sdtfl="http://schemas.microsoft.com/office/word/2024/wordml/sdtformatlock" xmlns:w16se="http://schemas.microsoft.com/office/word/2015/wordml/symex" mc:Ignorable="w14 w15 w16se w16cid w16 w16cex w16sdtdh w16sdtfl w16du">
+<w:styles xmlns:mc="http://schemas.openxmlformats.org/markup-compatibility/2006" xmlns:r="http://schemas.openxmlformats.org/officeDocument/2006/relationships" xmlns:w="http://schemas.openxmlformats.org/wordprocessingml/2006/main" xmlns:w14="http://schemas.microsoft.com/office/word/2010/wordml" xmlns:w15="http://schemas.microsoft.com/office/word/2012/wordml" xmlns:w16se="http://schemas.microsoft.com/office/word/2015/wordml/symex" mc:Ignorable="w14 w15 w16se">
   <w:docDefaults>
     <w:rPrDefault>
       <w:rPr>
@@ -656,7 +797,7 @@
       </w:pPr>
     </w:pPrDefault>
   </w:docDefaults>
-  <w:latentStyles w:defLockedState="0" w:defUIPriority="99" w:defSemiHidden="0" w:defUnhideWhenUsed="0" w:defQFormat="0" w:count="376">
+  <w:latentStyles w:defLockedState="0" w:defUIPriority="99" w:defSemiHidden="0" w:defUnhideWhenUsed="0" w:defQFormat="0" w:count="371">
     <w:lsdException w:name="Normal" w:uiPriority="0" w:qFormat="1"/>
     <w:lsdException w:name="heading 1" w:uiPriority="9" w:qFormat="1"/>
     <w:lsdException w:name="heading 2" w:semiHidden="1" w:uiPriority="9" w:unhideWhenUsed="1" w:qFormat="1"/>
@@ -1028,11 +1169,6 @@
     <w:lsdException w:name="List Table 5 Dark Accent 6" w:uiPriority="50"/>
     <w:lsdException w:name="List Table 6 Colorful Accent 6" w:uiPriority="51"/>
     <w:lsdException w:name="List Table 7 Colorful Accent 6" w:uiPriority="52"/>
-    <w:lsdException w:name="Mention" w:semiHidden="1" w:unhideWhenUsed="1"/>
-    <w:lsdException w:name="Smart Hyperlink" w:semiHidden="1" w:unhideWhenUsed="1"/>
-    <w:lsdException w:name="Hashtag" w:semiHidden="1" w:unhideWhenUsed="1"/>
-    <w:lsdException w:name="Unresolved Mention" w:semiHidden="1" w:unhideWhenUsed="1"/>
-    <w:lsdException w:name="Smart Link" w:semiHidden="1" w:unhideWhenUsed="1"/>
   </w:latentStyles>
   <w:style w:type="paragraph" w:default="1" w:styleId="Normal">
     <w:name w:val="Normal"/>

</xml_diff>

<commit_message>
Reestructuración original del proyecto
</commit_message>
<xml_diff>
--- a/Modelos_documentos/conformidad_contrato.docx
+++ b/Modelos_documentos/conformidad_contrato.docx
@@ -190,7 +190,7 @@
           <w:sz w:val="24"/>
           <w:szCs w:val="24"/>
         </w:rPr>
-        <w:t>9 de septiembre de 2025</w:t>
+        <w:t>13 de noviembre de 2025</w:t>
       </w:r>
       <w:r>
         <w:rPr>
@@ -233,7 +233,33 @@
           <w:sz w:val="24"/>
           <w:szCs w:val="24"/>
         </w:rPr>
-        <w:t xml:space="preserve">Por medio de la presente se deja constancia de que nombre, con RUC N.º ruc, ha realizado satisfactoriamente el </w:t>
+        <w:t xml:space="preserve">Por medio de la presente se deja constancia de que </w:t>
+      </w:r>
+      <w:proofErr w:type="spellStart"/>
+      <w:r>
+        <w:rPr>
+          <w:rFonts w:ascii="Garamond" w:hAnsi="Garamond"/>
+          <w:sz w:val="24"/>
+          <w:szCs w:val="24"/>
+        </w:rPr>
+        <w:t>nombre</w:t>
+      </w:r>
+      <w:r>
+        <w:rPr>
+          <w:rFonts w:ascii="Garamond" w:hAnsi="Garamond"/>
+          <w:sz w:val="24"/>
+          <w:szCs w:val="24"/>
+        </w:rPr>
+        <w:t>_docente</w:t>
+      </w:r>
+      <w:proofErr w:type="spellEnd"/>
+      <w:r>
+        <w:rPr>
+          <w:rFonts w:ascii="Garamond" w:hAnsi="Garamond"/>
+          <w:sz w:val="24"/>
+          <w:szCs w:val="24"/>
+        </w:rPr>
+        <w:t xml:space="preserve">, con RUC N.º ruc, ha realizado satisfactoriamente el </w:t>
       </w:r>
       <w:proofErr w:type="spellStart"/>
       <w:r>
@@ -459,6 +485,8 @@
           <w:szCs w:val="24"/>
         </w:rPr>
       </w:pPr>
+      <w:bookmarkStart w:id="0" w:name="_GoBack"/>
+      <w:bookmarkEnd w:id="0"/>
     </w:p>
     <w:p>
       <w:pPr>
@@ -551,7 +579,14 @@
           <w:rFonts w:ascii="Garamond" w:hAnsi="Garamond"/>
           <w:sz w:val="24"/>
         </w:rPr>
-        <w:t>Director de la Dirección Académica</w:t>
+        <w:t xml:space="preserve">Director de la Dirección </w:t>
+      </w:r>
+      <w:r>
+        <w:rPr>
+          <w:rFonts w:ascii="Garamond" w:hAnsi="Garamond"/>
+          <w:sz w:val="24"/>
+        </w:rPr>
+        <w:t>Ejecutiva</w:t>
       </w:r>
     </w:p>
     <w:p>
@@ -582,8 +617,6 @@
           <w:szCs w:val="24"/>
         </w:rPr>
       </w:pPr>
-      <w:bookmarkStart w:id="0" w:name="_GoBack"/>
-      <w:bookmarkEnd w:id="0"/>
     </w:p>
     <w:p>
       <w:pPr>

</xml_diff>

<commit_message>
Cambios en modelos de documentos de rol de director
</commit_message>
<xml_diff>
--- a/Modelos_documentos/conformidad_contrato.docx
+++ b/Modelos_documentos/conformidad_contrato.docx
@@ -190,7 +190,7 @@
           <w:sz w:val="24"/>
           <w:szCs w:val="24"/>
         </w:rPr>
-        <w:t>13 de noviembre de 2025</w:t>
+        <w:t>6 de febrero de 2026</w:t>
       </w:r>
       <w:r>
         <w:rPr>
@@ -435,56 +435,6 @@
         </w:rPr>
         <w:t>Atentamente,</w:t>
       </w:r>
-    </w:p>
-    <w:p>
-      <w:pPr>
-        <w:pStyle w:val="Textoindependiente"/>
-        <w:rPr>
-          <w:rFonts w:ascii="Garamond" w:hAnsi="Garamond"/>
-          <w:sz w:val="24"/>
-          <w:szCs w:val="24"/>
-        </w:rPr>
-      </w:pPr>
-    </w:p>
-    <w:p>
-      <w:pPr>
-        <w:pStyle w:val="Textoindependiente"/>
-        <w:rPr>
-          <w:rFonts w:ascii="Garamond" w:hAnsi="Garamond"/>
-          <w:sz w:val="24"/>
-          <w:szCs w:val="24"/>
-        </w:rPr>
-      </w:pPr>
-    </w:p>
-    <w:p>
-      <w:pPr>
-        <w:pStyle w:val="Textoindependiente"/>
-        <w:rPr>
-          <w:rFonts w:ascii="Garamond" w:hAnsi="Garamond"/>
-          <w:sz w:val="24"/>
-          <w:szCs w:val="24"/>
-        </w:rPr>
-      </w:pPr>
-    </w:p>
-    <w:p>
-      <w:pPr>
-        <w:pStyle w:val="Textoindependiente"/>
-        <w:rPr>
-          <w:rFonts w:ascii="Garamond" w:hAnsi="Garamond"/>
-          <w:sz w:val="24"/>
-          <w:szCs w:val="24"/>
-        </w:rPr>
-      </w:pPr>
-    </w:p>
-    <w:p>
-      <w:pPr>
-        <w:pStyle w:val="Textoindependiente"/>
-        <w:rPr>
-          <w:rFonts w:ascii="Garamond" w:hAnsi="Garamond"/>
-          <w:sz w:val="24"/>
-          <w:szCs w:val="24"/>
-        </w:rPr>
-      </w:pPr>
       <w:bookmarkStart w:id="0" w:name="_GoBack"/>
       <w:bookmarkEnd w:id="0"/>
     </w:p>
@@ -501,12 +451,63 @@
     <w:p>
       <w:pPr>
         <w:pStyle w:val="Textoindependiente"/>
+        <w:rPr>
+          <w:rFonts w:ascii="Garamond" w:hAnsi="Garamond"/>
+          <w:sz w:val="24"/>
+          <w:szCs w:val="24"/>
+        </w:rPr>
+      </w:pPr>
+    </w:p>
+    <w:p>
+      <w:pPr>
+        <w:pStyle w:val="Textoindependiente"/>
+        <w:rPr>
+          <w:rFonts w:ascii="Garamond" w:hAnsi="Garamond"/>
+          <w:sz w:val="24"/>
+          <w:szCs w:val="24"/>
+        </w:rPr>
+      </w:pPr>
+    </w:p>
+    <w:p>
+      <w:pPr>
+        <w:pStyle w:val="Textoindependiente"/>
+        <w:rPr>
+          <w:rFonts w:ascii="Garamond" w:hAnsi="Garamond"/>
+          <w:sz w:val="24"/>
+          <w:szCs w:val="24"/>
+        </w:rPr>
+      </w:pPr>
+    </w:p>
+    <w:p>
+      <w:pPr>
+        <w:pStyle w:val="Textoindependiente"/>
+        <w:rPr>
+          <w:rFonts w:ascii="Garamond" w:hAnsi="Garamond"/>
+          <w:sz w:val="24"/>
+          <w:szCs w:val="24"/>
+        </w:rPr>
+      </w:pPr>
+    </w:p>
+    <w:p>
+      <w:pPr>
+        <w:pStyle w:val="Textoindependiente"/>
+        <w:rPr>
+          <w:rFonts w:ascii="Garamond" w:hAnsi="Garamond"/>
+          <w:sz w:val="24"/>
+          <w:szCs w:val="24"/>
+        </w:rPr>
+      </w:pPr>
+    </w:p>
+    <w:p>
+      <w:pPr>
+        <w:pStyle w:val="Textoindependiente"/>
         <w:spacing w:line="276" w:lineRule="auto"/>
         <w:jc w:val="center"/>
         <w:rPr>
           <w:rFonts w:ascii="Garamond" w:hAnsi="Garamond"/>
           <w:b/>
           <w:sz w:val="24"/>
+          <w:szCs w:val="24"/>
         </w:rPr>
       </w:pPr>
       <w:r>
@@ -514,6 +515,7 @@
           <w:rFonts w:ascii="Garamond" w:hAnsi="Garamond"/>
           <w:b/>
           <w:sz w:val="24"/>
+          <w:szCs w:val="24"/>
         </w:rPr>
         <w:t xml:space="preserve">Dr. Guillaume </w:t>
       </w:r>
@@ -523,6 +525,7 @@
           <w:rFonts w:ascii="Garamond" w:hAnsi="Garamond"/>
           <w:b/>
           <w:sz w:val="24"/>
+          <w:szCs w:val="24"/>
         </w:rPr>
         <w:t>Yannick</w:t>
       </w:r>
@@ -532,6 +535,7 @@
           <w:rFonts w:ascii="Garamond" w:hAnsi="Garamond"/>
           <w:b/>
           <w:sz w:val="24"/>
+          <w:szCs w:val="24"/>
         </w:rPr>
         <w:t xml:space="preserve"> </w:t>
       </w:r>
@@ -541,6 +545,7 @@
           <w:rFonts w:ascii="Garamond" w:hAnsi="Garamond"/>
           <w:b/>
           <w:sz w:val="24"/>
+          <w:szCs w:val="24"/>
         </w:rPr>
         <w:t>Serge</w:t>
       </w:r>
@@ -550,6 +555,7 @@
           <w:rFonts w:ascii="Garamond" w:hAnsi="Garamond"/>
           <w:b/>
           <w:sz w:val="24"/>
+          <w:szCs w:val="24"/>
         </w:rPr>
         <w:t xml:space="preserve"> </w:t>
       </w:r>
@@ -559,6 +565,7 @@
           <w:rFonts w:ascii="Garamond" w:hAnsi="Garamond"/>
           <w:b/>
           <w:sz w:val="24"/>
+          <w:szCs w:val="24"/>
         </w:rPr>
         <w:t>Oisel</w:t>
       </w:r>
@@ -572,39 +579,16 @@
         <w:rPr>
           <w:rFonts w:ascii="Garamond" w:hAnsi="Garamond"/>
           <w:sz w:val="24"/>
-        </w:rPr>
-      </w:pPr>
-      <w:r>
-        <w:rPr>
-          <w:rFonts w:ascii="Garamond" w:hAnsi="Garamond"/>
-          <w:sz w:val="24"/>
-        </w:rPr>
-        <w:t xml:space="preserve">Director de la Dirección </w:t>
-      </w:r>
-      <w:r>
-        <w:rPr>
-          <w:rFonts w:ascii="Garamond" w:hAnsi="Garamond"/>
-          <w:sz w:val="24"/>
-        </w:rPr>
-        <w:t>Ejecutiva</w:t>
-      </w:r>
-    </w:p>
-    <w:p>
-      <w:pPr>
-        <w:pStyle w:val="Textoindependiente"/>
-        <w:spacing w:line="276" w:lineRule="auto"/>
-        <w:jc w:val="center"/>
-        <w:rPr>
-          <w:rFonts w:ascii="Garamond" w:hAnsi="Garamond"/>
-          <w:sz w:val="24"/>
-        </w:rPr>
-      </w:pPr>
-      <w:r>
-        <w:rPr>
-          <w:rFonts w:ascii="Garamond" w:hAnsi="Garamond"/>
-          <w:sz w:val="24"/>
-        </w:rPr>
-        <w:t>Centro de Idiomas de la UNMSM</w:t>
+          <w:szCs w:val="24"/>
+        </w:rPr>
+      </w:pPr>
+      <w:r>
+        <w:rPr>
+          <w:rFonts w:ascii="Garamond" w:hAnsi="Garamond"/>
+          <w:sz w:val="24"/>
+          <w:szCs w:val="24"/>
+        </w:rPr>
+        <w:t>Director Ejecutivo del Centro de Idiomas de la UNMSM</w:t>
       </w:r>
     </w:p>
     <w:p>

</xml_diff>

<commit_message>
Implementar soporte para modalidades en documentos y generación de descripciones
- Actualizar modelo de cotización y oficio para eliminar referencias a modalidad de servicio.
- Modificar generador de fase final y fase inicial para leer cursos detallados desde un archivo Excel.
- Añadir clase CursoDetalle para representar cursos y servicios con modalidad.
- Implementar métodos en DescriptionService para redactar descripciones con modalidades específicas.
- Expandir filas en la generación de planillas para incluir detalles de cursos y modalidades.
- Ajustar interfaz de usuario para eliminar la opción de carga de planilla anterior.
</commit_message>
<xml_diff>
--- a/Modelos_documentos/conformidad_contrato.docx
+++ b/Modelos_documentos/conformidad_contrato.docx
@@ -1,6 +1,6 @@
 
 <file path=word/document.xml><?xml version="1.0" encoding="utf-8"?>
-<w:document xmlns:wpc="http://schemas.microsoft.com/office/word/2010/wordprocessingCanvas" xmlns:cx="http://schemas.microsoft.com/office/drawing/2014/chartex" xmlns:mc="http://schemas.openxmlformats.org/markup-compatibility/2006" xmlns:o="urn:schemas-microsoft-com:office:office" xmlns:r="http://schemas.openxmlformats.org/officeDocument/2006/relationships" xmlns:m="http://schemas.openxmlformats.org/officeDocument/2006/math" xmlns:v="urn:schemas-microsoft-com:vml" xmlns:wp14="http://schemas.microsoft.com/office/word/2010/wordprocessingDrawing" xmlns:wp="http://schemas.openxmlformats.org/drawingml/2006/wordprocessingDrawing" xmlns:w10="urn:schemas-microsoft-com:office:word" xmlns:w="http://schemas.openxmlformats.org/wordprocessingml/2006/main" xmlns:w14="http://schemas.microsoft.com/office/word/2010/wordml" xmlns:w15="http://schemas.microsoft.com/office/word/2012/wordml" xmlns:w16se="http://schemas.microsoft.com/office/word/2015/wordml/symex" xmlns:wpg="http://schemas.microsoft.com/office/word/2010/wordprocessingGroup" xmlns:wpi="http://schemas.microsoft.com/office/word/2010/wordprocessingInk" xmlns:wne="http://schemas.microsoft.com/office/word/2006/wordml" xmlns:wps="http://schemas.microsoft.com/office/word/2010/wordprocessingShape" mc:Ignorable="w14 w15 w16se wp14">
+<w:document xmlns:wpc="http://schemas.microsoft.com/office/word/2010/wordprocessingCanvas" xmlns:cx="http://schemas.microsoft.com/office/drawing/2014/chartex" xmlns:cx1="http://schemas.microsoft.com/office/drawing/2015/9/8/chartex" xmlns:cx2="http://schemas.microsoft.com/office/drawing/2015/10/21/chartex" xmlns:cx3="http://schemas.microsoft.com/office/drawing/2016/5/9/chartex" xmlns:cx4="http://schemas.microsoft.com/office/drawing/2016/5/10/chartex" xmlns:cx5="http://schemas.microsoft.com/office/drawing/2016/5/11/chartex" xmlns:cx6="http://schemas.microsoft.com/office/drawing/2016/5/12/chartex" xmlns:cx7="http://schemas.microsoft.com/office/drawing/2016/5/13/chartex" xmlns:cx8="http://schemas.microsoft.com/office/drawing/2016/5/14/chartex" xmlns:mc="http://schemas.openxmlformats.org/markup-compatibility/2006" xmlns:aink="http://schemas.microsoft.com/office/drawing/2016/ink" xmlns:am3d="http://schemas.microsoft.com/office/drawing/2017/model3d" xmlns:o="urn:schemas-microsoft-com:office:office" xmlns:oel="http://schemas.microsoft.com/office/2019/extlst" xmlns:r="http://schemas.openxmlformats.org/officeDocument/2006/relationships" xmlns:m="http://schemas.openxmlformats.org/officeDocument/2006/math" xmlns:v="urn:schemas-microsoft-com:vml" xmlns:wp14="http://schemas.microsoft.com/office/word/2010/wordprocessingDrawing" xmlns:wp="http://schemas.openxmlformats.org/drawingml/2006/wordprocessingDrawing" xmlns:w10="urn:schemas-microsoft-com:office:word" xmlns:w="http://schemas.openxmlformats.org/wordprocessingml/2006/main" xmlns:w14="http://schemas.microsoft.com/office/word/2010/wordml" xmlns:w15="http://schemas.microsoft.com/office/word/2012/wordml" xmlns:w16cex="http://schemas.microsoft.com/office/word/2018/wordml/cex" xmlns:w16cid="http://schemas.microsoft.com/office/word/2016/wordml/cid" xmlns:w16="http://schemas.microsoft.com/office/word/2018/wordml" xmlns:w16du="http://schemas.microsoft.com/office/word/2023/wordml/word16du" xmlns:w16sdtdh="http://schemas.microsoft.com/office/word/2020/wordml/sdtdatahash" xmlns:w16sdtfl="http://schemas.microsoft.com/office/word/2024/wordml/sdtformatlock" xmlns:w16se="http://schemas.microsoft.com/office/word/2015/wordml/symex" xmlns:wpg="http://schemas.microsoft.com/office/word/2010/wordprocessingGroup" xmlns:wpi="http://schemas.microsoft.com/office/word/2010/wordprocessingInk" xmlns:wne="http://schemas.microsoft.com/office/word/2006/wordml" xmlns:wps="http://schemas.microsoft.com/office/word/2010/wordprocessingShape" mc:Ignorable="w14 w15 w16se w16cid w16 w16cex w16sdtdh w16sdtfl w16du wp14">
   <w:body>
     <w:p>
       <w:pPr>
@@ -190,7 +190,7 @@
           <w:sz w:val="24"/>
           <w:szCs w:val="24"/>
         </w:rPr>
-        <w:t>6 de febrero de 2026</w:t>
+        <w:t>27 de febrero de 2026</w:t>
       </w:r>
       <w:r>
         <w:rPr>
@@ -233,16 +233,7 @@
           <w:sz w:val="24"/>
           <w:szCs w:val="24"/>
         </w:rPr>
-        <w:t xml:space="preserve">Por medio de la presente se deja constancia de que </w:t>
-      </w:r>
-      <w:proofErr w:type="spellStart"/>
-      <w:r>
-        <w:rPr>
-          <w:rFonts w:ascii="Garamond" w:hAnsi="Garamond"/>
-          <w:sz w:val="24"/>
-          <w:szCs w:val="24"/>
-        </w:rPr>
-        <w:t>nombre</w:t>
+        <w:t>Por medio de la presente se deja constancia de que nombre</w:t>
       </w:r>
       <w:r>
         <w:rPr>
@@ -252,131 +243,38 @@
         </w:rPr>
         <w:t>_docente</w:t>
       </w:r>
-      <w:proofErr w:type="spellEnd"/>
-      <w:r>
-        <w:rPr>
-          <w:rFonts w:ascii="Garamond" w:hAnsi="Garamond"/>
-          <w:sz w:val="24"/>
-          <w:szCs w:val="24"/>
-        </w:rPr>
-        <w:t xml:space="preserve">, con RUC N.º ruc, ha realizado satisfactoriamente el </w:t>
-      </w:r>
-      <w:proofErr w:type="spellStart"/>
-      <w:r>
-        <w:rPr>
-          <w:rFonts w:ascii="Garamond" w:hAnsi="Garamond"/>
-          <w:sz w:val="24"/>
-          <w:szCs w:val="24"/>
-        </w:rPr>
-        <w:t>descripcion_cursos</w:t>
-      </w:r>
-      <w:proofErr w:type="spellEnd"/>
-      <w:r>
-        <w:rPr>
-          <w:rFonts w:ascii="Garamond" w:hAnsi="Garamond"/>
-          <w:sz w:val="24"/>
-          <w:szCs w:val="24"/>
-        </w:rPr>
-        <w:t xml:space="preserve"> en el Centro de Idiomas de la FLCH, bajo la modalidad </w:t>
-      </w:r>
-      <w:proofErr w:type="spellStart"/>
-      <w:r>
-        <w:rPr>
-          <w:rFonts w:ascii="Garamond" w:hAnsi="Garamond"/>
-          <w:sz w:val="24"/>
-          <w:szCs w:val="24"/>
-        </w:rPr>
-        <w:t>modalidad_servicio</w:t>
-      </w:r>
-      <w:proofErr w:type="spellEnd"/>
-      <w:r>
-        <w:rPr>
-          <w:rFonts w:ascii="Garamond" w:hAnsi="Garamond"/>
-          <w:sz w:val="24"/>
-          <w:szCs w:val="24"/>
-        </w:rPr>
-        <w:t xml:space="preserve">, según orden de servicio N.º ________, y en cumplimiento de la </w:t>
-      </w:r>
-      <w:proofErr w:type="spellStart"/>
-      <w:r>
-        <w:rPr>
-          <w:rFonts w:ascii="Garamond" w:hAnsi="Garamond"/>
-          <w:sz w:val="24"/>
-          <w:szCs w:val="24"/>
-        </w:rPr>
-        <w:t>numero_armada</w:t>
-      </w:r>
-      <w:proofErr w:type="spellEnd"/>
-      <w:r>
-        <w:rPr>
-          <w:rFonts w:ascii="Garamond" w:hAnsi="Garamond"/>
-          <w:sz w:val="24"/>
-          <w:szCs w:val="24"/>
-        </w:rPr>
-        <w:t xml:space="preserve"> armada del contrato de locación de servicios N.º </w:t>
-      </w:r>
-      <w:proofErr w:type="spellStart"/>
-      <w:r>
-        <w:rPr>
-          <w:rFonts w:ascii="Garamond" w:hAnsi="Garamond"/>
-          <w:sz w:val="24"/>
-          <w:szCs w:val="24"/>
-        </w:rPr>
-        <w:t>Nro</w:t>
-      </w:r>
-      <w:r>
-        <w:rPr>
-          <w:rFonts w:ascii="Garamond" w:hAnsi="Garamond"/>
-          <w:sz w:val="24"/>
-          <w:szCs w:val="24"/>
-        </w:rPr>
-        <w:t>_Contrato</w:t>
-      </w:r>
-      <w:proofErr w:type="spellEnd"/>
-      <w:r>
-        <w:rPr>
-          <w:rFonts w:ascii="Garamond" w:hAnsi="Garamond"/>
-          <w:sz w:val="24"/>
-          <w:szCs w:val="24"/>
-        </w:rPr>
-        <w:t>/UNMSM</w:t>
-      </w:r>
-      <w:r>
-        <w:rPr>
-          <w:rFonts w:ascii="Garamond" w:hAnsi="Garamond"/>
-          <w:sz w:val="24"/>
-          <w:szCs w:val="24"/>
-        </w:rPr>
-        <w:t xml:space="preserve">-FLCH/2025 por el importe de </w:t>
-      </w:r>
-      <w:proofErr w:type="spellStart"/>
-      <w:r>
-        <w:rPr>
-          <w:rFonts w:ascii="Garamond" w:hAnsi="Garamond"/>
-          <w:sz w:val="24"/>
-          <w:szCs w:val="24"/>
-        </w:rPr>
-        <w:t>monto_subtotal</w:t>
-      </w:r>
-      <w:proofErr w:type="spellEnd"/>
-      <w:r>
-        <w:rPr>
-          <w:rFonts w:ascii="Garamond" w:hAnsi="Garamond"/>
-          <w:sz w:val="24"/>
-          <w:szCs w:val="24"/>
-        </w:rPr>
-        <w:t xml:space="preserve">, monto por hora: </w:t>
-      </w:r>
-      <w:proofErr w:type="spellStart"/>
-      <w:r>
-        <w:rPr>
-          <w:rFonts w:ascii="Garamond" w:hAnsi="Garamond"/>
-          <w:sz w:val="24"/>
-          <w:szCs w:val="24"/>
-        </w:rPr>
-        <w:t>monto_hora</w:t>
-      </w:r>
-      <w:proofErr w:type="spellEnd"/>
+      <w:r>
+        <w:rPr>
+          <w:rFonts w:ascii="Garamond" w:hAnsi="Garamond"/>
+          <w:sz w:val="24"/>
+          <w:szCs w:val="24"/>
+        </w:rPr>
+        <w:t>, con RUC N.º ruc, ha realizado satisfactoriamente el descripcion_cursos en el Centro de Idiomas de la FLCH, según orden de servicio N.º ________, y en cumplimiento de la numero_armada armada del contrato de locación de servicios N.º Nro</w:t>
+      </w:r>
+      <w:r>
+        <w:rPr>
+          <w:rFonts w:ascii="Garamond" w:hAnsi="Garamond"/>
+          <w:sz w:val="24"/>
+          <w:szCs w:val="24"/>
+        </w:rPr>
+        <w:t>_Contrato/UNMSM</w:t>
+      </w:r>
+      <w:r>
+        <w:rPr>
+          <w:rFonts w:ascii="Garamond" w:hAnsi="Garamond"/>
+          <w:sz w:val="24"/>
+          <w:szCs w:val="24"/>
+        </w:rPr>
+        <w:t>-FLCH/2025 por el importe de monto_subtotal</w:t>
+      </w:r>
+      <w:r>
+        <w:rPr>
+          <w:rFonts w:ascii="Garamond" w:hAnsi="Garamond"/>
+          <w:sz w:val="24"/>
+          <w:szCs w:val="24"/>
+        </w:rPr>
+        <w:t>, monto por hora: monto_hora</w:t>
+      </w:r>
       <w:r>
         <w:rPr>
           <w:rFonts w:ascii="Garamond" w:hAnsi="Garamond"/>
@@ -435,8 +333,6 @@
         </w:rPr>
         <w:t>Atentamente,</w:t>
       </w:r>
-      <w:bookmarkStart w:id="0" w:name="_GoBack"/>
-      <w:bookmarkEnd w:id="0"/>
     </w:p>
     <w:p>
       <w:pPr>
@@ -517,59 +413,8 @@
           <w:sz w:val="24"/>
           <w:szCs w:val="24"/>
         </w:rPr>
-        <w:t xml:space="preserve">Dr. Guillaume </w:t>
-      </w:r>
-      <w:proofErr w:type="spellStart"/>
-      <w:r>
-        <w:rPr>
-          <w:rFonts w:ascii="Garamond" w:hAnsi="Garamond"/>
-          <w:b/>
-          <w:sz w:val="24"/>
-          <w:szCs w:val="24"/>
-        </w:rPr>
-        <w:t>Yannick</w:t>
-      </w:r>
-      <w:proofErr w:type="spellEnd"/>
-      <w:r>
-        <w:rPr>
-          <w:rFonts w:ascii="Garamond" w:hAnsi="Garamond"/>
-          <w:b/>
-          <w:sz w:val="24"/>
-          <w:szCs w:val="24"/>
-        </w:rPr>
-        <w:t xml:space="preserve"> </w:t>
-      </w:r>
-      <w:proofErr w:type="spellStart"/>
-      <w:r>
-        <w:rPr>
-          <w:rFonts w:ascii="Garamond" w:hAnsi="Garamond"/>
-          <w:b/>
-          <w:sz w:val="24"/>
-          <w:szCs w:val="24"/>
-        </w:rPr>
-        <w:t>Serge</w:t>
-      </w:r>
-      <w:proofErr w:type="spellEnd"/>
-      <w:r>
-        <w:rPr>
-          <w:rFonts w:ascii="Garamond" w:hAnsi="Garamond"/>
-          <w:b/>
-          <w:sz w:val="24"/>
-          <w:szCs w:val="24"/>
-        </w:rPr>
-        <w:t xml:space="preserve"> </w:t>
-      </w:r>
-      <w:proofErr w:type="spellStart"/>
-      <w:r>
-        <w:rPr>
-          <w:rFonts w:ascii="Garamond" w:hAnsi="Garamond"/>
-          <w:b/>
-          <w:sz w:val="24"/>
-          <w:szCs w:val="24"/>
-        </w:rPr>
-        <w:t>Oisel</w:t>
-      </w:r>
-      <w:proofErr w:type="spellEnd"/>
+        <w:t>Dr. Guillaume Yannick Serge Oisel</w:t>
+      </w:r>
     </w:p>
     <w:p>
       <w:pPr>
@@ -648,7 +493,7 @@
 </file>
 
 <file path=word/endnotes.xml><?xml version="1.0" encoding="utf-8"?>
-<w:endnotes xmlns:wpc="http://schemas.microsoft.com/office/word/2010/wordprocessingCanvas" xmlns:cx="http://schemas.microsoft.com/office/drawing/2014/chartex" xmlns:mc="http://schemas.openxmlformats.org/markup-compatibility/2006" xmlns:o="urn:schemas-microsoft-com:office:office" xmlns:r="http://schemas.openxmlformats.org/officeDocument/2006/relationships" xmlns:m="http://schemas.openxmlformats.org/officeDocument/2006/math" xmlns:v="urn:schemas-microsoft-com:vml" xmlns:wp14="http://schemas.microsoft.com/office/word/2010/wordprocessingDrawing" xmlns:wp="http://schemas.openxmlformats.org/drawingml/2006/wordprocessingDrawing" xmlns:w10="urn:schemas-microsoft-com:office:word" xmlns:w="http://schemas.openxmlformats.org/wordprocessingml/2006/main" xmlns:w14="http://schemas.microsoft.com/office/word/2010/wordml" xmlns:w15="http://schemas.microsoft.com/office/word/2012/wordml" xmlns:w16se="http://schemas.microsoft.com/office/word/2015/wordml/symex" xmlns:wpg="http://schemas.microsoft.com/office/word/2010/wordprocessingGroup" xmlns:wpi="http://schemas.microsoft.com/office/word/2010/wordprocessingInk" xmlns:wne="http://schemas.microsoft.com/office/word/2006/wordml" xmlns:wps="http://schemas.microsoft.com/office/word/2010/wordprocessingShape" mc:Ignorable="w14 w15 w16se wp14">
+<w:endnotes xmlns:wpc="http://schemas.microsoft.com/office/word/2010/wordprocessingCanvas" xmlns:cx="http://schemas.microsoft.com/office/drawing/2014/chartex" xmlns:cx1="http://schemas.microsoft.com/office/drawing/2015/9/8/chartex" xmlns:cx2="http://schemas.microsoft.com/office/drawing/2015/10/21/chartex" xmlns:cx3="http://schemas.microsoft.com/office/drawing/2016/5/9/chartex" xmlns:cx4="http://schemas.microsoft.com/office/drawing/2016/5/10/chartex" xmlns:cx5="http://schemas.microsoft.com/office/drawing/2016/5/11/chartex" xmlns:cx6="http://schemas.microsoft.com/office/drawing/2016/5/12/chartex" xmlns:cx7="http://schemas.microsoft.com/office/drawing/2016/5/13/chartex" xmlns:cx8="http://schemas.microsoft.com/office/drawing/2016/5/14/chartex" xmlns:mc="http://schemas.openxmlformats.org/markup-compatibility/2006" xmlns:aink="http://schemas.microsoft.com/office/drawing/2016/ink" xmlns:am3d="http://schemas.microsoft.com/office/drawing/2017/model3d" xmlns:o="urn:schemas-microsoft-com:office:office" xmlns:oel="http://schemas.microsoft.com/office/2019/extlst" xmlns:r="http://schemas.openxmlformats.org/officeDocument/2006/relationships" xmlns:m="http://schemas.openxmlformats.org/officeDocument/2006/math" xmlns:v="urn:schemas-microsoft-com:vml" xmlns:wp14="http://schemas.microsoft.com/office/word/2010/wordprocessingDrawing" xmlns:wp="http://schemas.openxmlformats.org/drawingml/2006/wordprocessingDrawing" xmlns:w10="urn:schemas-microsoft-com:office:word" xmlns:w="http://schemas.openxmlformats.org/wordprocessingml/2006/main" xmlns:w14="http://schemas.microsoft.com/office/word/2010/wordml" xmlns:w15="http://schemas.microsoft.com/office/word/2012/wordml" xmlns:w16cex="http://schemas.microsoft.com/office/word/2018/wordml/cex" xmlns:w16cid="http://schemas.microsoft.com/office/word/2016/wordml/cid" xmlns:w16="http://schemas.microsoft.com/office/word/2018/wordml" xmlns:w16du="http://schemas.microsoft.com/office/word/2023/wordml/word16du" xmlns:w16sdtdh="http://schemas.microsoft.com/office/word/2020/wordml/sdtdatahash" xmlns:w16sdtfl="http://schemas.microsoft.com/office/word/2024/wordml/sdtformatlock" xmlns:w16se="http://schemas.microsoft.com/office/word/2015/wordml/symex" xmlns:wpg="http://schemas.microsoft.com/office/word/2010/wordprocessingGroup" xmlns:wpi="http://schemas.microsoft.com/office/word/2010/wordprocessingInk" xmlns:wne="http://schemas.microsoft.com/office/word/2006/wordml" xmlns:wps="http://schemas.microsoft.com/office/word/2010/wordprocessingShape" mc:Ignorable="w14 w15 w16se w16cid w16 w16cex w16sdtdh w16sdtfl w16du wp14">
   <w:endnote w:type="separator" w:id="-1">
     <w:p>
       <w:r>
@@ -667,7 +512,7 @@
 </file>
 
 <file path=word/footnotes.xml><?xml version="1.0" encoding="utf-8"?>
-<w:footnotes xmlns:wpc="http://schemas.microsoft.com/office/word/2010/wordprocessingCanvas" xmlns:cx="http://schemas.microsoft.com/office/drawing/2014/chartex" xmlns:mc="http://schemas.openxmlformats.org/markup-compatibility/2006" xmlns:o="urn:schemas-microsoft-com:office:office" xmlns:r="http://schemas.openxmlformats.org/officeDocument/2006/relationships" xmlns:m="http://schemas.openxmlformats.org/officeDocument/2006/math" xmlns:v="urn:schemas-microsoft-com:vml" xmlns:wp14="http://schemas.microsoft.com/office/word/2010/wordprocessingDrawing" xmlns:wp="http://schemas.openxmlformats.org/drawingml/2006/wordprocessingDrawing" xmlns:w10="urn:schemas-microsoft-com:office:word" xmlns:w="http://schemas.openxmlformats.org/wordprocessingml/2006/main" xmlns:w14="http://schemas.microsoft.com/office/word/2010/wordml" xmlns:w15="http://schemas.microsoft.com/office/word/2012/wordml" xmlns:w16se="http://schemas.microsoft.com/office/word/2015/wordml/symex" xmlns:wpg="http://schemas.microsoft.com/office/word/2010/wordprocessingGroup" xmlns:wpi="http://schemas.microsoft.com/office/word/2010/wordprocessingInk" xmlns:wne="http://schemas.microsoft.com/office/word/2006/wordml" xmlns:wps="http://schemas.microsoft.com/office/word/2010/wordprocessingShape" mc:Ignorable="w14 w15 w16se wp14">
+<w:footnotes xmlns:wpc="http://schemas.microsoft.com/office/word/2010/wordprocessingCanvas" xmlns:cx="http://schemas.microsoft.com/office/drawing/2014/chartex" xmlns:cx1="http://schemas.microsoft.com/office/drawing/2015/9/8/chartex" xmlns:cx2="http://schemas.microsoft.com/office/drawing/2015/10/21/chartex" xmlns:cx3="http://schemas.microsoft.com/office/drawing/2016/5/9/chartex" xmlns:cx4="http://schemas.microsoft.com/office/drawing/2016/5/10/chartex" xmlns:cx5="http://schemas.microsoft.com/office/drawing/2016/5/11/chartex" xmlns:cx6="http://schemas.microsoft.com/office/drawing/2016/5/12/chartex" xmlns:cx7="http://schemas.microsoft.com/office/drawing/2016/5/13/chartex" xmlns:cx8="http://schemas.microsoft.com/office/drawing/2016/5/14/chartex" xmlns:mc="http://schemas.openxmlformats.org/markup-compatibility/2006" xmlns:aink="http://schemas.microsoft.com/office/drawing/2016/ink" xmlns:am3d="http://schemas.microsoft.com/office/drawing/2017/model3d" xmlns:o="urn:schemas-microsoft-com:office:office" xmlns:oel="http://schemas.microsoft.com/office/2019/extlst" xmlns:r="http://schemas.openxmlformats.org/officeDocument/2006/relationships" xmlns:m="http://schemas.openxmlformats.org/officeDocument/2006/math" xmlns:v="urn:schemas-microsoft-com:vml" xmlns:wp14="http://schemas.microsoft.com/office/word/2010/wordprocessingDrawing" xmlns:wp="http://schemas.openxmlformats.org/drawingml/2006/wordprocessingDrawing" xmlns:w10="urn:schemas-microsoft-com:office:word" xmlns:w="http://schemas.openxmlformats.org/wordprocessingml/2006/main" xmlns:w14="http://schemas.microsoft.com/office/word/2010/wordml" xmlns:w15="http://schemas.microsoft.com/office/word/2012/wordml" xmlns:w16cex="http://schemas.microsoft.com/office/word/2018/wordml/cex" xmlns:w16cid="http://schemas.microsoft.com/office/word/2016/wordml/cid" xmlns:w16="http://schemas.microsoft.com/office/word/2018/wordml" xmlns:w16du="http://schemas.microsoft.com/office/word/2023/wordml/word16du" xmlns:w16sdtdh="http://schemas.microsoft.com/office/word/2020/wordml/sdtdatahash" xmlns:w16sdtfl="http://schemas.microsoft.com/office/word/2024/wordml/sdtformatlock" xmlns:w16se="http://schemas.microsoft.com/office/word/2015/wordml/symex" xmlns:wpg="http://schemas.microsoft.com/office/word/2010/wordprocessingGroup" xmlns:wpi="http://schemas.microsoft.com/office/word/2010/wordprocessingInk" xmlns:wne="http://schemas.microsoft.com/office/word/2006/wordml" xmlns:wps="http://schemas.microsoft.com/office/word/2010/wordprocessingShape" mc:Ignorable="w14 w15 w16se w16cid w16 w16cex w16sdtdh w16sdtfl w16du wp14">
   <w:footnote w:type="separator" w:id="-1">
     <w:p>
       <w:r>
@@ -686,7 +531,7 @@
 </file>
 
 <file path=word/header1.xml><?xml version="1.0" encoding="utf-8"?>
-<w:hdr xmlns:wpc="http://schemas.microsoft.com/office/word/2010/wordprocessingCanvas" xmlns:cx="http://schemas.microsoft.com/office/drawing/2014/chartex" xmlns:mc="http://schemas.openxmlformats.org/markup-compatibility/2006" xmlns:o="urn:schemas-microsoft-com:office:office" xmlns:r="http://schemas.openxmlformats.org/officeDocument/2006/relationships" xmlns:m="http://schemas.openxmlformats.org/officeDocument/2006/math" xmlns:v="urn:schemas-microsoft-com:vml" xmlns:wp14="http://schemas.microsoft.com/office/word/2010/wordprocessingDrawing" xmlns:wp="http://schemas.openxmlformats.org/drawingml/2006/wordprocessingDrawing" xmlns:w10="urn:schemas-microsoft-com:office:word" xmlns:w="http://schemas.openxmlformats.org/wordprocessingml/2006/main" xmlns:w14="http://schemas.microsoft.com/office/word/2010/wordml" xmlns:w15="http://schemas.microsoft.com/office/word/2012/wordml" xmlns:w16se="http://schemas.microsoft.com/office/word/2015/wordml/symex" xmlns:wpg="http://schemas.microsoft.com/office/word/2010/wordprocessingGroup" xmlns:wpi="http://schemas.microsoft.com/office/word/2010/wordprocessingInk" xmlns:wne="http://schemas.microsoft.com/office/word/2006/wordml" xmlns:wps="http://schemas.microsoft.com/office/word/2010/wordprocessingShape" mc:Ignorable="w14 w15 w16se wp14">
+<w:hdr xmlns:wpc="http://schemas.microsoft.com/office/word/2010/wordprocessingCanvas" xmlns:cx="http://schemas.microsoft.com/office/drawing/2014/chartex" xmlns:cx1="http://schemas.microsoft.com/office/drawing/2015/9/8/chartex" xmlns:cx2="http://schemas.microsoft.com/office/drawing/2015/10/21/chartex" xmlns:cx3="http://schemas.microsoft.com/office/drawing/2016/5/9/chartex" xmlns:cx4="http://schemas.microsoft.com/office/drawing/2016/5/10/chartex" xmlns:cx5="http://schemas.microsoft.com/office/drawing/2016/5/11/chartex" xmlns:cx6="http://schemas.microsoft.com/office/drawing/2016/5/12/chartex" xmlns:cx7="http://schemas.microsoft.com/office/drawing/2016/5/13/chartex" xmlns:cx8="http://schemas.microsoft.com/office/drawing/2016/5/14/chartex" xmlns:mc="http://schemas.openxmlformats.org/markup-compatibility/2006" xmlns:aink="http://schemas.microsoft.com/office/drawing/2016/ink" xmlns:am3d="http://schemas.microsoft.com/office/drawing/2017/model3d" xmlns:o="urn:schemas-microsoft-com:office:office" xmlns:oel="http://schemas.microsoft.com/office/2019/extlst" xmlns:r="http://schemas.openxmlformats.org/officeDocument/2006/relationships" xmlns:m="http://schemas.openxmlformats.org/officeDocument/2006/math" xmlns:v="urn:schemas-microsoft-com:vml" xmlns:wp14="http://schemas.microsoft.com/office/word/2010/wordprocessingDrawing" xmlns:wp="http://schemas.openxmlformats.org/drawingml/2006/wordprocessingDrawing" xmlns:w10="urn:schemas-microsoft-com:office:word" xmlns:w="http://schemas.openxmlformats.org/wordprocessingml/2006/main" xmlns:w14="http://schemas.microsoft.com/office/word/2010/wordml" xmlns:w15="http://schemas.microsoft.com/office/word/2012/wordml" xmlns:w16cex="http://schemas.microsoft.com/office/word/2018/wordml/cex" xmlns:w16cid="http://schemas.microsoft.com/office/word/2016/wordml/cid" xmlns:w16="http://schemas.microsoft.com/office/word/2018/wordml" xmlns:w16du="http://schemas.microsoft.com/office/word/2023/wordml/word16du" xmlns:w16sdtdh="http://schemas.microsoft.com/office/word/2020/wordml/sdtdatahash" xmlns:w16sdtfl="http://schemas.microsoft.com/office/word/2024/wordml/sdtformatlock" xmlns:w16se="http://schemas.microsoft.com/office/word/2015/wordml/symex" xmlns:wpg="http://schemas.microsoft.com/office/word/2010/wordprocessingGroup" xmlns:wpi="http://schemas.microsoft.com/office/word/2010/wordprocessingInk" xmlns:wne="http://schemas.microsoft.com/office/word/2006/wordml" xmlns:wps="http://schemas.microsoft.com/office/word/2010/wordprocessingShape" mc:Ignorable="w14 w15 w16se w16cid w16 w16cex w16sdtdh w16sdtfl w16du wp14">
   <w:p>
     <w:pPr>
       <w:pStyle w:val="Encabezado"/>
@@ -763,7 +608,7 @@
 </file>
 
 <file path=word/styles.xml><?xml version="1.0" encoding="utf-8"?>
-<w:styles xmlns:mc="http://schemas.openxmlformats.org/markup-compatibility/2006" xmlns:r="http://schemas.openxmlformats.org/officeDocument/2006/relationships" xmlns:w="http://schemas.openxmlformats.org/wordprocessingml/2006/main" xmlns:w14="http://schemas.microsoft.com/office/word/2010/wordml" xmlns:w15="http://schemas.microsoft.com/office/word/2012/wordml" xmlns:w16se="http://schemas.microsoft.com/office/word/2015/wordml/symex" mc:Ignorable="w14 w15 w16se">
+<w:styles xmlns:mc="http://schemas.openxmlformats.org/markup-compatibility/2006" xmlns:r="http://schemas.openxmlformats.org/officeDocument/2006/relationships" xmlns:w="http://schemas.openxmlformats.org/wordprocessingml/2006/main" xmlns:w14="http://schemas.microsoft.com/office/word/2010/wordml" xmlns:w15="http://schemas.microsoft.com/office/word/2012/wordml" xmlns:w16cex="http://schemas.microsoft.com/office/word/2018/wordml/cex" xmlns:w16cid="http://schemas.microsoft.com/office/word/2016/wordml/cid" xmlns:w16="http://schemas.microsoft.com/office/word/2018/wordml" xmlns:w16du="http://schemas.microsoft.com/office/word/2023/wordml/word16du" xmlns:w16sdtdh="http://schemas.microsoft.com/office/word/2020/wordml/sdtdatahash" xmlns:w16sdtfl="http://schemas.microsoft.com/office/word/2024/wordml/sdtformatlock" xmlns:w16se="http://schemas.microsoft.com/office/word/2015/wordml/symex" mc:Ignorable="w14 w15 w16se w16cid w16 w16cex w16sdtdh w16sdtfl w16du">
   <w:docDefaults>
     <w:rPrDefault>
       <w:rPr>
@@ -781,7 +626,7 @@
       </w:pPr>
     </w:pPrDefault>
   </w:docDefaults>
-  <w:latentStyles w:defLockedState="0" w:defUIPriority="99" w:defSemiHidden="0" w:defUnhideWhenUsed="0" w:defQFormat="0" w:count="371">
+  <w:latentStyles w:defLockedState="0" w:defUIPriority="99" w:defSemiHidden="0" w:defUnhideWhenUsed="0" w:defQFormat="0" w:count="376">
     <w:lsdException w:name="Normal" w:uiPriority="0" w:qFormat="1"/>
     <w:lsdException w:name="heading 1" w:uiPriority="9" w:qFormat="1"/>
     <w:lsdException w:name="heading 2" w:semiHidden="1" w:uiPriority="9" w:unhideWhenUsed="1" w:qFormat="1"/>
@@ -1153,6 +998,11 @@
     <w:lsdException w:name="List Table 5 Dark Accent 6" w:uiPriority="50"/>
     <w:lsdException w:name="List Table 6 Colorful Accent 6" w:uiPriority="51"/>
     <w:lsdException w:name="List Table 7 Colorful Accent 6" w:uiPriority="52"/>
+    <w:lsdException w:name="Mention" w:semiHidden="1" w:unhideWhenUsed="1"/>
+    <w:lsdException w:name="Smart Hyperlink" w:semiHidden="1" w:unhideWhenUsed="1"/>
+    <w:lsdException w:name="Hashtag" w:semiHidden="1" w:unhideWhenUsed="1"/>
+    <w:lsdException w:name="Unresolved Mention" w:semiHidden="1" w:unhideWhenUsed="1"/>
+    <w:lsdException w:name="Smart Link" w:semiHidden="1" w:unhideWhenUsed="1"/>
   </w:latentStyles>
   <w:style w:type="paragraph" w:default="1" w:styleId="Normal">
     <w:name w:val="Normal"/>

</xml_diff>

<commit_message>
fix: standardize contract number key naming in document templates and builders
</commit_message>
<xml_diff>
--- a/Modelos_documentos/conformidad_contrato.docx
+++ b/Modelos_documentos/conformidad_contrato.docx
@@ -190,7 +190,7 @@
           <w:sz w:val="24"/>
           <w:szCs w:val="24"/>
         </w:rPr>
-        <w:t>27 de febrero de 2026</w:t>
+        <w:t>17 de marzo de 2026</w:t>
       </w:r>
       <w:r>
         <w:rPr>
@@ -233,7 +233,16 @@
           <w:sz w:val="24"/>
           <w:szCs w:val="24"/>
         </w:rPr>
-        <w:t>Por medio de la presente se deja constancia de que nombre</w:t>
+        <w:t xml:space="preserve">Por medio de la presente se deja constancia de que </w:t>
+      </w:r>
+      <w:proofErr w:type="spellStart"/>
+      <w:r>
+        <w:rPr>
+          <w:rFonts w:ascii="Garamond" w:hAnsi="Garamond"/>
+          <w:sz w:val="24"/>
+          <w:szCs w:val="24"/>
+        </w:rPr>
+        <w:t>nombre</w:t>
       </w:r>
       <w:r>
         <w:rPr>
@@ -243,37 +252,128 @@
         </w:rPr>
         <w:t>_docente</w:t>
       </w:r>
-      <w:r>
-        <w:rPr>
-          <w:rFonts w:ascii="Garamond" w:hAnsi="Garamond"/>
-          <w:sz w:val="24"/>
-          <w:szCs w:val="24"/>
-        </w:rPr>
-        <w:t>, con RUC N.º ruc, ha realizado satisfactoriamente el descripcion_cursos en el Centro de Idiomas de la FLCH, según orden de servicio N.º ________, y en cumplimiento de la numero_armada armada del contrato de locación de servicios N.º Nro</w:t>
-      </w:r>
-      <w:r>
-        <w:rPr>
-          <w:rFonts w:ascii="Garamond" w:hAnsi="Garamond"/>
-          <w:sz w:val="24"/>
-          <w:szCs w:val="24"/>
-        </w:rPr>
-        <w:t>_Contrato/UNMSM</w:t>
-      </w:r>
-      <w:r>
-        <w:rPr>
-          <w:rFonts w:ascii="Garamond" w:hAnsi="Garamond"/>
-          <w:sz w:val="24"/>
-          <w:szCs w:val="24"/>
-        </w:rPr>
-        <w:t>-FLCH/2025 por el importe de monto_subtotal</w:t>
-      </w:r>
-      <w:r>
-        <w:rPr>
-          <w:rFonts w:ascii="Garamond" w:hAnsi="Garamond"/>
-          <w:sz w:val="24"/>
-          <w:szCs w:val="24"/>
-        </w:rPr>
-        <w:t>, monto por hora: monto_hora</w:t>
+      <w:proofErr w:type="spellEnd"/>
+      <w:r>
+        <w:rPr>
+          <w:rFonts w:ascii="Garamond" w:hAnsi="Garamond"/>
+          <w:sz w:val="24"/>
+          <w:szCs w:val="24"/>
+        </w:rPr>
+        <w:t xml:space="preserve">, con RUC N.º ruc, ha realizado satisfactoriamente el </w:t>
+      </w:r>
+      <w:proofErr w:type="spellStart"/>
+      <w:r>
+        <w:rPr>
+          <w:rFonts w:ascii="Garamond" w:hAnsi="Garamond"/>
+          <w:sz w:val="24"/>
+          <w:szCs w:val="24"/>
+        </w:rPr>
+        <w:t>descripcion_cursos</w:t>
+      </w:r>
+      <w:proofErr w:type="spellEnd"/>
+      <w:r>
+        <w:rPr>
+          <w:rFonts w:ascii="Garamond" w:hAnsi="Garamond"/>
+          <w:sz w:val="24"/>
+          <w:szCs w:val="24"/>
+        </w:rPr>
+        <w:t xml:space="preserve"> en el Centro de Idiomas de la FLCH, según orden de servicio N.º ________, y en cumplimiento de la </w:t>
+      </w:r>
+      <w:proofErr w:type="spellStart"/>
+      <w:r>
+        <w:rPr>
+          <w:rFonts w:ascii="Garamond" w:hAnsi="Garamond"/>
+          <w:sz w:val="24"/>
+          <w:szCs w:val="24"/>
+        </w:rPr>
+        <w:t>numero_armada</w:t>
+      </w:r>
+      <w:proofErr w:type="spellEnd"/>
+      <w:r>
+        <w:rPr>
+          <w:rFonts w:ascii="Garamond" w:hAnsi="Garamond"/>
+          <w:sz w:val="24"/>
+          <w:szCs w:val="24"/>
+        </w:rPr>
+        <w:t xml:space="preserve"> armada del contrato de locación de servicios N.º </w:t>
+      </w:r>
+      <w:proofErr w:type="spellStart"/>
+      <w:r>
+        <w:rPr>
+          <w:rFonts w:ascii="Garamond" w:hAnsi="Garamond"/>
+          <w:sz w:val="24"/>
+          <w:szCs w:val="24"/>
+        </w:rPr>
+        <w:t>numero_contrato</w:t>
+      </w:r>
+      <w:proofErr w:type="spellEnd"/>
+      <w:r>
+        <w:rPr>
+          <w:rFonts w:ascii="Garamond" w:hAnsi="Garamond"/>
+          <w:sz w:val="24"/>
+          <w:szCs w:val="24"/>
+        </w:rPr>
+        <w:t>/UNMSM</w:t>
+      </w:r>
+      <w:r>
+        <w:rPr>
+          <w:rFonts w:ascii="Garamond" w:hAnsi="Garamond"/>
+          <w:sz w:val="24"/>
+          <w:szCs w:val="24"/>
+        </w:rPr>
+        <w:t>-FLCH/202</w:t>
+      </w:r>
+      <w:r>
+        <w:rPr>
+          <w:rFonts w:ascii="Garamond" w:hAnsi="Garamond"/>
+          <w:sz w:val="24"/>
+          <w:szCs w:val="24"/>
+        </w:rPr>
+        <w:t>6</w:t>
+      </w:r>
+      <w:r>
+        <w:rPr>
+          <w:rFonts w:ascii="Garamond" w:hAnsi="Garamond"/>
+          <w:sz w:val="24"/>
+          <w:szCs w:val="24"/>
+        </w:rPr>
+        <w:t xml:space="preserve"> por el importe de </w:t>
+      </w:r>
+      <w:proofErr w:type="spellStart"/>
+      <w:r>
+        <w:rPr>
+          <w:rFonts w:ascii="Garamond" w:hAnsi="Garamond"/>
+          <w:sz w:val="24"/>
+          <w:szCs w:val="24"/>
+        </w:rPr>
+        <w:t>monto_subtotal</w:t>
+      </w:r>
+      <w:proofErr w:type="spellEnd"/>
+      <w:r>
+        <w:rPr>
+          <w:rFonts w:ascii="Garamond" w:hAnsi="Garamond"/>
+          <w:sz w:val="24"/>
+          <w:szCs w:val="24"/>
+        </w:rPr>
+        <w:t xml:space="preserve">, monto por hora: </w:t>
+      </w:r>
+      <w:proofErr w:type="spellStart"/>
+      <w:r>
+        <w:rPr>
+          <w:rFonts w:ascii="Garamond" w:hAnsi="Garamond"/>
+          <w:sz w:val="24"/>
+          <w:szCs w:val="24"/>
+        </w:rPr>
+        <w:t>monto_hora</w:t>
+      </w:r>
+      <w:proofErr w:type="spellEnd"/>
+      <w:r>
+        <w:rPr>
+          <w:rFonts w:ascii="Garamond" w:hAnsi="Garamond"/>
+          <w:sz w:val="24"/>
+          <w:szCs w:val="24"/>
+        </w:rPr>
+        <w:t>, bajo la modalidad híbrida</w:t>
       </w:r>
       <w:r>
         <w:rPr>

</xml_diff>